<commit_message>
changed 399$ to 3.99$ in the cloudfuze row
</commit_message>
<xml_diff>
--- a/backend-templates/MultiCombinations.docx
+++ b/backend-templates/MultiCombinations.docx
@@ -1626,7 +1626,21 @@
                 <w:sz w:val="19"/>
                 <w:highlight w:val="lightGray"/>
               </w:rPr>
-              <w:t>ser $399</w:t>
+              <w:t xml:space="preserve">ser </w:t>
+            </w:r>
+            <w:r>
+              <w:rPr>
+                <w:sz w:val="19"/>
+                <w:highlight w:val="lightGray"/>
+              </w:rPr>
+              <w:t>$</w:t>
+            </w:r>
+            <w:r>
+              <w:rPr>
+                <w:sz w:val="19"/>
+                <w:highlight w:val="lightGray"/>
+              </w:rPr>
+              <w:t>3.99 </w:t>
             </w:r>
           </w:p>
         </w:tc>
@@ -3211,15 +3225,7 @@
         <w:ind w:left="-5"/>
       </w:pPr>
       <w:r>
-        <w:t xml:space="preserve">Subject to earlier termination as provided below, this Agreement is for the Initial Service Term as specified in the Order Form, and shall be automatically renewed for additional periods of the same duration as the Initial Service Term (collectively, the “Term”), unless </w:t>
-      </w:r>
-      <w:proofErr w:type="gramStart"/>
-      <w:r>
-        <w:t>either party</w:t>
-      </w:r>
-      <w:proofErr w:type="gramEnd"/>
-      <w:r>
-        <w:t xml:space="preserve"> requests termination at least thirty (30) days prior to the end of the then-current term.</w:t>
+        <w:t>Subject to earlier termination as provided below, this Agreement is for the Initial Service Term as specified in the Order Form, and shall be automatically renewed for additional periods of the same duration as the Initial Service Term (collectively, the “Term”), unless either party requests termination at least thirty (30) days prior to the end of the then-current term.</w:t>
       </w:r>
     </w:p>
     <w:p>

</xml_diff>

<commit_message>
removed the bundled pricing
</commit_message>
<xml_diff>
--- a/backend-templates/MultiCombinations.docx
+++ b/backend-templates/MultiCombinations.docx
@@ -223,7 +223,7 @@
     <w:tbl>
       <w:tblPr>
         <w:tblStyle w:val="TableGrid"/>
-        <w:tblW w:w="10732" w:type="dxa"/>
+        <w:tblW w:w="10774" w:type="dxa"/>
         <w:jc w:val="center"/>
         <w:tblInd w:w="0" w:type="dxa"/>
         <w:tblCellMar>
@@ -234,10 +234,9 @@
         <w:tblLook w:val="04A0" w:firstRow="1" w:lastRow="0" w:firstColumn="1" w:lastColumn="0" w:noHBand="0" w:noVBand="1"/>
       </w:tblPr>
       <w:tblGrid>
-        <w:gridCol w:w="2260"/>
-        <w:gridCol w:w="3686"/>
-        <w:gridCol w:w="2557"/>
-        <w:gridCol w:w="2229"/>
+        <w:gridCol w:w="3261"/>
+        <w:gridCol w:w="4102"/>
+        <w:gridCol w:w="3411"/>
       </w:tblGrid>
       <w:tr>
         <w:trPr>
@@ -246,7 +245,7 @@
         </w:trPr>
         <w:tc>
           <w:tcPr>
-            <w:tcW w:w="2260" w:type="dxa"/>
+            <w:tcW w:w="3261" w:type="dxa"/>
             <w:tcBorders>
               <w:top w:val="single" w:sz="6" w:space="0" w:color="666666"/>
               <w:left w:val="single" w:sz="6" w:space="0" w:color="666666"/>
@@ -272,7 +271,7 @@
         </w:tc>
         <w:tc>
           <w:tcPr>
-            <w:tcW w:w="3686" w:type="dxa"/>
+            <w:tcW w:w="4102" w:type="dxa"/>
             <w:tcBorders>
               <w:top w:val="single" w:sz="6" w:space="0" w:color="666666"/>
               <w:left w:val="single" w:sz="6" w:space="0" w:color="666666"/>
@@ -298,7 +297,7 @@
         </w:tc>
         <w:tc>
           <w:tcPr>
-            <w:tcW w:w="2557" w:type="dxa"/>
+            <w:tcW w:w="3411" w:type="dxa"/>
             <w:tcBorders>
               <w:top w:val="single" w:sz="6" w:space="0" w:color="666666"/>
               <w:left w:val="single" w:sz="6" w:space="0" w:color="666666"/>
@@ -331,66 +330,6 @@
             </w:r>
           </w:p>
         </w:tc>
-        <w:tc>
-          <w:tcPr>
-            <w:tcW w:w="2229" w:type="dxa"/>
-            <w:tcBorders>
-              <w:top w:val="single" w:sz="6" w:space="0" w:color="666666"/>
-              <w:left w:val="single" w:sz="6" w:space="0" w:color="666666"/>
-              <w:bottom w:val="single" w:sz="6" w:space="0" w:color="666666"/>
-              <w:right w:val="single" w:sz="6" w:space="0" w:color="666666"/>
-            </w:tcBorders>
-            <w:shd w:val="clear" w:color="auto" w:fill="A6A6A6"/>
-          </w:tcPr>
-          <w:p>
-            <w:pPr>
-              <w:spacing w:after="0" w:line="259" w:lineRule="auto"/>
-              <w:ind w:left="66" w:firstLine="0"/>
-              <w:jc w:val="center"/>
-              <w:rPr>
-                <w:b/>
-                <w:sz w:val="21"/>
-              </w:rPr>
-            </w:pPr>
-            <w:r>
-              <w:rPr>
-                <w:b/>
-                <w:sz w:val="21"/>
-              </w:rPr>
-              <w:t>Bundled</w:t>
-            </w:r>
-            <w:r>
-              <w:rPr>
-                <w:b/>
-                <w:sz w:val="21"/>
-              </w:rPr>
-              <w:t xml:space="preserve"> </w:t>
-            </w:r>
-            <w:r>
-              <w:rPr>
-                <w:b/>
-                <w:sz w:val="21"/>
-              </w:rPr>
-              <w:t xml:space="preserve">         </w:t>
-            </w:r>
-            <w:proofErr w:type="gramStart"/>
-            <w:r>
-              <w:rPr>
-                <w:b/>
-                <w:sz w:val="21"/>
-              </w:rPr>
-              <w:t>Pricing(</w:t>
-            </w:r>
-            <w:proofErr w:type="gramEnd"/>
-            <w:r>
-              <w:rPr>
-                <w:b/>
-                <w:sz w:val="21"/>
-              </w:rPr>
-              <w:t>10%)</w:t>
-            </w:r>
-          </w:p>
-        </w:tc>
       </w:tr>
       <w:tr>
         <w:trPr>
@@ -399,7 +338,7 @@
         </w:trPr>
         <w:tc>
           <w:tcPr>
-            <w:tcW w:w="2260" w:type="dxa"/>
+            <w:tcW w:w="3261" w:type="dxa"/>
             <w:tcBorders>
               <w:top w:val="single" w:sz="6" w:space="0" w:color="666666"/>
               <w:left w:val="single" w:sz="6" w:space="0" w:color="666666"/>
@@ -428,7 +367,7 @@
         </w:tc>
         <w:tc>
           <w:tcPr>
-            <w:tcW w:w="3686" w:type="dxa"/>
+            <w:tcW w:w="4102" w:type="dxa"/>
             <w:tcBorders>
               <w:top w:val="single" w:sz="6" w:space="0" w:color="666666"/>
               <w:left w:val="single" w:sz="6" w:space="0" w:color="666666"/>
@@ -447,7 +386,7 @@
         </w:tc>
         <w:tc>
           <w:tcPr>
-            <w:tcW w:w="2557" w:type="dxa"/>
+            <w:tcW w:w="3411" w:type="dxa"/>
             <w:tcBorders>
               <w:top w:val="single" w:sz="6" w:space="0" w:color="666666"/>
               <w:left w:val="single" w:sz="6" w:space="0" w:color="666666"/>
@@ -467,29 +406,6 @@
             </w:pPr>
           </w:p>
         </w:tc>
-        <w:tc>
-          <w:tcPr>
-            <w:tcW w:w="2229" w:type="dxa"/>
-            <w:tcBorders>
-              <w:top w:val="single" w:sz="6" w:space="0" w:color="666666"/>
-              <w:left w:val="single" w:sz="6" w:space="0" w:color="666666"/>
-              <w:bottom w:val="single" w:sz="6" w:space="0" w:color="666666"/>
-              <w:right w:val="single" w:sz="6" w:space="0" w:color="666666"/>
-            </w:tcBorders>
-            <w:shd w:val="clear" w:color="auto" w:fill="D1D1D1" w:themeFill="background2" w:themeFillShade="E6"/>
-          </w:tcPr>
-          <w:p>
-            <w:pPr>
-              <w:spacing w:after="0" w:line="259" w:lineRule="auto"/>
-              <w:ind w:left="0" w:right="50" w:firstLine="0"/>
-              <w:jc w:val="center"/>
-              <w:rPr>
-                <w:sz w:val="20"/>
-                <w:szCs w:val="20"/>
-              </w:rPr>
-            </w:pPr>
-          </w:p>
-        </w:tc>
       </w:tr>
       <w:tr>
         <w:trPr>
@@ -498,7 +414,7 @@
         </w:trPr>
         <w:tc>
           <w:tcPr>
-            <w:tcW w:w="2260" w:type="dxa"/>
+            <w:tcW w:w="3261" w:type="dxa"/>
             <w:tcBorders>
               <w:top w:val="single" w:sz="6" w:space="0" w:color="666666"/>
               <w:left w:val="single" w:sz="6" w:space="0" w:color="666666"/>
@@ -543,7 +459,7 @@
         </w:tc>
         <w:tc>
           <w:tcPr>
-            <w:tcW w:w="3686" w:type="dxa"/>
+            <w:tcW w:w="4102" w:type="dxa"/>
             <w:tcBorders>
               <w:top w:val="single" w:sz="6" w:space="0" w:color="666666"/>
               <w:left w:val="single" w:sz="6" w:space="0" w:color="666666"/>
@@ -593,7 +509,7 @@
         </w:tc>
         <w:tc>
           <w:tcPr>
-            <w:tcW w:w="2557" w:type="dxa"/>
+            <w:tcW w:w="3411" w:type="dxa"/>
             <w:tcBorders>
               <w:top w:val="single" w:sz="6" w:space="0" w:color="666666"/>
               <w:left w:val="single" w:sz="6" w:space="0" w:color="666666"/>
@@ -636,52 +552,6 @@
             </w:r>
           </w:p>
         </w:tc>
-        <w:tc>
-          <w:tcPr>
-            <w:tcW w:w="2229" w:type="dxa"/>
-            <w:tcBorders>
-              <w:top w:val="single" w:sz="6" w:space="0" w:color="666666"/>
-              <w:left w:val="single" w:sz="6" w:space="0" w:color="666666"/>
-              <w:bottom w:val="single" w:sz="6" w:space="0" w:color="666666"/>
-              <w:right w:val="single" w:sz="6" w:space="0" w:color="666666"/>
-            </w:tcBorders>
-            <w:shd w:val="clear" w:color="auto" w:fill="D1D1D1" w:themeFill="background2" w:themeFillShade="E6"/>
-          </w:tcPr>
-          <w:p>
-            <w:pPr>
-              <w:spacing w:after="0" w:line="259" w:lineRule="auto"/>
-              <w:ind w:left="0" w:right="50" w:firstLine="0"/>
-              <w:jc w:val="center"/>
-              <w:rPr>
-                <w:sz w:val="20"/>
-                <w:szCs w:val="20"/>
-              </w:rPr>
-            </w:pPr>
-            <w:r>
-              <w:rPr>
-                <w:sz w:val="20"/>
-                <w:szCs w:val="20"/>
-              </w:rPr>
-              <w:t>{{</w:t>
-            </w:r>
-            <w:proofErr w:type="spellStart"/>
-            <w:r>
-              <w:rPr>
-                <w:sz w:val="20"/>
-                <w:szCs w:val="20"/>
-              </w:rPr>
-              <w:t>exhibitBundledPrice</w:t>
-            </w:r>
-            <w:proofErr w:type="spellEnd"/>
-            <w:r>
-              <w:rPr>
-                <w:sz w:val="20"/>
-                <w:szCs w:val="20"/>
-              </w:rPr>
-              <w:t>}}</w:t>
-            </w:r>
-          </w:p>
-        </w:tc>
       </w:tr>
       <w:tr>
         <w:trPr>
@@ -690,7 +560,7 @@
         </w:trPr>
         <w:tc>
           <w:tcPr>
-            <w:tcW w:w="2260" w:type="dxa"/>
+            <w:tcW w:w="3261" w:type="dxa"/>
             <w:tcBorders>
               <w:top w:val="single" w:sz="6" w:space="0" w:color="666666"/>
               <w:left w:val="single" w:sz="6" w:space="0" w:color="666666"/>
@@ -719,7 +589,7 @@
         </w:tc>
         <w:tc>
           <w:tcPr>
-            <w:tcW w:w="3686" w:type="dxa"/>
+            <w:tcW w:w="4102" w:type="dxa"/>
             <w:tcBorders>
               <w:top w:val="single" w:sz="6" w:space="0" w:color="666666"/>
               <w:left w:val="single" w:sz="6" w:space="0" w:color="666666"/>
@@ -742,7 +612,7 @@
         </w:tc>
         <w:tc>
           <w:tcPr>
-            <w:tcW w:w="2557" w:type="dxa"/>
+            <w:tcW w:w="3411" w:type="dxa"/>
             <w:tcBorders>
               <w:top w:val="single" w:sz="6" w:space="0" w:color="666666"/>
               <w:left w:val="single" w:sz="6" w:space="0" w:color="666666"/>
@@ -762,29 +632,6 @@
             </w:pPr>
           </w:p>
         </w:tc>
-        <w:tc>
-          <w:tcPr>
-            <w:tcW w:w="2229" w:type="dxa"/>
-            <w:tcBorders>
-              <w:top w:val="single" w:sz="6" w:space="0" w:color="666666"/>
-              <w:left w:val="single" w:sz="6" w:space="0" w:color="666666"/>
-              <w:bottom w:val="single" w:sz="6" w:space="0" w:color="666666"/>
-              <w:right w:val="single" w:sz="6" w:space="0" w:color="666666"/>
-            </w:tcBorders>
-            <w:shd w:val="clear" w:color="auto" w:fill="D1D1D1" w:themeFill="background2" w:themeFillShade="E6"/>
-          </w:tcPr>
-          <w:p>
-            <w:pPr>
-              <w:spacing w:after="0" w:line="259" w:lineRule="auto"/>
-              <w:ind w:left="0" w:right="50" w:firstLine="0"/>
-              <w:jc w:val="center"/>
-              <w:rPr>
-                <w:sz w:val="20"/>
-                <w:szCs w:val="20"/>
-              </w:rPr>
-            </w:pPr>
-          </w:p>
-        </w:tc>
       </w:tr>
       <w:tr>
         <w:trPr>
@@ -793,7 +640,7 @@
         </w:trPr>
         <w:tc>
           <w:tcPr>
-            <w:tcW w:w="2260" w:type="dxa"/>
+            <w:tcW w:w="3261" w:type="dxa"/>
             <w:tcBorders>
               <w:top w:val="single" w:sz="6" w:space="0" w:color="666666"/>
               <w:left w:val="single" w:sz="6" w:space="0" w:color="666666"/>
@@ -824,7 +671,7 @@
         </w:tc>
         <w:tc>
           <w:tcPr>
-            <w:tcW w:w="3686" w:type="dxa"/>
+            <w:tcW w:w="4102" w:type="dxa"/>
             <w:tcBorders>
               <w:top w:val="single" w:sz="6" w:space="0" w:color="666666"/>
               <w:left w:val="single" w:sz="6" w:space="0" w:color="666666"/>
@@ -936,14 +783,7 @@
                 <w:sz w:val="20"/>
                 <w:szCs w:val="20"/>
               </w:rPr>
-              <w:t>Recon</w:t>
-            </w:r>
-            <w:r>
-              <w:rPr>
-                <w:sz w:val="20"/>
-                <w:szCs w:val="20"/>
-              </w:rPr>
-              <w:t>ciliation Support | End-to End</w:t>
+              <w:t>Reconciliation Support | End-to End</w:t>
             </w:r>
           </w:p>
           <w:p>
@@ -970,13 +810,7 @@
               <w:rPr>
                 <w:sz w:val="19"/>
               </w:rPr>
-              <w:t>---------------------------------------</w:t>
-            </w:r>
-            <w:r>
-              <w:rPr>
-                <w:sz w:val="19"/>
-              </w:rPr>
-              <w:t>---------</w:t>
+              <w:t>------------------------------------------------</w:t>
             </w:r>
           </w:p>
           <w:p>
@@ -1039,7 +873,7 @@
         </w:tc>
         <w:tc>
           <w:tcPr>
-            <w:tcW w:w="2557" w:type="dxa"/>
+            <w:tcW w:w="3411" w:type="dxa"/>
             <w:tcBorders>
               <w:top w:val="single" w:sz="6" w:space="0" w:color="666666"/>
               <w:left w:val="single" w:sz="6" w:space="0" w:color="666666"/>
@@ -1082,52 +916,6 @@
             </w:r>
           </w:p>
         </w:tc>
-        <w:tc>
-          <w:tcPr>
-            <w:tcW w:w="2229" w:type="dxa"/>
-            <w:tcBorders>
-              <w:top w:val="single" w:sz="6" w:space="0" w:color="666666"/>
-              <w:left w:val="single" w:sz="6" w:space="0" w:color="666666"/>
-              <w:bottom w:val="single" w:sz="6" w:space="0" w:color="666666"/>
-              <w:right w:val="single" w:sz="6" w:space="0" w:color="666666"/>
-            </w:tcBorders>
-            <w:shd w:val="clear" w:color="auto" w:fill="D1D1D1" w:themeFill="background2" w:themeFillShade="E6"/>
-          </w:tcPr>
-          <w:p>
-            <w:pPr>
-              <w:spacing w:after="0" w:line="259" w:lineRule="auto"/>
-              <w:ind w:left="0" w:right="50" w:firstLine="0"/>
-              <w:jc w:val="center"/>
-              <w:rPr>
-                <w:sz w:val="20"/>
-                <w:szCs w:val="20"/>
-              </w:rPr>
-            </w:pPr>
-            <w:r>
-              <w:rPr>
-                <w:sz w:val="20"/>
-                <w:szCs w:val="20"/>
-              </w:rPr>
-              <w:t>{{</w:t>
-            </w:r>
-            <w:proofErr w:type="spellStart"/>
-            <w:r>
-              <w:rPr>
-                <w:sz w:val="20"/>
-                <w:szCs w:val="20"/>
-              </w:rPr>
-              <w:t>migrationBundled</w:t>
-            </w:r>
-            <w:proofErr w:type="spellEnd"/>
-            <w:r>
-              <w:rPr>
-                <w:sz w:val="20"/>
-                <w:szCs w:val="20"/>
-              </w:rPr>
-              <w:t>}}</w:t>
-            </w:r>
-          </w:p>
-        </w:tc>
       </w:tr>
       <w:tr>
         <w:trPr>
@@ -1136,7 +924,7 @@
         </w:trPr>
         <w:tc>
           <w:tcPr>
-            <w:tcW w:w="2260" w:type="dxa"/>
+            <w:tcW w:w="3261" w:type="dxa"/>
             <w:tcBorders>
               <w:top w:val="single" w:sz="6" w:space="0" w:color="666666"/>
               <w:left w:val="single" w:sz="6" w:space="0" w:color="666666"/>
@@ -1181,7 +969,7 @@
         </w:tc>
         <w:tc>
           <w:tcPr>
-            <w:tcW w:w="3686" w:type="dxa"/>
+            <w:tcW w:w="4102" w:type="dxa"/>
             <w:tcBorders>
               <w:top w:val="single" w:sz="6" w:space="0" w:color="666666"/>
               <w:left w:val="single" w:sz="6" w:space="0" w:color="666666"/>
@@ -1299,7 +1087,7 @@
         </w:tc>
         <w:tc>
           <w:tcPr>
-            <w:tcW w:w="2557" w:type="dxa"/>
+            <w:tcW w:w="3411" w:type="dxa"/>
             <w:tcBorders>
               <w:top w:val="single" w:sz="6" w:space="0" w:color="666666"/>
               <w:left w:val="single" w:sz="6" w:space="0" w:color="666666"/>
@@ -1360,63 +1148,6 @@
             </w:pPr>
           </w:p>
         </w:tc>
-        <w:tc>
-          <w:tcPr>
-            <w:tcW w:w="2229" w:type="dxa"/>
-            <w:tcBorders>
-              <w:top w:val="single" w:sz="6" w:space="0" w:color="666666"/>
-              <w:left w:val="single" w:sz="6" w:space="0" w:color="666666"/>
-              <w:bottom w:val="single" w:sz="6" w:space="0" w:color="666666"/>
-              <w:right w:val="single" w:sz="6" w:space="0" w:color="666666"/>
-            </w:tcBorders>
-            <w:shd w:val="clear" w:color="auto" w:fill="D1D1D1" w:themeFill="background2" w:themeFillShade="E6"/>
-          </w:tcPr>
-          <w:p>
-            <w:pPr>
-              <w:spacing w:after="0" w:line="259" w:lineRule="auto"/>
-              <w:ind w:left="0" w:right="50" w:firstLine="0"/>
-              <w:jc w:val="center"/>
-              <w:rPr>
-                <w:sz w:val="20"/>
-                <w:szCs w:val="20"/>
-              </w:rPr>
-            </w:pPr>
-          </w:p>
-          <w:p>
-            <w:pPr>
-              <w:spacing w:after="0" w:line="259" w:lineRule="auto"/>
-              <w:ind w:left="0" w:right="50" w:firstLine="0"/>
-              <w:jc w:val="center"/>
-              <w:rPr>
-                <w:sz w:val="20"/>
-                <w:szCs w:val="20"/>
-              </w:rPr>
-            </w:pPr>
-            <w:r>
-              <w:rPr>
-                <w:sz w:val="20"/>
-                <w:szCs w:val="20"/>
-              </w:rPr>
-              <w:t>{{</w:t>
-            </w:r>
-            <w:proofErr w:type="spellStart"/>
-            <w:r>
-              <w:rPr>
-                <w:sz w:val="20"/>
-                <w:szCs w:val="20"/>
-              </w:rPr>
-              <w:t>serverPriceBundled</w:t>
-            </w:r>
-            <w:proofErr w:type="spellEnd"/>
-            <w:r>
-              <w:rPr>
-                <w:sz w:val="20"/>
-                <w:szCs w:val="20"/>
-              </w:rPr>
-              <w:t>}}</w:t>
-            </w:r>
-          </w:p>
-        </w:tc>
       </w:tr>
       <w:tr>
         <w:trPr>
@@ -1425,7 +1156,7 @@
         </w:trPr>
         <w:tc>
           <w:tcPr>
-            <w:tcW w:w="2260" w:type="dxa"/>
+            <w:tcW w:w="3261" w:type="dxa"/>
             <w:tcBorders>
               <w:top w:val="single" w:sz="6" w:space="0" w:color="666666"/>
               <w:left w:val="single" w:sz="6" w:space="0" w:color="666666"/>
@@ -1447,7 +1178,6 @@
                 <w:bCs/>
                 <w:sz w:val="19"/>
               </w:rPr>
-              <w:lastRenderedPageBreak/>
               <w:t>{{/servers}}</w:t>
             </w:r>
           </w:p>
@@ -1465,7 +1195,7 @@
         </w:tc>
         <w:tc>
           <w:tcPr>
-            <w:tcW w:w="3686" w:type="dxa"/>
+            <w:tcW w:w="4102" w:type="dxa"/>
             <w:tcBorders>
               <w:top w:val="single" w:sz="6" w:space="0" w:color="666666"/>
               <w:left w:val="single" w:sz="6" w:space="0" w:color="666666"/>
@@ -1487,7 +1217,7 @@
         </w:tc>
         <w:tc>
           <w:tcPr>
-            <w:tcW w:w="2557" w:type="dxa"/>
+            <w:tcW w:w="3411" w:type="dxa"/>
             <w:tcBorders>
               <w:top w:val="single" w:sz="6" w:space="0" w:color="666666"/>
               <w:left w:val="single" w:sz="6" w:space="0" w:color="666666"/>
@@ -1507,235 +1237,6 @@
             </w:pPr>
           </w:p>
         </w:tc>
-        <w:tc>
-          <w:tcPr>
-            <w:tcW w:w="2229" w:type="dxa"/>
-            <w:tcBorders>
-              <w:top w:val="single" w:sz="6" w:space="0" w:color="666666"/>
-              <w:left w:val="single" w:sz="6" w:space="0" w:color="666666"/>
-              <w:bottom w:val="single" w:sz="6" w:space="0" w:color="666666"/>
-              <w:right w:val="single" w:sz="6" w:space="0" w:color="666666"/>
-            </w:tcBorders>
-            <w:shd w:val="clear" w:color="auto" w:fill="D1D1D1" w:themeFill="background2" w:themeFillShade="E6"/>
-          </w:tcPr>
-          <w:p>
-            <w:pPr>
-              <w:spacing w:after="0" w:line="259" w:lineRule="auto"/>
-              <w:ind w:left="0" w:right="50" w:firstLine="0"/>
-              <w:jc w:val="center"/>
-              <w:rPr>
-                <w:sz w:val="20"/>
-                <w:szCs w:val="20"/>
-              </w:rPr>
-            </w:pPr>
-          </w:p>
-        </w:tc>
-      </w:tr>
-      <w:tr>
-        <w:trPr>
-          <w:trHeight w:val="331"/>
-          <w:jc w:val="center"/>
-        </w:trPr>
-        <w:tc>
-          <w:tcPr>
-            <w:tcW w:w="2260" w:type="dxa"/>
-            <w:tcBorders>
-              <w:top w:val="single" w:sz="6" w:space="0" w:color="666666"/>
-              <w:left w:val="single" w:sz="6" w:space="0" w:color="666666"/>
-              <w:bottom w:val="single" w:sz="6" w:space="0" w:color="666666"/>
-              <w:right w:val="single" w:sz="6" w:space="0" w:color="666666"/>
-            </w:tcBorders>
-            <w:shd w:val="clear" w:color="auto" w:fill="ADADAD" w:themeFill="background2" w:themeFillShade="BF"/>
-          </w:tcPr>
-          <w:p>
-            <w:pPr>
-              <w:spacing w:after="0" w:line="259" w:lineRule="auto"/>
-              <w:ind w:right="54"/>
-              <w:jc w:val="center"/>
-              <w:rPr>
-                <w:bCs/>
-                <w:sz w:val="19"/>
-                <w:highlight w:val="lightGray"/>
-              </w:rPr>
-            </w:pPr>
-            <w:proofErr w:type="spellStart"/>
-            <w:r>
-              <w:rPr>
-                <w:bCs/>
-                <w:sz w:val="19"/>
-                <w:highlight w:val="lightGray"/>
-              </w:rPr>
-              <w:t>CloudFuze</w:t>
-            </w:r>
-            <w:proofErr w:type="spellEnd"/>
-            <w:r>
-              <w:rPr>
-                <w:bCs/>
-                <w:sz w:val="19"/>
-                <w:highlight w:val="lightGray"/>
-              </w:rPr>
-              <w:t xml:space="preserve"> Manage</w:t>
-            </w:r>
-          </w:p>
-        </w:tc>
-        <w:tc>
-          <w:tcPr>
-            <w:tcW w:w="3686" w:type="dxa"/>
-            <w:tcBorders>
-              <w:top w:val="single" w:sz="6" w:space="0" w:color="666666"/>
-              <w:left w:val="single" w:sz="6" w:space="0" w:color="666666"/>
-              <w:bottom w:val="single" w:sz="6" w:space="0" w:color="666666"/>
-              <w:right w:val="single" w:sz="6" w:space="0" w:color="666666"/>
-            </w:tcBorders>
-            <w:shd w:val="clear" w:color="auto" w:fill="ADADAD" w:themeFill="background2" w:themeFillShade="BF"/>
-            <w:vAlign w:val="center"/>
-          </w:tcPr>
-          <w:p>
-            <w:pPr>
-              <w:spacing w:after="73" w:line="259" w:lineRule="auto"/>
-              <w:ind w:left="0" w:right="54" w:firstLine="0"/>
-              <w:jc w:val="center"/>
-              <w:rPr>
-                <w:sz w:val="19"/>
-                <w:highlight w:val="lightGray"/>
-              </w:rPr>
-            </w:pPr>
-            <w:r>
-              <w:rPr>
-                <w:sz w:val="19"/>
-                <w:highlight w:val="lightGray"/>
-              </w:rPr>
-              <w:t>P</w:t>
-            </w:r>
-            <w:r>
-              <w:rPr>
-                <w:sz w:val="19"/>
-                <w:highlight w:val="lightGray"/>
-              </w:rPr>
-              <w:t xml:space="preserve">er </w:t>
-            </w:r>
-            <w:r>
-              <w:rPr>
-                <w:sz w:val="19"/>
-                <w:highlight w:val="lightGray"/>
-              </w:rPr>
-              <w:t>U</w:t>
-            </w:r>
-            <w:r>
-              <w:rPr>
-                <w:sz w:val="19"/>
-                <w:highlight w:val="lightGray"/>
-              </w:rPr>
-              <w:t xml:space="preserve">ser </w:t>
-            </w:r>
-            <w:r>
-              <w:rPr>
-                <w:sz w:val="19"/>
-                <w:highlight w:val="lightGray"/>
-              </w:rPr>
-              <w:t>$</w:t>
-            </w:r>
-            <w:r>
-              <w:rPr>
-                <w:sz w:val="19"/>
-                <w:highlight w:val="lightGray"/>
-              </w:rPr>
-              <w:t>3.99 </w:t>
-            </w:r>
-          </w:p>
-        </w:tc>
-        <w:tc>
-          <w:tcPr>
-            <w:tcW w:w="2557" w:type="dxa"/>
-            <w:tcBorders>
-              <w:top w:val="single" w:sz="6" w:space="0" w:color="666666"/>
-              <w:left w:val="single" w:sz="6" w:space="0" w:color="666666"/>
-              <w:bottom w:val="single" w:sz="6" w:space="0" w:color="666666"/>
-              <w:right w:val="single" w:sz="6" w:space="0" w:color="666666"/>
-            </w:tcBorders>
-            <w:shd w:val="clear" w:color="auto" w:fill="ADADAD" w:themeFill="background2" w:themeFillShade="BF"/>
-          </w:tcPr>
-          <w:p>
-            <w:pPr>
-              <w:spacing w:after="0" w:line="259" w:lineRule="auto"/>
-              <w:ind w:left="0" w:right="50" w:firstLine="0"/>
-              <w:jc w:val="center"/>
-              <w:rPr>
-                <w:sz w:val="20"/>
-                <w:szCs w:val="20"/>
-              </w:rPr>
-            </w:pPr>
-            <w:r>
-              <w:rPr>
-                <w:sz w:val="20"/>
-                <w:szCs w:val="20"/>
-              </w:rPr>
-              <w:t>{{</w:t>
-            </w:r>
-            <w:proofErr w:type="spellStart"/>
-            <w:r>
-              <w:rPr>
-                <w:sz w:val="20"/>
-                <w:szCs w:val="20"/>
-              </w:rPr>
-              <w:t>cfm_user_total</w:t>
-            </w:r>
-            <w:proofErr w:type="spellEnd"/>
-            <w:r>
-              <w:rPr>
-                <w:sz w:val="20"/>
-                <w:szCs w:val="20"/>
-              </w:rPr>
-              <w:t>}}</w:t>
-            </w:r>
-          </w:p>
-        </w:tc>
-        <w:tc>
-          <w:tcPr>
-            <w:tcW w:w="2229" w:type="dxa"/>
-            <w:tcBorders>
-              <w:top w:val="single" w:sz="6" w:space="0" w:color="666666"/>
-              <w:left w:val="single" w:sz="6" w:space="0" w:color="666666"/>
-              <w:bottom w:val="single" w:sz="6" w:space="0" w:color="666666"/>
-              <w:right w:val="single" w:sz="6" w:space="0" w:color="666666"/>
-            </w:tcBorders>
-            <w:shd w:val="clear" w:color="auto" w:fill="ADADAD" w:themeFill="background2" w:themeFillShade="BF"/>
-          </w:tcPr>
-          <w:p>
-            <w:pPr>
-              <w:spacing w:after="0" w:line="259" w:lineRule="auto"/>
-              <w:ind w:left="0" w:right="50" w:firstLine="0"/>
-              <w:jc w:val="center"/>
-              <w:rPr>
-                <w:sz w:val="20"/>
-                <w:szCs w:val="20"/>
-              </w:rPr>
-            </w:pPr>
-            <w:r>
-              <w:rPr>
-                <w:sz w:val="20"/>
-                <w:szCs w:val="20"/>
-              </w:rPr>
-              <w:t>{{</w:t>
-            </w:r>
-            <w:proofErr w:type="spellStart"/>
-            <w:r>
-              <w:rPr>
-                <w:sz w:val="20"/>
-                <w:szCs w:val="20"/>
-              </w:rPr>
-              <w:t>cfm_user_total_b</w:t>
-            </w:r>
-            <w:proofErr w:type="spellEnd"/>
-            <w:r>
-              <w:rPr>
-                <w:sz w:val="20"/>
-                <w:szCs w:val="20"/>
-              </w:rPr>
-              <w:t>}}</w:t>
-            </w:r>
-          </w:p>
-        </w:tc>
       </w:tr>
       <w:tr>
         <w:trPr>
@@ -1744,7 +1245,7 @@
         </w:trPr>
         <w:tc>
           <w:tcPr>
-            <w:tcW w:w="2260" w:type="dxa"/>
+            <w:tcW w:w="3261" w:type="dxa"/>
             <w:tcBorders>
               <w:top w:val="single" w:sz="6" w:space="0" w:color="666666"/>
               <w:left w:val="single" w:sz="6" w:space="0" w:color="666666"/>
@@ -1767,13 +1268,14 @@
                 <w:bCs/>
                 <w:sz w:val="19"/>
               </w:rPr>
+              <w:lastRenderedPageBreak/>
               <w:t xml:space="preserve">Discount </w:t>
             </w:r>
           </w:p>
         </w:tc>
         <w:tc>
           <w:tcPr>
-            <w:tcW w:w="3686" w:type="dxa"/>
+            <w:tcW w:w="4102" w:type="dxa"/>
             <w:tcBorders>
               <w:top w:val="single" w:sz="6" w:space="0" w:color="666666"/>
               <w:left w:val="single" w:sz="6" w:space="0" w:color="666666"/>
@@ -1827,7 +1329,7 @@
         </w:tc>
         <w:tc>
           <w:tcPr>
-            <w:tcW w:w="2557" w:type="dxa"/>
+            <w:tcW w:w="3411" w:type="dxa"/>
             <w:tcBorders>
               <w:top w:val="single" w:sz="6" w:space="0" w:color="666666"/>
               <w:left w:val="single" w:sz="6" w:space="0" w:color="666666"/>
@@ -1871,28 +1373,6 @@
             </w:r>
           </w:p>
         </w:tc>
-        <w:tc>
-          <w:tcPr>
-            <w:tcW w:w="2229" w:type="dxa"/>
-            <w:tcBorders>
-              <w:top w:val="single" w:sz="6" w:space="0" w:color="666666"/>
-              <w:left w:val="single" w:sz="6" w:space="0" w:color="666666"/>
-              <w:bottom w:val="single" w:sz="6" w:space="0" w:color="666666"/>
-              <w:right w:val="single" w:sz="6" w:space="0" w:color="666666"/>
-            </w:tcBorders>
-          </w:tcPr>
-          <w:p>
-            <w:pPr>
-              <w:spacing w:after="0" w:line="259" w:lineRule="auto"/>
-              <w:ind w:left="0" w:right="50" w:firstLine="0"/>
-              <w:jc w:val="center"/>
-              <w:rPr>
-                <w:sz w:val="20"/>
-                <w:szCs w:val="20"/>
-              </w:rPr>
-            </w:pPr>
-          </w:p>
-        </w:tc>
       </w:tr>
       <w:tr>
         <w:trPr>
@@ -1901,7 +1381,7 @@
         </w:trPr>
         <w:tc>
           <w:tcPr>
-            <w:tcW w:w="2260" w:type="dxa"/>
+            <w:tcW w:w="3261" w:type="dxa"/>
             <w:tcBorders>
               <w:top w:val="single" w:sz="6" w:space="0" w:color="666666"/>
               <w:left w:val="single" w:sz="6" w:space="0" w:color="666666"/>
@@ -1924,7 +1404,7 @@
         </w:tc>
         <w:tc>
           <w:tcPr>
-            <w:tcW w:w="3686" w:type="dxa"/>
+            <w:tcW w:w="4102" w:type="dxa"/>
             <w:tcBorders>
               <w:top w:val="single" w:sz="6" w:space="0" w:color="666666"/>
               <w:left w:val="single" w:sz="6" w:space="0" w:color="666666"/>
@@ -1955,7 +1435,7 @@
         </w:tc>
         <w:tc>
           <w:tcPr>
-            <w:tcW w:w="2557" w:type="dxa"/>
+            <w:tcW w:w="3411" w:type="dxa"/>
             <w:tcBorders>
               <w:top w:val="single" w:sz="6" w:space="0" w:color="666666"/>
               <w:left w:val="single" w:sz="6" w:space="0" w:color="666666"/>
@@ -2002,54 +1482,6 @@
             </w:r>
           </w:p>
         </w:tc>
-        <w:tc>
-          <w:tcPr>
-            <w:tcW w:w="2229" w:type="dxa"/>
-            <w:tcBorders>
-              <w:top w:val="single" w:sz="6" w:space="0" w:color="666666"/>
-              <w:left w:val="single" w:sz="6" w:space="0" w:color="666666"/>
-              <w:bottom w:val="single" w:sz="6" w:space="0" w:color="666666"/>
-              <w:right w:val="single" w:sz="6" w:space="0" w:color="666666"/>
-            </w:tcBorders>
-            <w:shd w:val="clear" w:color="auto" w:fill="ADADAD" w:themeFill="background2" w:themeFillShade="BF"/>
-          </w:tcPr>
-          <w:p>
-            <w:pPr>
-              <w:spacing w:after="0" w:line="259" w:lineRule="auto"/>
-              <w:ind w:left="0" w:right="50" w:firstLine="0"/>
-              <w:jc w:val="center"/>
-              <w:rPr>
-                <w:sz w:val="20"/>
-                <w:szCs w:val="20"/>
-              </w:rPr>
-            </w:pPr>
-            <w:bookmarkStart w:id="0" w:name="_Hlk221899452"/>
-            <w:r>
-              <w:rPr>
-                <w:sz w:val="20"/>
-                <w:szCs w:val="20"/>
-              </w:rPr>
-              <w:t>{{</w:t>
-            </w:r>
-            <w:proofErr w:type="spellStart"/>
-            <w:r>
-              <w:rPr>
-                <w:sz w:val="20"/>
-                <w:szCs w:val="20"/>
-              </w:rPr>
-              <w:t>cfm_total_b</w:t>
-            </w:r>
-            <w:proofErr w:type="spellEnd"/>
-            <w:r>
-              <w:rPr>
-                <w:sz w:val="20"/>
-                <w:szCs w:val="20"/>
-              </w:rPr>
-              <w:t>}}</w:t>
-            </w:r>
-            <w:bookmarkEnd w:id="0"/>
-          </w:p>
-        </w:tc>
       </w:tr>
     </w:tbl>
     <w:p>
@@ -2401,7 +1833,7 @@
         </w:rPr>
         <w:t xml:space="preserve"> </w:t>
       </w:r>
-      <w:bookmarkStart w:id="1" w:name="_Hlk210928566"/>
+      <w:bookmarkStart w:id="0" w:name="_Hlk210928566"/>
       <w:r>
         <w:rPr>
           <w:sz w:val="21"/>
@@ -2441,7 +1873,7 @@
         </w:rPr>
         <w:t>}}</w:t>
       </w:r>
-      <w:bookmarkEnd w:id="1"/>
+      <w:bookmarkEnd w:id="0"/>
     </w:p>
     <w:p>
       <w:pPr>
@@ -2484,7 +1916,7 @@
         </w:rPr>
         <w:t xml:space="preserve">This SaaS Services Agreement (“Agreement”) is entered on this </w:t>
       </w:r>
-      <w:bookmarkStart w:id="2" w:name="_Hlk210928581"/>
+      <w:bookmarkStart w:id="1" w:name="_Hlk210928581"/>
       <w:r>
         <w:rPr>
           <w:b/>
@@ -2494,7 +1926,7 @@
         </w:rPr>
         <w:t>{{Date}}</w:t>
       </w:r>
-      <w:bookmarkEnd w:id="2"/>
+      <w:bookmarkEnd w:id="1"/>
       <w:r>
         <w:rPr>
           <w:sz w:val="21"/>

</xml_diff>

<commit_message>
Replaced with Migration Planning
</commit_message>
<xml_diff>
--- a/backend-templates/MultiCombinations.docx
+++ b/backend-templates/MultiCombinations.docx
@@ -734,7 +734,42 @@
                 <w:sz w:val="21"/>
                 <w:szCs w:val="21"/>
               </w:rPr>
-              <w:t>Manager | Pre-Migration Analysis | During Migration Consulting |Post-Migration Support and Data Reconciliation Support | End-to End</w:t>
+              <w:t xml:space="preserve">Manager | </w:t>
+            </w:r>
+            <w:r>
+              <w:rPr>
+                <w:sz w:val="21"/>
+                <w:szCs w:val="21"/>
+              </w:rPr>
+              <w:t>Migration Planning</w:t>
+            </w:r>
+            <w:r>
+              <w:rPr>
+                <w:sz w:val="21"/>
+                <w:szCs w:val="21"/>
+              </w:rPr>
+              <w:t xml:space="preserve"> </w:t>
+            </w:r>
+            <w:r>
+              <w:rPr>
+                <w:sz w:val="21"/>
+                <w:szCs w:val="21"/>
+              </w:rPr>
+              <w:t>| During Migration Consulting |</w:t>
+            </w:r>
+            <w:r>
+              <w:rPr>
+                <w:sz w:val="21"/>
+                <w:szCs w:val="21"/>
+              </w:rPr>
+              <w:t xml:space="preserve"> </w:t>
+            </w:r>
+            <w:r>
+              <w:rPr>
+                <w:sz w:val="21"/>
+                <w:szCs w:val="21"/>
+              </w:rPr>
+              <w:t>Post-Migration Support and Data Reconciliation Support | End-to End</w:t>
             </w:r>
           </w:p>
           <w:p>
@@ -3243,21 +3278,7 @@
           <w:sz w:val="21"/>
           <w:szCs w:val="21"/>
         </w:rPr>
-        <w:t>NOT</w:t>
-      </w:r>
-      <w:r>
-        <w:rPr>
-          <w:sz w:val="21"/>
-          <w:szCs w:val="21"/>
-        </w:rPr>
-        <w:t xml:space="preserve"> </w:t>
-      </w:r>
-      <w:r>
-        <w:rPr>
-          <w:sz w:val="21"/>
-          <w:szCs w:val="21"/>
-        </w:rPr>
-        <w:t xml:space="preserve">WITHSTANDING ANYTHING TO THE CONTRARY, EXCEPT FOR BODILY INJURY OF A </w:t>
+        <w:t xml:space="preserve">NOT WITHSTANDING ANYTHING TO THE CONTRARY, EXCEPT FOR BODILY INJURY OF A </w:t>
       </w:r>
     </w:p>
     <w:p>
@@ -7725,7 +7746,6 @@
   <w:style w:type="character" w:default="1" w:styleId="DefaultParagraphFont">
     <w:name w:val="Default Paragraph Font"/>
     <w:uiPriority w:val="1"/>
-    <w:semiHidden/>
     <w:unhideWhenUsed/>
   </w:style>
   <w:style w:type="table" w:default="1" w:styleId="TableNormal">

</xml_diff>

<commit_message>
added numbering in the multicombination template
</commit_message>
<xml_diff>
--- a/backend-templates/MultiCombinations.docx
+++ b/backend-templates/MultiCombinations.docx
@@ -326,23 +326,13 @@
                 <w:szCs w:val="21"/>
               </w:rPr>
             </w:pPr>
-            <w:proofErr w:type="gramStart"/>
             <w:r>
               <w:rPr>
                 <w:b/>
                 <w:sz w:val="21"/>
                 <w:szCs w:val="21"/>
               </w:rPr>
-              <w:t>Price(</w:t>
-            </w:r>
-            <w:proofErr w:type="gramEnd"/>
-            <w:r>
-              <w:rPr>
-                <w:b/>
-                <w:sz w:val="21"/>
-                <w:szCs w:val="21"/>
-              </w:rPr>
-              <w:t>USD)</w:t>
+              <w:t>Price(USD)</w:t>
             </w:r>
           </w:p>
         </w:tc>
@@ -1277,7 +1267,6 @@
               <w:t>discount_percent</w:t>
             </w:r>
             <w:proofErr w:type="spellEnd"/>
-            <w:proofErr w:type="gramStart"/>
             <w:r>
               <w:rPr>
                 <w:b/>
@@ -1286,7 +1275,6 @@
               </w:rPr>
               <w:t>}}%</w:t>
             </w:r>
-            <w:proofErr w:type="gramEnd"/>
             <w:r>
               <w:rPr>
                 <w:bCs/>
@@ -1619,25 +1607,7 @@
           <w:sz w:val="21"/>
           <w:szCs w:val="21"/>
         </w:rPr>
-        <w:t>{{#exhibits</w:t>
-      </w:r>
-      <w:proofErr w:type="gramStart"/>
-      <w:r>
-        <w:rPr>
-          <w:b/>
-          <w:sz w:val="21"/>
-          <w:szCs w:val="21"/>
-        </w:rPr>
-        <w:t>}}Overage</w:t>
-      </w:r>
-      <w:proofErr w:type="gramEnd"/>
-      <w:r>
-        <w:rPr>
-          <w:b/>
-          <w:sz w:val="21"/>
-          <w:szCs w:val="21"/>
-        </w:rPr>
-        <w:t xml:space="preserve"> Charges for {{</w:t>
+        <w:t>{{#exhibits}}Overage Charges for {{</w:t>
       </w:r>
       <w:proofErr w:type="spellStart"/>
       <w:r>
@@ -2104,13 +2074,8 @@
             <w:pPr>
               <w:pStyle w:val="PDParagraphDefault"/>
             </w:pPr>
-            <w:proofErr w:type="gramStart"/>
             <w:r>
-              <w:t>By :</w:t>
-            </w:r>
-            <w:proofErr w:type="gramEnd"/>
-            <w:r>
-              <w:t xml:space="preserve">     _________________________________</w:t>
+              <w:t>By :     _________________________________</w:t>
             </w:r>
           </w:p>
           <w:p>
@@ -2135,13 +2100,8 @@
             <w:pPr>
               <w:pStyle w:val="PDParagraphDefault"/>
             </w:pPr>
-            <w:proofErr w:type="gramStart"/>
             <w:r>
-              <w:t>Title :</w:t>
-            </w:r>
-            <w:proofErr w:type="gramEnd"/>
-            <w:r>
-              <w:t xml:space="preserve">   _________________________________</w:t>
+              <w:t>Title :   _________________________________</w:t>
             </w:r>
           </w:p>
           <w:p>
@@ -2153,13 +2113,8 @@
             <w:pPr>
               <w:pStyle w:val="PDParagraphDefault"/>
             </w:pPr>
-            <w:proofErr w:type="gramStart"/>
             <w:r>
-              <w:t>Date :</w:t>
-            </w:r>
-            <w:proofErr w:type="gramEnd"/>
-            <w:r>
-              <w:t xml:space="preserve">  _________________________________</w:t>
+              <w:t>Date :  _________________________________</w:t>
             </w:r>
           </w:p>
         </w:tc>
@@ -2239,13 +2194,8 @@
             <w:pPr>
               <w:pStyle w:val="PDParagraphDefault"/>
             </w:pPr>
-            <w:proofErr w:type="gramStart"/>
             <w:r>
-              <w:t>By :</w:t>
-            </w:r>
-            <w:proofErr w:type="gramEnd"/>
-            <w:r>
-              <w:t xml:space="preserve">     _________________________________</w:t>
+              <w:t>By :     _________________________________</w:t>
             </w:r>
           </w:p>
           <w:p>
@@ -2270,13 +2220,8 @@
             <w:pPr>
               <w:pStyle w:val="PDParagraphDefault"/>
             </w:pPr>
-            <w:proofErr w:type="gramStart"/>
             <w:r>
-              <w:t>Title :</w:t>
-            </w:r>
-            <w:proofErr w:type="gramEnd"/>
-            <w:r>
-              <w:t xml:space="preserve">   _________________________________</w:t>
+              <w:t>Title :   _________________________________</w:t>
             </w:r>
           </w:p>
           <w:p>
@@ -2288,13 +2233,8 @@
             <w:pPr>
               <w:pStyle w:val="PDParagraphDefault"/>
             </w:pPr>
-            <w:proofErr w:type="gramStart"/>
             <w:r>
-              <w:t>Date :</w:t>
-            </w:r>
-            <w:proofErr w:type="gramEnd"/>
-            <w:r>
-              <w:t xml:space="preserve">  _________________________________</w:t>
+              <w:t>Date :  _________________________________</w:t>
             </w:r>
           </w:p>
         </w:tc>
@@ -2543,23 +2483,7 @@
           <w:szCs w:val="21"/>
         </w:rPr>
         <w:lastRenderedPageBreak/>
-        <w:t xml:space="preserve">charges and Fees at the end of the Initial Service Term or then-current renewal term, upon thirty (30) days prior notice to Customer (which may be sent by email). If Customer believes that Company has billed Customer incorrectly, Customer must contact Company no later than 60 days after the closing date on the first billing statement in which the error or problem appeared, </w:t>
-      </w:r>
-      <w:proofErr w:type="gramStart"/>
-      <w:r>
-        <w:rPr>
-          <w:sz w:val="21"/>
-          <w:szCs w:val="21"/>
-        </w:rPr>
-        <w:t>in order to</w:t>
-      </w:r>
-      <w:proofErr w:type="gramEnd"/>
-      <w:r>
-        <w:rPr>
-          <w:sz w:val="21"/>
-          <w:szCs w:val="21"/>
-        </w:rPr>
-        <w:t xml:space="preserve"> receive an adjustment or credit. Inquiries should be directed to Company’s customer support department. Company represents and warrants that it will perform all Services in a professional and workmanlike manner in accordance with generally accepted industry standards, practices, and principles applicable to such Services and shall be responsible for the professional quality, accuracy and completeness required under this agreement.  Company may choose to bill through an invoice, in which case, full payment for invoices issued in any given month must be received by Company thirty (30) days after the mailing date of the invoice. Unpaid amounts are subject to a finance charge of 1.5% per month on any outstanding balance, or the maximum permitted by law, whichever is lower, plus all expenses of collection and may result in immediate termination of Service. Customer shall be responsible for all taxes associated with Services other than U.S. taxes based on Company’s net income.</w:t>
+        <w:t>charges and Fees at the end of the Initial Service Term or then-current renewal term, upon thirty (30) days prior notice to Customer (which may be sent by email). If Customer believes that Company has billed Customer incorrectly, Customer must contact Company no later than 60 days after the closing date on the first billing statement in which the error or problem appeared, in order to receive an adjustment or credit. Inquiries should be directed to Company’s customer support department. Company represents and warrants that it will perform all Services in a professional and workmanlike manner in accordance with generally accepted industry standards, practices, and principles applicable to such Services and shall be responsible for the professional quality, accuracy and completeness required under this agreement.  Company may choose to bill through an invoice, in which case, full payment for invoices issued in any given month must be received by Company thirty (30) days after the mailing date of the invoice. Unpaid amounts are subject to a finance charge of 1.5% per month on any outstanding balance, or the maximum permitted by law, whichever is lower, plus all expenses of collection and may result in immediate termination of Service. Customer shall be responsible for all taxes associated with Services other than U.S. taxes based on Company’s net income.</w:t>
       </w:r>
     </w:p>
     <w:p>
@@ -2958,11 +2882,12 @@
     </w:p>
     <w:p>
       <w:pPr>
+        <w:pStyle w:val="ListParagraph"/>
         <w:numPr>
           <w:ilvl w:val="0"/>
-          <w:numId w:val="2"/>
+          <w:numId w:val="21"/>
         </w:numPr>
-        <w:ind w:hanging="280"/>
+        <w:jc w:val="left"/>
         <w:rPr>
           <w:sz w:val="21"/>
           <w:szCs w:val="21"/>
@@ -2979,28 +2904,22 @@
     <w:p>
       <w:pPr>
         <w:spacing w:after="2" w:line="259" w:lineRule="auto"/>
-        <w:ind w:left="0" w:firstLine="0"/>
+        <w:ind w:left="0" w:firstLine="60"/>
         <w:jc w:val="left"/>
         <w:rPr>
           <w:sz w:val="21"/>
           <w:szCs w:val="21"/>
         </w:rPr>
       </w:pPr>
-      <w:r>
-        <w:rPr>
-          <w:sz w:val="21"/>
-          <w:szCs w:val="21"/>
-        </w:rPr>
-        <w:t xml:space="preserve"> </w:t>
-      </w:r>
     </w:p>
     <w:p>
       <w:pPr>
+        <w:pStyle w:val="ListParagraph"/>
         <w:numPr>
           <w:ilvl w:val="0"/>
-          <w:numId w:val="2"/>
+          <w:numId w:val="21"/>
         </w:numPr>
-        <w:ind w:hanging="280"/>
+        <w:jc w:val="left"/>
         <w:rPr>
           <w:sz w:val="21"/>
           <w:szCs w:val="21"/>
@@ -3017,28 +2936,21 @@
     <w:p>
       <w:pPr>
         <w:spacing w:after="2" w:line="259" w:lineRule="auto"/>
-        <w:ind w:left="0" w:firstLine="0"/>
+        <w:ind w:left="0" w:firstLine="60"/>
         <w:jc w:val="left"/>
         <w:rPr>
           <w:sz w:val="21"/>
           <w:szCs w:val="21"/>
         </w:rPr>
       </w:pPr>
-      <w:r>
-        <w:rPr>
-          <w:sz w:val="21"/>
-          <w:szCs w:val="21"/>
-        </w:rPr>
-        <w:t xml:space="preserve"> </w:t>
-      </w:r>
     </w:p>
     <w:p>
       <w:pPr>
         <w:numPr>
           <w:ilvl w:val="0"/>
-          <w:numId w:val="2"/>
+          <w:numId w:val="21"/>
         </w:numPr>
-        <w:ind w:hanging="280"/>
+        <w:jc w:val="left"/>
         <w:rPr>
           <w:sz w:val="21"/>
           <w:szCs w:val="21"/>
@@ -3055,28 +2967,21 @@
     <w:p>
       <w:pPr>
         <w:spacing w:after="2" w:line="259" w:lineRule="auto"/>
-        <w:ind w:left="0" w:firstLine="0"/>
+        <w:ind w:left="0" w:firstLine="60"/>
         <w:jc w:val="left"/>
         <w:rPr>
           <w:sz w:val="21"/>
           <w:szCs w:val="21"/>
         </w:rPr>
       </w:pPr>
-      <w:r>
-        <w:rPr>
-          <w:sz w:val="21"/>
-          <w:szCs w:val="21"/>
-        </w:rPr>
-        <w:t xml:space="preserve"> </w:t>
-      </w:r>
     </w:p>
     <w:p>
       <w:pPr>
         <w:numPr>
           <w:ilvl w:val="0"/>
-          <w:numId w:val="2"/>
+          <w:numId w:val="21"/>
         </w:numPr>
-        <w:ind w:hanging="280"/>
+        <w:jc w:val="left"/>
         <w:rPr>
           <w:sz w:val="21"/>
           <w:szCs w:val="21"/>
@@ -3093,66 +2998,49 @@
     <w:p>
       <w:pPr>
         <w:spacing w:after="2" w:line="259" w:lineRule="auto"/>
-        <w:ind w:left="0" w:firstLine="0"/>
+        <w:ind w:left="0" w:firstLine="72"/>
         <w:jc w:val="left"/>
       </w:pPr>
-      <w:r>
-        <w:t xml:space="preserve"> </w:t>
-      </w:r>
     </w:p>
     <w:p>
       <w:pPr>
         <w:numPr>
           <w:ilvl w:val="0"/>
-          <w:numId w:val="2"/>
+          <w:numId w:val="21"/>
         </w:numPr>
-        <w:ind w:hanging="280"/>
-        <w:rPr>
-          <w:sz w:val="21"/>
-          <w:szCs w:val="21"/>
-        </w:rPr>
-      </w:pPr>
-      <w:r>
-        <w:rPr>
-          <w:sz w:val="21"/>
-          <w:szCs w:val="21"/>
-        </w:rPr>
-        <w:t xml:space="preserve">Where Customer continues allegedly infringing activity after being notified thereof or after being informed of modifications that would have avoided the alleged infringement, or (vi) where Customer’s use of the Service is not </w:t>
-      </w:r>
+        <w:jc w:val="left"/>
+        <w:rPr>
+          <w:sz w:val="21"/>
+          <w:szCs w:val="21"/>
+        </w:rPr>
+      </w:pPr>
       <w:r>
         <w:rPr>
           <w:sz w:val="21"/>
           <w:szCs w:val="21"/>
         </w:rPr>
         <w:lastRenderedPageBreak/>
-        <w:t>strictly in accordance with this Agreement. If, due to a claim of infringement, the Services are held by a court of competent jurisdiction to be or are believed by Company to be infringing, Company may, at its option and expense:</w:t>
+        <w:t>Where Customer continues allegedly infringing activity after being notified thereof or after being informed of modifications that would have avoided the alleged infringement, or (vi) where Customer’s use of the Service is not strictly in accordance with this Agreement. If, due to a claim of infringement, the Services are held by a court of competent jurisdiction to be or are believed by Company to be infringing, Company may, at its option and expense:</w:t>
       </w:r>
     </w:p>
     <w:p>
       <w:pPr>
         <w:spacing w:after="2" w:line="259" w:lineRule="auto"/>
-        <w:ind w:left="0" w:firstLine="0"/>
+        <w:ind w:left="0" w:firstLine="60"/>
         <w:jc w:val="left"/>
         <w:rPr>
           <w:sz w:val="21"/>
           <w:szCs w:val="21"/>
         </w:rPr>
       </w:pPr>
-      <w:r>
-        <w:rPr>
-          <w:sz w:val="21"/>
-          <w:szCs w:val="21"/>
-        </w:rPr>
-        <w:t xml:space="preserve"> </w:t>
-      </w:r>
     </w:p>
     <w:p>
       <w:pPr>
         <w:numPr>
           <w:ilvl w:val="0"/>
-          <w:numId w:val="3"/>
+          <w:numId w:val="23"/>
         </w:numPr>
-        <w:ind w:hanging="293"/>
+        <w:jc w:val="left"/>
         <w:rPr>
           <w:sz w:val="21"/>
           <w:szCs w:val="21"/>
@@ -3169,28 +3057,21 @@
     <w:p>
       <w:pPr>
         <w:spacing w:after="2" w:line="259" w:lineRule="auto"/>
-        <w:ind w:left="0" w:firstLine="0"/>
+        <w:ind w:left="0" w:firstLine="60"/>
         <w:jc w:val="left"/>
         <w:rPr>
           <w:sz w:val="21"/>
           <w:szCs w:val="21"/>
         </w:rPr>
       </w:pPr>
-      <w:r>
-        <w:rPr>
-          <w:sz w:val="21"/>
-          <w:szCs w:val="21"/>
-        </w:rPr>
-        <w:t xml:space="preserve"> </w:t>
-      </w:r>
     </w:p>
     <w:p>
       <w:pPr>
         <w:numPr>
           <w:ilvl w:val="0"/>
-          <w:numId w:val="3"/>
+          <w:numId w:val="23"/>
         </w:numPr>
-        <w:ind w:hanging="293"/>
+        <w:jc w:val="left"/>
         <w:rPr>
           <w:sz w:val="21"/>
           <w:szCs w:val="21"/>
@@ -3207,29 +3088,22 @@
     <w:p>
       <w:pPr>
         <w:spacing w:after="2" w:line="259" w:lineRule="auto"/>
-        <w:ind w:left="0" w:firstLine="0"/>
+        <w:ind w:left="0" w:firstLine="60"/>
         <w:jc w:val="left"/>
         <w:rPr>
           <w:sz w:val="21"/>
           <w:szCs w:val="21"/>
         </w:rPr>
       </w:pPr>
-      <w:r>
-        <w:rPr>
-          <w:sz w:val="21"/>
-          <w:szCs w:val="21"/>
-        </w:rPr>
-        <w:t xml:space="preserve"> </w:t>
-      </w:r>
     </w:p>
     <w:p>
       <w:pPr>
         <w:numPr>
           <w:ilvl w:val="0"/>
-          <w:numId w:val="3"/>
+          <w:numId w:val="23"/>
         </w:numPr>
         <w:spacing w:after="451"/>
-        <w:ind w:hanging="293"/>
+        <w:jc w:val="left"/>
         <w:rPr>
           <w:sz w:val="21"/>
           <w:szCs w:val="21"/>
@@ -3381,15 +3255,26 @@
     </w:p>
     <w:p>
       <w:pPr>
-        <w:numPr>
-          <w:ilvl w:val="0"/>
-          <w:numId w:val="4"/>
-        </w:numPr>
-        <w:rPr>
-          <w:sz w:val="21"/>
-          <w:szCs w:val="21"/>
-        </w:rPr>
-      </w:pPr>
+        <w:ind w:firstLine="0"/>
+        <w:rPr>
+          <w:sz w:val="21"/>
+          <w:szCs w:val="21"/>
+        </w:rPr>
+      </w:pPr>
+      <w:r>
+        <w:rPr>
+          <w:sz w:val="21"/>
+          <w:szCs w:val="21"/>
+        </w:rPr>
+        <w:t>(</w:t>
+      </w:r>
+      <w:r>
+        <w:rPr>
+          <w:sz w:val="21"/>
+          <w:szCs w:val="21"/>
+        </w:rPr>
+        <w:t xml:space="preserve">A) </w:t>
+      </w:r>
       <w:r>
         <w:rPr>
           <w:sz w:val="21"/>
@@ -3418,15 +3303,18 @@
     </w:p>
     <w:p>
       <w:pPr>
-        <w:numPr>
-          <w:ilvl w:val="0"/>
-          <w:numId w:val="4"/>
-        </w:numPr>
-        <w:rPr>
-          <w:sz w:val="21"/>
-          <w:szCs w:val="21"/>
-        </w:rPr>
-      </w:pPr>
+        <w:rPr>
+          <w:sz w:val="21"/>
+          <w:szCs w:val="21"/>
+        </w:rPr>
+      </w:pPr>
+      <w:r>
+        <w:rPr>
+          <w:sz w:val="21"/>
+          <w:szCs w:val="21"/>
+        </w:rPr>
+        <w:t xml:space="preserve">(B) </w:t>
+      </w:r>
       <w:r>
         <w:rPr>
           <w:sz w:val="21"/>
@@ -3434,37 +3322,12 @@
         </w:rPr>
         <w:t xml:space="preserve">CUSTOMER DATA WILL BE PURGED PERMANENTLY FROM CLOUDFUZE EQUIPMENT AFTER 30 DAYS OF THE COMPLETION OF ‘ONE-TIME’ AND/OR ‘DELTA’ MIGRATION. AFTER </w:t>
       </w:r>
-    </w:p>
-    <w:p>
-      <w:pPr>
-        <w:ind w:left="-5"/>
-        <w:rPr>
-          <w:sz w:val="21"/>
-          <w:szCs w:val="21"/>
-        </w:rPr>
-      </w:pPr>
-      <w:r>
-        <w:rPr>
-          <w:sz w:val="21"/>
-          <w:szCs w:val="21"/>
-        </w:rPr>
-        <w:t xml:space="preserve">THE PURGE, CLOUDFUZE, INC WILL NO LONGER BE RESPONSIBLE FOR ANY MORE </w:t>
-      </w:r>
-    </w:p>
-    <w:p>
-      <w:pPr>
-        <w:ind w:left="-5"/>
-        <w:rPr>
-          <w:sz w:val="21"/>
-          <w:szCs w:val="21"/>
-        </w:rPr>
-      </w:pPr>
-      <w:r>
-        <w:rPr>
-          <w:sz w:val="21"/>
-          <w:szCs w:val="21"/>
-        </w:rPr>
-        <w:t>MIGRATIONS UNDER THIS SERVICE AGREEMENT AND/OR CUSTOMER DATA RETRIEVAL</w:t>
+      <w:r>
+        <w:rPr>
+          <w:sz w:val="21"/>
+          <w:szCs w:val="21"/>
+        </w:rPr>
+        <w:t>THE PURGE, CLOUDFUZE, INC WILL NO LONGER BE RESPONSIBLE FOR ANY MORE MIGRATIONS UNDER THIS SERVICE AGREEMENT AND/OR CUSTOMER DATA RETRIEVAL</w:t>
       </w:r>
     </w:p>
     <w:p>
@@ -3487,10 +3350,6 @@
     </w:p>
     <w:p>
       <w:pPr>
-        <w:numPr>
-          <w:ilvl w:val="0"/>
-          <w:numId w:val="4"/>
-        </w:numPr>
         <w:spacing w:after="0" w:line="261" w:lineRule="auto"/>
         <w:jc w:val="left"/>
         <w:rPr>
@@ -3503,7 +3362,15 @@
           <w:sz w:val="21"/>
           <w:szCs w:val="21"/>
         </w:rPr>
-        <w:t>FOR ANY DELAY, FAILURE, OR INABILITY TO PERFORM RESULTING FROM CHANGES, MODIFICATIONS, OR DISCONTINUATION OF THIRD-PARTY PROVIDER APIs OR FEATURES, WHICH ARE OUTSIDE COMPANY’S CONTROL.</w:t>
+        <w:lastRenderedPageBreak/>
+        <w:t>(C)</w:t>
+      </w:r>
+      <w:r>
+        <w:rPr>
+          <w:sz w:val="21"/>
+          <w:szCs w:val="21"/>
+        </w:rPr>
+        <w:t xml:space="preserve"> FOR ANY DELAY, FAILURE, OR INABILITY TO PERFORM RESULTING FROM CHANGES, MODIFICATIONS, OR DISCONTINUATION OF THIRD-PARTY PROVIDER APIs OR FEATURES, WHICH ARE OUTSIDE COMPANY’S CONTROL.</w:t>
       </w:r>
     </w:p>
     <w:p>
@@ -3561,7 +3428,6 @@
           <w:sz w:val="21"/>
           <w:szCs w:val="21"/>
         </w:rPr>
-        <w:lastRenderedPageBreak/>
         <w:t>FOR ANY MATTER BEYOND COMPANY’S REASONABLE CONTROL. OR(F) FOR ANY AMOUNTS THAT, TOGETHER WITH</w:t>
       </w:r>
     </w:p>
@@ -3597,7 +3463,21 @@
           <w:sz w:val="21"/>
           <w:szCs w:val="21"/>
         </w:rPr>
-        <w:t xml:space="preserve">(G) AMOUNTS ASSOCIATED WITH ALL OTHER CLAIMS, EXCEED THE FEES PAID BY </w:t>
+        <w:t xml:space="preserve">(G) </w:t>
+      </w:r>
+      <w:r>
+        <w:rPr>
+          <w:sz w:val="21"/>
+          <w:szCs w:val="21"/>
+        </w:rPr>
+        <w:t xml:space="preserve"> </w:t>
+      </w:r>
+      <w:r>
+        <w:rPr>
+          <w:sz w:val="21"/>
+          <w:szCs w:val="21"/>
+        </w:rPr>
+        <w:t xml:space="preserve">AMOUNTS ASSOCIATED WITH ALL OTHER CLAIMS, EXCEED THE FEES PAID BY </w:t>
       </w:r>
       <w:r>
         <w:rPr>
@@ -3674,23 +3554,7 @@
           <w:sz w:val="21"/>
           <w:szCs w:val="21"/>
         </w:rPr>
-        <w:t xml:space="preserve">If any provision of this Agreement is found to be unenforceable or invalid, that provision will be limited or eliminated to the minimum extent necessary so that this Agreement will otherwise remain in full force and effect and enforceable. This Agreement is not assignable, transferable or sub-licensable by Customer except with Company’s prior written consent. Company may transfer and assign any of its rights and obligations under this Agreement without consent. This Agreement is the complete and exclusive statement of the mutual understanding of the parties and supersedes and cancels all previous written and oral agreements, communications and other understandings relating to the subject matter of this Agreement, and that all waivers and modifications must be in a writing signed by both parties, except as otherwise provided herein. No agency, partnership, joint venture, or employment is created </w:t>
-      </w:r>
-      <w:proofErr w:type="gramStart"/>
-      <w:r>
-        <w:rPr>
-          <w:sz w:val="21"/>
-          <w:szCs w:val="21"/>
-        </w:rPr>
-        <w:t>as a result of</w:t>
-      </w:r>
-      <w:proofErr w:type="gramEnd"/>
-      <w:r>
-        <w:rPr>
-          <w:sz w:val="21"/>
-          <w:szCs w:val="21"/>
-        </w:rPr>
-        <w:t xml:space="preserve"> this Agreement and Customer does not have any authority of any kind to bind Company in any respect whatsoever. In any action or proceeding to enforce rights under this Agreement, the prevailing party will be entitled to recover costs and attorneys’ fees. All notices under this Agreement will be in writing and will be deemed to have been duly given when received, if personally delivered; when receipt is electronically confirmed, if transmitted by facsimile or e-mail; the day after it is sent, if sent for next day delivery by recognized overnight delivery service; and upon receipt, if sent by certified or registered mail, return receipt requested. This Agreement shall be governed by the laws of the State of North Carolina without regard to its conflict of law's provisions. The parties shall work together in good faith to issue a least one mutually agreed upon press release within 90 days of the Effective Date, and Customer otherwise agrees to reasonably cooperate with Company to serve as a reference account up.</w:t>
+        <w:t>If any provision of this Agreement is found to be unenforceable or invalid, that provision will be limited or eliminated to the minimum extent necessary so that this Agreement will otherwise remain in full force and effect and enforceable. This Agreement is not assignable, transferable or sub-licensable by Customer except with Company’s prior written consent. Company may transfer and assign any of its rights and obligations under this Agreement without consent. This Agreement is the complete and exclusive statement of the mutual understanding of the parties and supersedes and cancels all previous written and oral agreements, communications and other understandings relating to the subject matter of this Agreement, and that all waivers and modifications must be in a writing signed by both parties, except as otherwise provided herein. No agency, partnership, joint venture, or employment is created as a result of this Agreement and Customer does not have any authority of any kind to bind Company in any respect whatsoever. In any action or proceeding to enforce rights under this Agreement, the prevailing party will be entitled to recover costs and attorneys’ fees. All notices under this Agreement will be in writing and will be deemed to have been duly given when received, if personally delivered; when receipt is electronically confirmed, if transmitted by facsimile or e-mail; the day after it is sent, if sent for next day delivery by recognized overnight delivery service; and upon receipt, if sent by certified or registered mail, return receipt requested. This Agreement shall be governed by the laws of the State of North Carolina without regard to its conflict of law's provisions. The parties shall work together in good faith to issue a least one mutually agreed upon press release within 90 days of the Effective Date, and Customer otherwise agrees to reasonably cooperate with Company to serve as a reference account up.</w:t>
       </w:r>
     </w:p>
     <w:p>
@@ -3717,12 +3581,12 @@
     <w:p>
       <w:pPr>
         <w:sectPr>
-          <w:headerReference w:type="even" r:id="rId7"/>
-          <w:headerReference w:type="default" r:id="rId8"/>
-          <w:footerReference w:type="even" r:id="rId9"/>
-          <w:footerReference w:type="default" r:id="rId10"/>
-          <w:headerReference w:type="first" r:id="rId11"/>
-          <w:footerReference w:type="first" r:id="rId12"/>
+          <w:headerReference w:type="even" r:id="rId8"/>
+          <w:headerReference w:type="default" r:id="rId9"/>
+          <w:footerReference w:type="even" r:id="rId10"/>
+          <w:footerReference w:type="default" r:id="rId11"/>
+          <w:headerReference w:type="first" r:id="rId12"/>
+          <w:footerReference w:type="first" r:id="rId13"/>
           <w:pgSz w:w="12240" w:h="15840"/>
           <w:pgMar w:top="2694" w:right="750" w:bottom="2490" w:left="750" w:header="825" w:footer="720" w:gutter="0"/>
           <w:cols w:space="720"/>
@@ -3740,12 +3604,12 @@
       </w:pPr>
     </w:p>
     <w:sectPr>
-      <w:headerReference w:type="even" r:id="rId13"/>
-      <w:headerReference w:type="default" r:id="rId14"/>
-      <w:footerReference w:type="even" r:id="rId15"/>
-      <w:footerReference w:type="default" r:id="rId16"/>
-      <w:headerReference w:type="first" r:id="rId17"/>
-      <w:footerReference w:type="first" r:id="rId18"/>
+      <w:headerReference w:type="even" r:id="rId14"/>
+      <w:headerReference w:type="default" r:id="rId15"/>
+      <w:footerReference w:type="even" r:id="rId16"/>
+      <w:footerReference w:type="default" r:id="rId17"/>
+      <w:headerReference w:type="first" r:id="rId18"/>
+      <w:footerReference w:type="first" r:id="rId19"/>
       <w:pgSz w:w="12240" w:h="15840"/>
       <w:pgMar w:top="1440" w:right="1440" w:bottom="1440" w:left="1440" w:header="720" w:footer="720" w:gutter="0"/>
       <w:cols w:space="720"/>
@@ -5412,6 +5276,184 @@
     </w:lvl>
   </w:abstractNum>
   <w:abstractNum w:abstractNumId="3" w15:restartNumberingAfterBreak="0">
+    <w:nsid w:val="146E0407"/>
+    <w:multiLevelType w:val="hybridMultilevel"/>
+    <w:tmpl w:val="1C26603E"/>
+    <w:lvl w:ilvl="0" w:tplc="40090011">
+      <w:start w:val="1"/>
+      <w:numFmt w:val="decimal"/>
+      <w:lvlText w:val="%1)"/>
+      <w:lvlJc w:val="left"/>
+      <w:pPr>
+        <w:ind w:left="1000" w:hanging="360"/>
+      </w:pPr>
+      <w:rPr>
+        <w:rFonts w:hint="default"/>
+      </w:rPr>
+    </w:lvl>
+    <w:lvl w:ilvl="1" w:tplc="FFFFFFFF" w:tentative="1">
+      <w:start w:val="1"/>
+      <w:numFmt w:val="lowerLetter"/>
+      <w:lvlText w:val="%2."/>
+      <w:lvlJc w:val="left"/>
+      <w:pPr>
+        <w:ind w:left="1720" w:hanging="360"/>
+      </w:pPr>
+    </w:lvl>
+    <w:lvl w:ilvl="2" w:tplc="FFFFFFFF" w:tentative="1">
+      <w:start w:val="1"/>
+      <w:numFmt w:val="lowerRoman"/>
+      <w:lvlText w:val="%3."/>
+      <w:lvlJc w:val="right"/>
+      <w:pPr>
+        <w:ind w:left="2440" w:hanging="180"/>
+      </w:pPr>
+    </w:lvl>
+    <w:lvl w:ilvl="3" w:tplc="FFFFFFFF" w:tentative="1">
+      <w:start w:val="1"/>
+      <w:numFmt w:val="decimal"/>
+      <w:lvlText w:val="%4."/>
+      <w:lvlJc w:val="left"/>
+      <w:pPr>
+        <w:ind w:left="3160" w:hanging="360"/>
+      </w:pPr>
+    </w:lvl>
+    <w:lvl w:ilvl="4" w:tplc="FFFFFFFF" w:tentative="1">
+      <w:start w:val="1"/>
+      <w:numFmt w:val="lowerLetter"/>
+      <w:lvlText w:val="%5."/>
+      <w:lvlJc w:val="left"/>
+      <w:pPr>
+        <w:ind w:left="3880" w:hanging="360"/>
+      </w:pPr>
+    </w:lvl>
+    <w:lvl w:ilvl="5" w:tplc="FFFFFFFF" w:tentative="1">
+      <w:start w:val="1"/>
+      <w:numFmt w:val="lowerRoman"/>
+      <w:lvlText w:val="%6."/>
+      <w:lvlJc w:val="right"/>
+      <w:pPr>
+        <w:ind w:left="4600" w:hanging="180"/>
+      </w:pPr>
+    </w:lvl>
+    <w:lvl w:ilvl="6" w:tplc="FFFFFFFF" w:tentative="1">
+      <w:start w:val="1"/>
+      <w:numFmt w:val="decimal"/>
+      <w:lvlText w:val="%7."/>
+      <w:lvlJc w:val="left"/>
+      <w:pPr>
+        <w:ind w:left="5320" w:hanging="360"/>
+      </w:pPr>
+    </w:lvl>
+    <w:lvl w:ilvl="7" w:tplc="FFFFFFFF" w:tentative="1">
+      <w:start w:val="1"/>
+      <w:numFmt w:val="lowerLetter"/>
+      <w:lvlText w:val="%8."/>
+      <w:lvlJc w:val="left"/>
+      <w:pPr>
+        <w:ind w:left="6040" w:hanging="360"/>
+      </w:pPr>
+    </w:lvl>
+    <w:lvl w:ilvl="8" w:tplc="FFFFFFFF" w:tentative="1">
+      <w:start w:val="1"/>
+      <w:numFmt w:val="lowerRoman"/>
+      <w:lvlText w:val="%9."/>
+      <w:lvlJc w:val="right"/>
+      <w:pPr>
+        <w:ind w:left="6760" w:hanging="180"/>
+      </w:pPr>
+    </w:lvl>
+  </w:abstractNum>
+  <w:abstractNum w:abstractNumId="4" w15:restartNumberingAfterBreak="0">
+    <w:nsid w:val="22C10CCD"/>
+    <w:multiLevelType w:val="hybridMultilevel"/>
+    <w:tmpl w:val="CEA4E688"/>
+    <w:lvl w:ilvl="0" w:tplc="3496BB66">
+      <w:start w:val="2"/>
+      <w:numFmt w:val="upperLetter"/>
+      <w:lvlText w:val="%1)"/>
+      <w:lvlJc w:val="left"/>
+      <w:pPr>
+        <w:ind w:left="370" w:hanging="360"/>
+      </w:pPr>
+      <w:rPr>
+        <w:rFonts w:hint="default"/>
+      </w:rPr>
+    </w:lvl>
+    <w:lvl w:ilvl="1" w:tplc="40090019" w:tentative="1">
+      <w:start w:val="1"/>
+      <w:numFmt w:val="lowerLetter"/>
+      <w:lvlText w:val="%2."/>
+      <w:lvlJc w:val="left"/>
+      <w:pPr>
+        <w:ind w:left="1090" w:hanging="360"/>
+      </w:pPr>
+    </w:lvl>
+    <w:lvl w:ilvl="2" w:tplc="4009001B" w:tentative="1">
+      <w:start w:val="1"/>
+      <w:numFmt w:val="lowerRoman"/>
+      <w:lvlText w:val="%3."/>
+      <w:lvlJc w:val="right"/>
+      <w:pPr>
+        <w:ind w:left="1810" w:hanging="180"/>
+      </w:pPr>
+    </w:lvl>
+    <w:lvl w:ilvl="3" w:tplc="4009000F" w:tentative="1">
+      <w:start w:val="1"/>
+      <w:numFmt w:val="decimal"/>
+      <w:lvlText w:val="%4."/>
+      <w:lvlJc w:val="left"/>
+      <w:pPr>
+        <w:ind w:left="2530" w:hanging="360"/>
+      </w:pPr>
+    </w:lvl>
+    <w:lvl w:ilvl="4" w:tplc="40090019" w:tentative="1">
+      <w:start w:val="1"/>
+      <w:numFmt w:val="lowerLetter"/>
+      <w:lvlText w:val="%5."/>
+      <w:lvlJc w:val="left"/>
+      <w:pPr>
+        <w:ind w:left="3250" w:hanging="360"/>
+      </w:pPr>
+    </w:lvl>
+    <w:lvl w:ilvl="5" w:tplc="4009001B" w:tentative="1">
+      <w:start w:val="1"/>
+      <w:numFmt w:val="lowerRoman"/>
+      <w:lvlText w:val="%6."/>
+      <w:lvlJc w:val="right"/>
+      <w:pPr>
+        <w:ind w:left="3970" w:hanging="180"/>
+      </w:pPr>
+    </w:lvl>
+    <w:lvl w:ilvl="6" w:tplc="4009000F" w:tentative="1">
+      <w:start w:val="1"/>
+      <w:numFmt w:val="decimal"/>
+      <w:lvlText w:val="%7."/>
+      <w:lvlJc w:val="left"/>
+      <w:pPr>
+        <w:ind w:left="4690" w:hanging="360"/>
+      </w:pPr>
+    </w:lvl>
+    <w:lvl w:ilvl="7" w:tplc="40090019" w:tentative="1">
+      <w:start w:val="1"/>
+      <w:numFmt w:val="lowerLetter"/>
+      <w:lvlText w:val="%8."/>
+      <w:lvlJc w:val="left"/>
+      <w:pPr>
+        <w:ind w:left="5410" w:hanging="360"/>
+      </w:pPr>
+    </w:lvl>
+    <w:lvl w:ilvl="8" w:tplc="4009001B" w:tentative="1">
+      <w:start w:val="1"/>
+      <w:numFmt w:val="lowerRoman"/>
+      <w:lvlText w:val="%9."/>
+      <w:lvlJc w:val="right"/>
+      <w:pPr>
+        <w:ind w:left="6130" w:hanging="180"/>
+      </w:pPr>
+    </w:lvl>
+  </w:abstractNum>
+  <w:abstractNum w:abstractNumId="5" w15:restartNumberingAfterBreak="0">
     <w:nsid w:val="27C90621"/>
     <w:multiLevelType w:val="hybridMultilevel"/>
     <w:tmpl w:val="989C2E4A"/>
@@ -5623,7 +5665,96 @@
       </w:rPr>
     </w:lvl>
   </w:abstractNum>
-  <w:abstractNum w:abstractNumId="4" w15:restartNumberingAfterBreak="0">
+  <w:abstractNum w:abstractNumId="6" w15:restartNumberingAfterBreak="0">
+    <w:nsid w:val="29BE1870"/>
+    <w:multiLevelType w:val="hybridMultilevel"/>
+    <w:tmpl w:val="E26E4FAE"/>
+    <w:lvl w:ilvl="0" w:tplc="40090011">
+      <w:start w:val="1"/>
+      <w:numFmt w:val="decimal"/>
+      <w:lvlText w:val="%1)"/>
+      <w:lvlJc w:val="left"/>
+      <w:pPr>
+        <w:ind w:left="1000" w:hanging="360"/>
+      </w:pPr>
+      <w:rPr>
+        <w:rFonts w:hint="default"/>
+      </w:rPr>
+    </w:lvl>
+    <w:lvl w:ilvl="1" w:tplc="FFFFFFFF" w:tentative="1">
+      <w:start w:val="1"/>
+      <w:numFmt w:val="lowerLetter"/>
+      <w:lvlText w:val="%2."/>
+      <w:lvlJc w:val="left"/>
+      <w:pPr>
+        <w:ind w:left="1720" w:hanging="360"/>
+      </w:pPr>
+    </w:lvl>
+    <w:lvl w:ilvl="2" w:tplc="FFFFFFFF" w:tentative="1">
+      <w:start w:val="1"/>
+      <w:numFmt w:val="lowerRoman"/>
+      <w:lvlText w:val="%3."/>
+      <w:lvlJc w:val="right"/>
+      <w:pPr>
+        <w:ind w:left="2440" w:hanging="180"/>
+      </w:pPr>
+    </w:lvl>
+    <w:lvl w:ilvl="3" w:tplc="FFFFFFFF" w:tentative="1">
+      <w:start w:val="1"/>
+      <w:numFmt w:val="decimal"/>
+      <w:lvlText w:val="%4."/>
+      <w:lvlJc w:val="left"/>
+      <w:pPr>
+        <w:ind w:left="3160" w:hanging="360"/>
+      </w:pPr>
+    </w:lvl>
+    <w:lvl w:ilvl="4" w:tplc="FFFFFFFF" w:tentative="1">
+      <w:start w:val="1"/>
+      <w:numFmt w:val="lowerLetter"/>
+      <w:lvlText w:val="%5."/>
+      <w:lvlJc w:val="left"/>
+      <w:pPr>
+        <w:ind w:left="3880" w:hanging="360"/>
+      </w:pPr>
+    </w:lvl>
+    <w:lvl w:ilvl="5" w:tplc="FFFFFFFF" w:tentative="1">
+      <w:start w:val="1"/>
+      <w:numFmt w:val="lowerRoman"/>
+      <w:lvlText w:val="%6."/>
+      <w:lvlJc w:val="right"/>
+      <w:pPr>
+        <w:ind w:left="4600" w:hanging="180"/>
+      </w:pPr>
+    </w:lvl>
+    <w:lvl w:ilvl="6" w:tplc="FFFFFFFF" w:tentative="1">
+      <w:start w:val="1"/>
+      <w:numFmt w:val="decimal"/>
+      <w:lvlText w:val="%7."/>
+      <w:lvlJc w:val="left"/>
+      <w:pPr>
+        <w:ind w:left="5320" w:hanging="360"/>
+      </w:pPr>
+    </w:lvl>
+    <w:lvl w:ilvl="7" w:tplc="FFFFFFFF" w:tentative="1">
+      <w:start w:val="1"/>
+      <w:numFmt w:val="lowerLetter"/>
+      <w:lvlText w:val="%8."/>
+      <w:lvlJc w:val="left"/>
+      <w:pPr>
+        <w:ind w:left="6040" w:hanging="360"/>
+      </w:pPr>
+    </w:lvl>
+    <w:lvl w:ilvl="8" w:tplc="FFFFFFFF" w:tentative="1">
+      <w:start w:val="1"/>
+      <w:numFmt w:val="lowerRoman"/>
+      <w:lvlText w:val="%9."/>
+      <w:lvlJc w:val="right"/>
+      <w:pPr>
+        <w:ind w:left="6760" w:hanging="180"/>
+      </w:pPr>
+    </w:lvl>
+  </w:abstractNum>
+  <w:abstractNum w:abstractNumId="7" w15:restartNumberingAfterBreak="0">
     <w:nsid w:val="30DC1C20"/>
     <w:multiLevelType w:val="multilevel"/>
     <w:tmpl w:val="536247A8"/>
@@ -5772,7 +5903,7 @@
       </w:rPr>
     </w:lvl>
   </w:abstractNum>
-  <w:abstractNum w:abstractNumId="5" w15:restartNumberingAfterBreak="0">
+  <w:abstractNum w:abstractNumId="8" w15:restartNumberingAfterBreak="0">
     <w:nsid w:val="37851BEC"/>
     <w:multiLevelType w:val="multilevel"/>
     <w:tmpl w:val="E7D44FA6"/>
@@ -5921,7 +6052,7 @@
       </w:rPr>
     </w:lvl>
   </w:abstractNum>
-  <w:abstractNum w:abstractNumId="6" w15:restartNumberingAfterBreak="0">
+  <w:abstractNum w:abstractNumId="9" w15:restartNumberingAfterBreak="0">
     <w:nsid w:val="4B250FD6"/>
     <w:multiLevelType w:val="hybridMultilevel"/>
     <w:tmpl w:val="6964A4C4"/>
@@ -6142,7 +6273,7 @@
       </w:rPr>
     </w:lvl>
   </w:abstractNum>
-  <w:abstractNum w:abstractNumId="7" w15:restartNumberingAfterBreak="0">
+  <w:abstractNum w:abstractNumId="10" w15:restartNumberingAfterBreak="0">
     <w:nsid w:val="4C872C39"/>
     <w:multiLevelType w:val="hybridMultilevel"/>
     <w:tmpl w:val="854E81F8"/>
@@ -6255,7 +6386,7 @@
       </w:rPr>
     </w:lvl>
   </w:abstractNum>
-  <w:abstractNum w:abstractNumId="8" w15:restartNumberingAfterBreak="0">
+  <w:abstractNum w:abstractNumId="11" w15:restartNumberingAfterBreak="0">
     <w:nsid w:val="577C73C6"/>
     <w:multiLevelType w:val="hybridMultilevel"/>
     <w:tmpl w:val="6F743D5C"/>
@@ -6467,7 +6598,7 @@
       </w:rPr>
     </w:lvl>
   </w:abstractNum>
-  <w:abstractNum w:abstractNumId="9" w15:restartNumberingAfterBreak="0">
+  <w:abstractNum w:abstractNumId="12" w15:restartNumberingAfterBreak="0">
     <w:nsid w:val="59B665A9"/>
     <w:multiLevelType w:val="hybridMultilevel"/>
     <w:tmpl w:val="B90A47DC"/>
@@ -6679,166 +6810,39 @@
       </w:rPr>
     </w:lvl>
   </w:abstractNum>
-  <w:abstractNum w:abstractNumId="10" w15:restartNumberingAfterBreak="0">
-    <w:nsid w:val="5E97054E"/>
-    <w:multiLevelType w:val="multilevel"/>
-    <w:tmpl w:val="5130F884"/>
-    <w:lvl w:ilvl="0">
-      <w:start w:val="1"/>
-      <w:numFmt w:val="bullet"/>
-      <w:lvlText w:val=""/>
-      <w:lvlJc w:val="left"/>
-      <w:pPr>
-        <w:tabs>
-          <w:tab w:val="num" w:pos="720"/>
-        </w:tabs>
-        <w:ind w:left="720" w:hanging="360"/>
-      </w:pPr>
-      <w:rPr>
-        <w:rFonts w:ascii="Symbol" w:hAnsi="Symbol" w:hint="default"/>
-        <w:sz w:val="20"/>
-      </w:rPr>
-    </w:lvl>
-    <w:lvl w:ilvl="1" w:tentative="1">
-      <w:start w:val="1"/>
-      <w:numFmt w:val="bullet"/>
-      <w:lvlText w:val="o"/>
-      <w:lvlJc w:val="left"/>
-      <w:pPr>
-        <w:tabs>
-          <w:tab w:val="num" w:pos="1440"/>
-        </w:tabs>
-        <w:ind w:left="1440" w:hanging="360"/>
-      </w:pPr>
-      <w:rPr>
-        <w:rFonts w:ascii="Courier New" w:hAnsi="Courier New" w:hint="default"/>
-        <w:sz w:val="20"/>
-      </w:rPr>
-    </w:lvl>
-    <w:lvl w:ilvl="2" w:tentative="1">
-      <w:start w:val="1"/>
-      <w:numFmt w:val="bullet"/>
-      <w:lvlText w:val=""/>
-      <w:lvlJc w:val="left"/>
-      <w:pPr>
-        <w:tabs>
-          <w:tab w:val="num" w:pos="2160"/>
-        </w:tabs>
-        <w:ind w:left="2160" w:hanging="360"/>
-      </w:pPr>
-      <w:rPr>
-        <w:rFonts w:ascii="Wingdings" w:hAnsi="Wingdings" w:hint="default"/>
-        <w:sz w:val="20"/>
-      </w:rPr>
-    </w:lvl>
-    <w:lvl w:ilvl="3" w:tentative="1">
-      <w:start w:val="1"/>
-      <w:numFmt w:val="bullet"/>
-      <w:lvlText w:val=""/>
-      <w:lvlJc w:val="left"/>
-      <w:pPr>
-        <w:tabs>
-          <w:tab w:val="num" w:pos="2880"/>
-        </w:tabs>
-        <w:ind w:left="2880" w:hanging="360"/>
-      </w:pPr>
-      <w:rPr>
-        <w:rFonts w:ascii="Wingdings" w:hAnsi="Wingdings" w:hint="default"/>
-        <w:sz w:val="20"/>
-      </w:rPr>
-    </w:lvl>
-    <w:lvl w:ilvl="4" w:tentative="1">
-      <w:start w:val="1"/>
-      <w:numFmt w:val="bullet"/>
-      <w:lvlText w:val=""/>
-      <w:lvlJc w:val="left"/>
-      <w:pPr>
-        <w:tabs>
-          <w:tab w:val="num" w:pos="3600"/>
-        </w:tabs>
-        <w:ind w:left="3600" w:hanging="360"/>
-      </w:pPr>
-      <w:rPr>
-        <w:rFonts w:ascii="Wingdings" w:hAnsi="Wingdings" w:hint="default"/>
-        <w:sz w:val="20"/>
-      </w:rPr>
-    </w:lvl>
-    <w:lvl w:ilvl="5" w:tentative="1">
-      <w:start w:val="1"/>
-      <w:numFmt w:val="bullet"/>
-      <w:lvlText w:val=""/>
-      <w:lvlJc w:val="left"/>
-      <w:pPr>
-        <w:tabs>
-          <w:tab w:val="num" w:pos="4320"/>
-        </w:tabs>
-        <w:ind w:left="4320" w:hanging="360"/>
-      </w:pPr>
-      <w:rPr>
-        <w:rFonts w:ascii="Wingdings" w:hAnsi="Wingdings" w:hint="default"/>
-        <w:sz w:val="20"/>
-      </w:rPr>
-    </w:lvl>
-    <w:lvl w:ilvl="6" w:tentative="1">
-      <w:start w:val="1"/>
-      <w:numFmt w:val="bullet"/>
-      <w:lvlText w:val=""/>
-      <w:lvlJc w:val="left"/>
-      <w:pPr>
-        <w:tabs>
-          <w:tab w:val="num" w:pos="5040"/>
-        </w:tabs>
-        <w:ind w:left="5040" w:hanging="360"/>
-      </w:pPr>
-      <w:rPr>
-        <w:rFonts w:ascii="Wingdings" w:hAnsi="Wingdings" w:hint="default"/>
-        <w:sz w:val="20"/>
-      </w:rPr>
-    </w:lvl>
-    <w:lvl w:ilvl="7" w:tentative="1">
-      <w:start w:val="1"/>
-      <w:numFmt w:val="bullet"/>
-      <w:lvlText w:val=""/>
-      <w:lvlJc w:val="left"/>
-      <w:pPr>
-        <w:tabs>
-          <w:tab w:val="num" w:pos="5760"/>
-        </w:tabs>
-        <w:ind w:left="5760" w:hanging="360"/>
-      </w:pPr>
-      <w:rPr>
-        <w:rFonts w:ascii="Wingdings" w:hAnsi="Wingdings" w:hint="default"/>
-        <w:sz w:val="20"/>
-      </w:rPr>
-    </w:lvl>
-    <w:lvl w:ilvl="8" w:tentative="1">
-      <w:start w:val="1"/>
-      <w:numFmt w:val="bullet"/>
-      <w:lvlText w:val=""/>
-      <w:lvlJc w:val="left"/>
-      <w:pPr>
-        <w:tabs>
-          <w:tab w:val="num" w:pos="6480"/>
-        </w:tabs>
-        <w:ind w:left="6480" w:hanging="360"/>
-      </w:pPr>
-      <w:rPr>
-        <w:rFonts w:ascii="Wingdings" w:hAnsi="Wingdings" w:hint="default"/>
-        <w:sz w:val="20"/>
-      </w:rPr>
-    </w:lvl>
-  </w:abstractNum>
-  <w:abstractNum w:abstractNumId="11" w15:restartNumberingAfterBreak="0">
-    <w:nsid w:val="5F306F66"/>
+  <w:abstractNum w:abstractNumId="13" w15:restartNumberingAfterBreak="0">
+    <w:nsid w:val="5CA44A2E"/>
     <w:multiLevelType w:val="hybridMultilevel"/>
-    <w:tmpl w:val="C29A3B9E"/>
-    <w:lvl w:ilvl="0" w:tplc="937EBBAA">
-      <w:start w:val="4"/>
+    <w:tmpl w:val="38440E3C"/>
+    <w:lvl w:ilvl="0" w:tplc="40090015">
+      <w:start w:val="1"/>
       <w:numFmt w:val="upperLetter"/>
-      <w:lvlText w:val="(%1)"/>
-      <w:lvlJc w:val="left"/>
-      <w:pPr>
-        <w:ind w:left="400"/>
+      <w:lvlText w:val="%1."/>
+      <w:lvlJc w:val="left"/>
+      <w:pPr>
+        <w:ind w:left="293"/>
+      </w:pPr>
+      <w:rPr>
+        <w:b w:val="0"/>
+        <w:i w:val="0"/>
+        <w:strike w:val="0"/>
+        <w:dstrike w:val="0"/>
+        <w:color w:val="000000"/>
+        <w:sz w:val="21"/>
+        <w:szCs w:val="21"/>
+        <w:u w:val="none" w:color="000000"/>
+        <w:bdr w:val="none" w:sz="0" w:space="0" w:color="auto"/>
+        <w:shd w:val="clear" w:color="auto" w:fill="auto"/>
+        <w:vertAlign w:val="baseline"/>
+      </w:rPr>
+    </w:lvl>
+    <w:lvl w:ilvl="1" w:tplc="FFFFFFFF">
+      <w:start w:val="1"/>
+      <w:numFmt w:val="lowerLetter"/>
+      <w:lvlText w:val="%2"/>
+      <w:lvlJc w:val="left"/>
+      <w:pPr>
+        <w:ind w:left="1080"/>
       </w:pPr>
       <w:rPr>
         <w:rFonts w:ascii="Arial" w:eastAsia="Arial" w:hAnsi="Arial" w:cs="Arial"/>
@@ -6855,13 +6859,13 @@
         <w:vertAlign w:val="baseline"/>
       </w:rPr>
     </w:lvl>
-    <w:lvl w:ilvl="1" w:tplc="03C4B5C4">
-      <w:start w:val="1"/>
-      <w:numFmt w:val="lowerLetter"/>
-      <w:lvlText w:val="%2"/>
-      <w:lvlJc w:val="left"/>
-      <w:pPr>
-        <w:ind w:left="1080"/>
+    <w:lvl w:ilvl="2" w:tplc="FFFFFFFF">
+      <w:start w:val="1"/>
+      <w:numFmt w:val="lowerRoman"/>
+      <w:lvlText w:val="%3"/>
+      <w:lvlJc w:val="left"/>
+      <w:pPr>
+        <w:ind w:left="1800"/>
       </w:pPr>
       <w:rPr>
         <w:rFonts w:ascii="Arial" w:eastAsia="Arial" w:hAnsi="Arial" w:cs="Arial"/>
@@ -6878,13 +6882,13 @@
         <w:vertAlign w:val="baseline"/>
       </w:rPr>
     </w:lvl>
-    <w:lvl w:ilvl="2" w:tplc="952A16D8">
-      <w:start w:val="1"/>
-      <w:numFmt w:val="lowerRoman"/>
-      <w:lvlText w:val="%3"/>
-      <w:lvlJc w:val="left"/>
-      <w:pPr>
-        <w:ind w:left="1800"/>
+    <w:lvl w:ilvl="3" w:tplc="FFFFFFFF">
+      <w:start w:val="1"/>
+      <w:numFmt w:val="decimal"/>
+      <w:lvlText w:val="%4"/>
+      <w:lvlJc w:val="left"/>
+      <w:pPr>
+        <w:ind w:left="2520"/>
       </w:pPr>
       <w:rPr>
         <w:rFonts w:ascii="Arial" w:eastAsia="Arial" w:hAnsi="Arial" w:cs="Arial"/>
@@ -6901,13 +6905,13 @@
         <w:vertAlign w:val="baseline"/>
       </w:rPr>
     </w:lvl>
-    <w:lvl w:ilvl="3" w:tplc="D3B2F7AA">
-      <w:start w:val="1"/>
-      <w:numFmt w:val="decimal"/>
-      <w:lvlText w:val="%4"/>
-      <w:lvlJc w:val="left"/>
-      <w:pPr>
-        <w:ind w:left="2520"/>
+    <w:lvl w:ilvl="4" w:tplc="FFFFFFFF">
+      <w:start w:val="1"/>
+      <w:numFmt w:val="lowerLetter"/>
+      <w:lvlText w:val="%5"/>
+      <w:lvlJc w:val="left"/>
+      <w:pPr>
+        <w:ind w:left="3240"/>
       </w:pPr>
       <w:rPr>
         <w:rFonts w:ascii="Arial" w:eastAsia="Arial" w:hAnsi="Arial" w:cs="Arial"/>
@@ -6924,13 +6928,13 @@
         <w:vertAlign w:val="baseline"/>
       </w:rPr>
     </w:lvl>
-    <w:lvl w:ilvl="4" w:tplc="CA42F058">
-      <w:start w:val="1"/>
-      <w:numFmt w:val="lowerLetter"/>
-      <w:lvlText w:val="%5"/>
-      <w:lvlJc w:val="left"/>
-      <w:pPr>
-        <w:ind w:left="3240"/>
+    <w:lvl w:ilvl="5" w:tplc="FFFFFFFF">
+      <w:start w:val="1"/>
+      <w:numFmt w:val="lowerRoman"/>
+      <w:lvlText w:val="%6"/>
+      <w:lvlJc w:val="left"/>
+      <w:pPr>
+        <w:ind w:left="3960"/>
       </w:pPr>
       <w:rPr>
         <w:rFonts w:ascii="Arial" w:eastAsia="Arial" w:hAnsi="Arial" w:cs="Arial"/>
@@ -6947,13 +6951,13 @@
         <w:vertAlign w:val="baseline"/>
       </w:rPr>
     </w:lvl>
-    <w:lvl w:ilvl="5" w:tplc="1242E1F8">
-      <w:start w:val="1"/>
-      <w:numFmt w:val="lowerRoman"/>
-      <w:lvlText w:val="%6"/>
-      <w:lvlJc w:val="left"/>
-      <w:pPr>
-        <w:ind w:left="3960"/>
+    <w:lvl w:ilvl="6" w:tplc="FFFFFFFF">
+      <w:start w:val="1"/>
+      <w:numFmt w:val="decimal"/>
+      <w:lvlText w:val="%7"/>
+      <w:lvlJc w:val="left"/>
+      <w:pPr>
+        <w:ind w:left="4680"/>
       </w:pPr>
       <w:rPr>
         <w:rFonts w:ascii="Arial" w:eastAsia="Arial" w:hAnsi="Arial" w:cs="Arial"/>
@@ -6970,13 +6974,13 @@
         <w:vertAlign w:val="baseline"/>
       </w:rPr>
     </w:lvl>
-    <w:lvl w:ilvl="6" w:tplc="9D9C0A58">
-      <w:start w:val="1"/>
-      <w:numFmt w:val="decimal"/>
-      <w:lvlText w:val="%7"/>
-      <w:lvlJc w:val="left"/>
-      <w:pPr>
-        <w:ind w:left="4680"/>
+    <w:lvl w:ilvl="7" w:tplc="FFFFFFFF">
+      <w:start w:val="1"/>
+      <w:numFmt w:val="lowerLetter"/>
+      <w:lvlText w:val="%8"/>
+      <w:lvlJc w:val="left"/>
+      <w:pPr>
+        <w:ind w:left="5400"/>
       </w:pPr>
       <w:rPr>
         <w:rFonts w:ascii="Arial" w:eastAsia="Arial" w:hAnsi="Arial" w:cs="Arial"/>
@@ -6993,13 +6997,13 @@
         <w:vertAlign w:val="baseline"/>
       </w:rPr>
     </w:lvl>
-    <w:lvl w:ilvl="7" w:tplc="3A66C534">
-      <w:start w:val="1"/>
-      <w:numFmt w:val="lowerLetter"/>
-      <w:lvlText w:val="%8"/>
-      <w:lvlJc w:val="left"/>
-      <w:pPr>
-        <w:ind w:left="5400"/>
+    <w:lvl w:ilvl="8" w:tplc="FFFFFFFF">
+      <w:start w:val="1"/>
+      <w:numFmt w:val="lowerRoman"/>
+      <w:lvlText w:val="%9"/>
+      <w:lvlJc w:val="left"/>
+      <w:pPr>
+        <w:ind w:left="6120"/>
       </w:pPr>
       <w:rPr>
         <w:rFonts w:ascii="Arial" w:eastAsia="Arial" w:hAnsi="Arial" w:cs="Arial"/>
@@ -7016,13 +7020,167 @@
         <w:vertAlign w:val="baseline"/>
       </w:rPr>
     </w:lvl>
-    <w:lvl w:ilvl="8" w:tplc="14CE72F8">
-      <w:start w:val="1"/>
-      <w:numFmt w:val="lowerRoman"/>
-      <w:lvlText w:val="%9"/>
-      <w:lvlJc w:val="left"/>
-      <w:pPr>
-        <w:ind w:left="6120"/>
+  </w:abstractNum>
+  <w:abstractNum w:abstractNumId="14" w15:restartNumberingAfterBreak="0">
+    <w:nsid w:val="5E97054E"/>
+    <w:multiLevelType w:val="multilevel"/>
+    <w:tmpl w:val="5130F884"/>
+    <w:lvl w:ilvl="0">
+      <w:start w:val="1"/>
+      <w:numFmt w:val="bullet"/>
+      <w:lvlText w:val=""/>
+      <w:lvlJc w:val="left"/>
+      <w:pPr>
+        <w:tabs>
+          <w:tab w:val="num" w:pos="720"/>
+        </w:tabs>
+        <w:ind w:left="720" w:hanging="360"/>
+      </w:pPr>
+      <w:rPr>
+        <w:rFonts w:ascii="Symbol" w:hAnsi="Symbol" w:hint="default"/>
+        <w:sz w:val="20"/>
+      </w:rPr>
+    </w:lvl>
+    <w:lvl w:ilvl="1" w:tentative="1">
+      <w:start w:val="1"/>
+      <w:numFmt w:val="bullet"/>
+      <w:lvlText w:val="o"/>
+      <w:lvlJc w:val="left"/>
+      <w:pPr>
+        <w:tabs>
+          <w:tab w:val="num" w:pos="1440"/>
+        </w:tabs>
+        <w:ind w:left="1440" w:hanging="360"/>
+      </w:pPr>
+      <w:rPr>
+        <w:rFonts w:ascii="Courier New" w:hAnsi="Courier New" w:hint="default"/>
+        <w:sz w:val="20"/>
+      </w:rPr>
+    </w:lvl>
+    <w:lvl w:ilvl="2" w:tentative="1">
+      <w:start w:val="1"/>
+      <w:numFmt w:val="bullet"/>
+      <w:lvlText w:val=""/>
+      <w:lvlJc w:val="left"/>
+      <w:pPr>
+        <w:tabs>
+          <w:tab w:val="num" w:pos="2160"/>
+        </w:tabs>
+        <w:ind w:left="2160" w:hanging="360"/>
+      </w:pPr>
+      <w:rPr>
+        <w:rFonts w:ascii="Wingdings" w:hAnsi="Wingdings" w:hint="default"/>
+        <w:sz w:val="20"/>
+      </w:rPr>
+    </w:lvl>
+    <w:lvl w:ilvl="3" w:tentative="1">
+      <w:start w:val="1"/>
+      <w:numFmt w:val="bullet"/>
+      <w:lvlText w:val=""/>
+      <w:lvlJc w:val="left"/>
+      <w:pPr>
+        <w:tabs>
+          <w:tab w:val="num" w:pos="2880"/>
+        </w:tabs>
+        <w:ind w:left="2880" w:hanging="360"/>
+      </w:pPr>
+      <w:rPr>
+        <w:rFonts w:ascii="Wingdings" w:hAnsi="Wingdings" w:hint="default"/>
+        <w:sz w:val="20"/>
+      </w:rPr>
+    </w:lvl>
+    <w:lvl w:ilvl="4" w:tentative="1">
+      <w:start w:val="1"/>
+      <w:numFmt w:val="bullet"/>
+      <w:lvlText w:val=""/>
+      <w:lvlJc w:val="left"/>
+      <w:pPr>
+        <w:tabs>
+          <w:tab w:val="num" w:pos="3600"/>
+        </w:tabs>
+        <w:ind w:left="3600" w:hanging="360"/>
+      </w:pPr>
+      <w:rPr>
+        <w:rFonts w:ascii="Wingdings" w:hAnsi="Wingdings" w:hint="default"/>
+        <w:sz w:val="20"/>
+      </w:rPr>
+    </w:lvl>
+    <w:lvl w:ilvl="5" w:tentative="1">
+      <w:start w:val="1"/>
+      <w:numFmt w:val="bullet"/>
+      <w:lvlText w:val=""/>
+      <w:lvlJc w:val="left"/>
+      <w:pPr>
+        <w:tabs>
+          <w:tab w:val="num" w:pos="4320"/>
+        </w:tabs>
+        <w:ind w:left="4320" w:hanging="360"/>
+      </w:pPr>
+      <w:rPr>
+        <w:rFonts w:ascii="Wingdings" w:hAnsi="Wingdings" w:hint="default"/>
+        <w:sz w:val="20"/>
+      </w:rPr>
+    </w:lvl>
+    <w:lvl w:ilvl="6" w:tentative="1">
+      <w:start w:val="1"/>
+      <w:numFmt w:val="bullet"/>
+      <w:lvlText w:val=""/>
+      <w:lvlJc w:val="left"/>
+      <w:pPr>
+        <w:tabs>
+          <w:tab w:val="num" w:pos="5040"/>
+        </w:tabs>
+        <w:ind w:left="5040" w:hanging="360"/>
+      </w:pPr>
+      <w:rPr>
+        <w:rFonts w:ascii="Wingdings" w:hAnsi="Wingdings" w:hint="default"/>
+        <w:sz w:val="20"/>
+      </w:rPr>
+    </w:lvl>
+    <w:lvl w:ilvl="7" w:tentative="1">
+      <w:start w:val="1"/>
+      <w:numFmt w:val="bullet"/>
+      <w:lvlText w:val=""/>
+      <w:lvlJc w:val="left"/>
+      <w:pPr>
+        <w:tabs>
+          <w:tab w:val="num" w:pos="5760"/>
+        </w:tabs>
+        <w:ind w:left="5760" w:hanging="360"/>
+      </w:pPr>
+      <w:rPr>
+        <w:rFonts w:ascii="Wingdings" w:hAnsi="Wingdings" w:hint="default"/>
+        <w:sz w:val="20"/>
+      </w:rPr>
+    </w:lvl>
+    <w:lvl w:ilvl="8" w:tentative="1">
+      <w:start w:val="1"/>
+      <w:numFmt w:val="bullet"/>
+      <w:lvlText w:val=""/>
+      <w:lvlJc w:val="left"/>
+      <w:pPr>
+        <w:tabs>
+          <w:tab w:val="num" w:pos="6480"/>
+        </w:tabs>
+        <w:ind w:left="6480" w:hanging="360"/>
+      </w:pPr>
+      <w:rPr>
+        <w:rFonts w:ascii="Wingdings" w:hAnsi="Wingdings" w:hint="default"/>
+        <w:sz w:val="20"/>
+      </w:rPr>
+    </w:lvl>
+  </w:abstractNum>
+  <w:abstractNum w:abstractNumId="15" w15:restartNumberingAfterBreak="0">
+    <w:nsid w:val="5F306F66"/>
+    <w:multiLevelType w:val="hybridMultilevel"/>
+    <w:tmpl w:val="C29A3B9E"/>
+    <w:lvl w:ilvl="0" w:tplc="937EBBAA">
+      <w:start w:val="4"/>
+      <w:numFmt w:val="upperLetter"/>
+      <w:lvlText w:val="(%1)"/>
+      <w:lvlJc w:val="left"/>
+      <w:pPr>
+        <w:ind w:left="400"/>
       </w:pPr>
       <w:rPr>
         <w:rFonts w:ascii="Arial" w:eastAsia="Arial" w:hAnsi="Arial" w:cs="Arial"/>
@@ -7039,8 +7197,192 @@
         <w:vertAlign w:val="baseline"/>
       </w:rPr>
     </w:lvl>
+    <w:lvl w:ilvl="1" w:tplc="03C4B5C4">
+      <w:start w:val="1"/>
+      <w:numFmt w:val="lowerLetter"/>
+      <w:lvlText w:val="%2"/>
+      <w:lvlJc w:val="left"/>
+      <w:pPr>
+        <w:ind w:left="1080"/>
+      </w:pPr>
+      <w:rPr>
+        <w:rFonts w:ascii="Arial" w:eastAsia="Arial" w:hAnsi="Arial" w:cs="Arial"/>
+        <w:b w:val="0"/>
+        <w:i w:val="0"/>
+        <w:strike w:val="0"/>
+        <w:dstrike w:val="0"/>
+        <w:color w:val="000000"/>
+        <w:sz w:val="24"/>
+        <w:szCs w:val="24"/>
+        <w:u w:val="none" w:color="000000"/>
+        <w:bdr w:val="none" w:sz="0" w:space="0" w:color="auto"/>
+        <w:shd w:val="clear" w:color="auto" w:fill="auto"/>
+        <w:vertAlign w:val="baseline"/>
+      </w:rPr>
+    </w:lvl>
+    <w:lvl w:ilvl="2" w:tplc="952A16D8">
+      <w:start w:val="1"/>
+      <w:numFmt w:val="lowerRoman"/>
+      <w:lvlText w:val="%3"/>
+      <w:lvlJc w:val="left"/>
+      <w:pPr>
+        <w:ind w:left="1800"/>
+      </w:pPr>
+      <w:rPr>
+        <w:rFonts w:ascii="Arial" w:eastAsia="Arial" w:hAnsi="Arial" w:cs="Arial"/>
+        <w:b w:val="0"/>
+        <w:i w:val="0"/>
+        <w:strike w:val="0"/>
+        <w:dstrike w:val="0"/>
+        <w:color w:val="000000"/>
+        <w:sz w:val="24"/>
+        <w:szCs w:val="24"/>
+        <w:u w:val="none" w:color="000000"/>
+        <w:bdr w:val="none" w:sz="0" w:space="0" w:color="auto"/>
+        <w:shd w:val="clear" w:color="auto" w:fill="auto"/>
+        <w:vertAlign w:val="baseline"/>
+      </w:rPr>
+    </w:lvl>
+    <w:lvl w:ilvl="3" w:tplc="D3B2F7AA">
+      <w:start w:val="1"/>
+      <w:numFmt w:val="decimal"/>
+      <w:lvlText w:val="%4"/>
+      <w:lvlJc w:val="left"/>
+      <w:pPr>
+        <w:ind w:left="2520"/>
+      </w:pPr>
+      <w:rPr>
+        <w:rFonts w:ascii="Arial" w:eastAsia="Arial" w:hAnsi="Arial" w:cs="Arial"/>
+        <w:b w:val="0"/>
+        <w:i w:val="0"/>
+        <w:strike w:val="0"/>
+        <w:dstrike w:val="0"/>
+        <w:color w:val="000000"/>
+        <w:sz w:val="24"/>
+        <w:szCs w:val="24"/>
+        <w:u w:val="none" w:color="000000"/>
+        <w:bdr w:val="none" w:sz="0" w:space="0" w:color="auto"/>
+        <w:shd w:val="clear" w:color="auto" w:fill="auto"/>
+        <w:vertAlign w:val="baseline"/>
+      </w:rPr>
+    </w:lvl>
+    <w:lvl w:ilvl="4" w:tplc="CA42F058">
+      <w:start w:val="1"/>
+      <w:numFmt w:val="lowerLetter"/>
+      <w:lvlText w:val="%5"/>
+      <w:lvlJc w:val="left"/>
+      <w:pPr>
+        <w:ind w:left="3240"/>
+      </w:pPr>
+      <w:rPr>
+        <w:rFonts w:ascii="Arial" w:eastAsia="Arial" w:hAnsi="Arial" w:cs="Arial"/>
+        <w:b w:val="0"/>
+        <w:i w:val="0"/>
+        <w:strike w:val="0"/>
+        <w:dstrike w:val="0"/>
+        <w:color w:val="000000"/>
+        <w:sz w:val="24"/>
+        <w:szCs w:val="24"/>
+        <w:u w:val="none" w:color="000000"/>
+        <w:bdr w:val="none" w:sz="0" w:space="0" w:color="auto"/>
+        <w:shd w:val="clear" w:color="auto" w:fill="auto"/>
+        <w:vertAlign w:val="baseline"/>
+      </w:rPr>
+    </w:lvl>
+    <w:lvl w:ilvl="5" w:tplc="1242E1F8">
+      <w:start w:val="1"/>
+      <w:numFmt w:val="lowerRoman"/>
+      <w:lvlText w:val="%6"/>
+      <w:lvlJc w:val="left"/>
+      <w:pPr>
+        <w:ind w:left="3960"/>
+      </w:pPr>
+      <w:rPr>
+        <w:rFonts w:ascii="Arial" w:eastAsia="Arial" w:hAnsi="Arial" w:cs="Arial"/>
+        <w:b w:val="0"/>
+        <w:i w:val="0"/>
+        <w:strike w:val="0"/>
+        <w:dstrike w:val="0"/>
+        <w:color w:val="000000"/>
+        <w:sz w:val="24"/>
+        <w:szCs w:val="24"/>
+        <w:u w:val="none" w:color="000000"/>
+        <w:bdr w:val="none" w:sz="0" w:space="0" w:color="auto"/>
+        <w:shd w:val="clear" w:color="auto" w:fill="auto"/>
+        <w:vertAlign w:val="baseline"/>
+      </w:rPr>
+    </w:lvl>
+    <w:lvl w:ilvl="6" w:tplc="9D9C0A58">
+      <w:start w:val="1"/>
+      <w:numFmt w:val="decimal"/>
+      <w:lvlText w:val="%7"/>
+      <w:lvlJc w:val="left"/>
+      <w:pPr>
+        <w:ind w:left="4680"/>
+      </w:pPr>
+      <w:rPr>
+        <w:rFonts w:ascii="Arial" w:eastAsia="Arial" w:hAnsi="Arial" w:cs="Arial"/>
+        <w:b w:val="0"/>
+        <w:i w:val="0"/>
+        <w:strike w:val="0"/>
+        <w:dstrike w:val="0"/>
+        <w:color w:val="000000"/>
+        <w:sz w:val="24"/>
+        <w:szCs w:val="24"/>
+        <w:u w:val="none" w:color="000000"/>
+        <w:bdr w:val="none" w:sz="0" w:space="0" w:color="auto"/>
+        <w:shd w:val="clear" w:color="auto" w:fill="auto"/>
+        <w:vertAlign w:val="baseline"/>
+      </w:rPr>
+    </w:lvl>
+    <w:lvl w:ilvl="7" w:tplc="3A66C534">
+      <w:start w:val="1"/>
+      <w:numFmt w:val="lowerLetter"/>
+      <w:lvlText w:val="%8"/>
+      <w:lvlJc w:val="left"/>
+      <w:pPr>
+        <w:ind w:left="5400"/>
+      </w:pPr>
+      <w:rPr>
+        <w:rFonts w:ascii="Arial" w:eastAsia="Arial" w:hAnsi="Arial" w:cs="Arial"/>
+        <w:b w:val="0"/>
+        <w:i w:val="0"/>
+        <w:strike w:val="0"/>
+        <w:dstrike w:val="0"/>
+        <w:color w:val="000000"/>
+        <w:sz w:val="24"/>
+        <w:szCs w:val="24"/>
+        <w:u w:val="none" w:color="000000"/>
+        <w:bdr w:val="none" w:sz="0" w:space="0" w:color="auto"/>
+        <w:shd w:val="clear" w:color="auto" w:fill="auto"/>
+        <w:vertAlign w:val="baseline"/>
+      </w:rPr>
+    </w:lvl>
+    <w:lvl w:ilvl="8" w:tplc="14CE72F8">
+      <w:start w:val="1"/>
+      <w:numFmt w:val="lowerRoman"/>
+      <w:lvlText w:val="%9"/>
+      <w:lvlJc w:val="left"/>
+      <w:pPr>
+        <w:ind w:left="6120"/>
+      </w:pPr>
+      <w:rPr>
+        <w:rFonts w:ascii="Arial" w:eastAsia="Arial" w:hAnsi="Arial" w:cs="Arial"/>
+        <w:b w:val="0"/>
+        <w:i w:val="0"/>
+        <w:strike w:val="0"/>
+        <w:dstrike w:val="0"/>
+        <w:color w:val="000000"/>
+        <w:sz w:val="24"/>
+        <w:szCs w:val="24"/>
+        <w:u w:val="none" w:color="000000"/>
+        <w:bdr w:val="none" w:sz="0" w:space="0" w:color="auto"/>
+        <w:shd w:val="clear" w:color="auto" w:fill="auto"/>
+        <w:vertAlign w:val="baseline"/>
+      </w:rPr>
+    </w:lvl>
   </w:abstractNum>
-  <w:abstractNum w:abstractNumId="12" w15:restartNumberingAfterBreak="0">
+  <w:abstractNum w:abstractNumId="16" w15:restartNumberingAfterBreak="0">
     <w:nsid w:val="60A72B2A"/>
     <w:multiLevelType w:val="hybridMultilevel"/>
     <w:tmpl w:val="6DDE6F68"/>
@@ -7153,7 +7495,574 @@
       </w:rPr>
     </w:lvl>
   </w:abstractNum>
-  <w:abstractNum w:abstractNumId="13" w15:restartNumberingAfterBreak="0">
+  <w:abstractNum w:abstractNumId="17" w15:restartNumberingAfterBreak="0">
+    <w:nsid w:val="640E280D"/>
+    <w:multiLevelType w:val="hybridMultilevel"/>
+    <w:tmpl w:val="8702F7EA"/>
+    <w:lvl w:ilvl="0" w:tplc="3E2C8C14">
+      <w:start w:val="1"/>
+      <w:numFmt w:val="upperLetter"/>
+      <w:lvlText w:val="%1)"/>
+      <w:lvlJc w:val="left"/>
+      <w:pPr>
+        <w:ind w:left="640" w:hanging="360"/>
+      </w:pPr>
+      <w:rPr>
+        <w:rFonts w:hint="default"/>
+      </w:rPr>
+    </w:lvl>
+    <w:lvl w:ilvl="1" w:tplc="40090019" w:tentative="1">
+      <w:start w:val="1"/>
+      <w:numFmt w:val="lowerLetter"/>
+      <w:lvlText w:val="%2."/>
+      <w:lvlJc w:val="left"/>
+      <w:pPr>
+        <w:ind w:left="1360" w:hanging="360"/>
+      </w:pPr>
+    </w:lvl>
+    <w:lvl w:ilvl="2" w:tplc="4009001B" w:tentative="1">
+      <w:start w:val="1"/>
+      <w:numFmt w:val="lowerRoman"/>
+      <w:lvlText w:val="%3."/>
+      <w:lvlJc w:val="right"/>
+      <w:pPr>
+        <w:ind w:left="2080" w:hanging="180"/>
+      </w:pPr>
+    </w:lvl>
+    <w:lvl w:ilvl="3" w:tplc="4009000F" w:tentative="1">
+      <w:start w:val="1"/>
+      <w:numFmt w:val="decimal"/>
+      <w:lvlText w:val="%4."/>
+      <w:lvlJc w:val="left"/>
+      <w:pPr>
+        <w:ind w:left="2800" w:hanging="360"/>
+      </w:pPr>
+    </w:lvl>
+    <w:lvl w:ilvl="4" w:tplc="40090019" w:tentative="1">
+      <w:start w:val="1"/>
+      <w:numFmt w:val="lowerLetter"/>
+      <w:lvlText w:val="%5."/>
+      <w:lvlJc w:val="left"/>
+      <w:pPr>
+        <w:ind w:left="3520" w:hanging="360"/>
+      </w:pPr>
+    </w:lvl>
+    <w:lvl w:ilvl="5" w:tplc="4009001B" w:tentative="1">
+      <w:start w:val="1"/>
+      <w:numFmt w:val="lowerRoman"/>
+      <w:lvlText w:val="%6."/>
+      <w:lvlJc w:val="right"/>
+      <w:pPr>
+        <w:ind w:left="4240" w:hanging="180"/>
+      </w:pPr>
+    </w:lvl>
+    <w:lvl w:ilvl="6" w:tplc="4009000F" w:tentative="1">
+      <w:start w:val="1"/>
+      <w:numFmt w:val="decimal"/>
+      <w:lvlText w:val="%7."/>
+      <w:lvlJc w:val="left"/>
+      <w:pPr>
+        <w:ind w:left="4960" w:hanging="360"/>
+      </w:pPr>
+    </w:lvl>
+    <w:lvl w:ilvl="7" w:tplc="40090019" w:tentative="1">
+      <w:start w:val="1"/>
+      <w:numFmt w:val="lowerLetter"/>
+      <w:lvlText w:val="%8."/>
+      <w:lvlJc w:val="left"/>
+      <w:pPr>
+        <w:ind w:left="5680" w:hanging="360"/>
+      </w:pPr>
+    </w:lvl>
+    <w:lvl w:ilvl="8" w:tplc="4009001B" w:tentative="1">
+      <w:start w:val="1"/>
+      <w:numFmt w:val="lowerRoman"/>
+      <w:lvlText w:val="%9."/>
+      <w:lvlJc w:val="right"/>
+      <w:pPr>
+        <w:ind w:left="6400" w:hanging="180"/>
+      </w:pPr>
+    </w:lvl>
+  </w:abstractNum>
+  <w:abstractNum w:abstractNumId="18" w15:restartNumberingAfterBreak="0">
+    <w:nsid w:val="65F35586"/>
+    <w:multiLevelType w:val="hybridMultilevel"/>
+    <w:tmpl w:val="8C0084E8"/>
+    <w:lvl w:ilvl="0" w:tplc="40090015">
+      <w:start w:val="1"/>
+      <w:numFmt w:val="upperLetter"/>
+      <w:lvlText w:val="%1."/>
+      <w:lvlJc w:val="left"/>
+      <w:pPr>
+        <w:ind w:left="293"/>
+      </w:pPr>
+      <w:rPr>
+        <w:b w:val="0"/>
+        <w:i w:val="0"/>
+        <w:strike w:val="0"/>
+        <w:dstrike w:val="0"/>
+        <w:color w:val="000000"/>
+        <w:sz w:val="21"/>
+        <w:szCs w:val="21"/>
+        <w:u w:val="none" w:color="000000"/>
+        <w:bdr w:val="none" w:sz="0" w:space="0" w:color="auto"/>
+        <w:shd w:val="clear" w:color="auto" w:fill="auto"/>
+        <w:vertAlign w:val="baseline"/>
+      </w:rPr>
+    </w:lvl>
+    <w:lvl w:ilvl="1" w:tplc="FFFFFFFF">
+      <w:start w:val="1"/>
+      <w:numFmt w:val="lowerLetter"/>
+      <w:lvlText w:val="%2"/>
+      <w:lvlJc w:val="left"/>
+      <w:pPr>
+        <w:ind w:left="1080"/>
+      </w:pPr>
+      <w:rPr>
+        <w:rFonts w:ascii="Arial" w:eastAsia="Arial" w:hAnsi="Arial" w:cs="Arial"/>
+        <w:b w:val="0"/>
+        <w:i w:val="0"/>
+        <w:strike w:val="0"/>
+        <w:dstrike w:val="0"/>
+        <w:color w:val="000000"/>
+        <w:sz w:val="24"/>
+        <w:szCs w:val="24"/>
+        <w:u w:val="none" w:color="000000"/>
+        <w:bdr w:val="none" w:sz="0" w:space="0" w:color="auto"/>
+        <w:shd w:val="clear" w:color="auto" w:fill="auto"/>
+        <w:vertAlign w:val="baseline"/>
+      </w:rPr>
+    </w:lvl>
+    <w:lvl w:ilvl="2" w:tplc="FFFFFFFF">
+      <w:start w:val="1"/>
+      <w:numFmt w:val="lowerRoman"/>
+      <w:lvlText w:val="%3"/>
+      <w:lvlJc w:val="left"/>
+      <w:pPr>
+        <w:ind w:left="1800"/>
+      </w:pPr>
+      <w:rPr>
+        <w:rFonts w:ascii="Arial" w:eastAsia="Arial" w:hAnsi="Arial" w:cs="Arial"/>
+        <w:b w:val="0"/>
+        <w:i w:val="0"/>
+        <w:strike w:val="0"/>
+        <w:dstrike w:val="0"/>
+        <w:color w:val="000000"/>
+        <w:sz w:val="24"/>
+        <w:szCs w:val="24"/>
+        <w:u w:val="none" w:color="000000"/>
+        <w:bdr w:val="none" w:sz="0" w:space="0" w:color="auto"/>
+        <w:shd w:val="clear" w:color="auto" w:fill="auto"/>
+        <w:vertAlign w:val="baseline"/>
+      </w:rPr>
+    </w:lvl>
+    <w:lvl w:ilvl="3" w:tplc="FFFFFFFF">
+      <w:start w:val="1"/>
+      <w:numFmt w:val="decimal"/>
+      <w:lvlText w:val="%4"/>
+      <w:lvlJc w:val="left"/>
+      <w:pPr>
+        <w:ind w:left="2520"/>
+      </w:pPr>
+      <w:rPr>
+        <w:rFonts w:ascii="Arial" w:eastAsia="Arial" w:hAnsi="Arial" w:cs="Arial"/>
+        <w:b w:val="0"/>
+        <w:i w:val="0"/>
+        <w:strike w:val="0"/>
+        <w:dstrike w:val="0"/>
+        <w:color w:val="000000"/>
+        <w:sz w:val="24"/>
+        <w:szCs w:val="24"/>
+        <w:u w:val="none" w:color="000000"/>
+        <w:bdr w:val="none" w:sz="0" w:space="0" w:color="auto"/>
+        <w:shd w:val="clear" w:color="auto" w:fill="auto"/>
+        <w:vertAlign w:val="baseline"/>
+      </w:rPr>
+    </w:lvl>
+    <w:lvl w:ilvl="4" w:tplc="FFFFFFFF">
+      <w:start w:val="1"/>
+      <w:numFmt w:val="lowerLetter"/>
+      <w:lvlText w:val="%5"/>
+      <w:lvlJc w:val="left"/>
+      <w:pPr>
+        <w:ind w:left="3240"/>
+      </w:pPr>
+      <w:rPr>
+        <w:rFonts w:ascii="Arial" w:eastAsia="Arial" w:hAnsi="Arial" w:cs="Arial"/>
+        <w:b w:val="0"/>
+        <w:i w:val="0"/>
+        <w:strike w:val="0"/>
+        <w:dstrike w:val="0"/>
+        <w:color w:val="000000"/>
+        <w:sz w:val="24"/>
+        <w:szCs w:val="24"/>
+        <w:u w:val="none" w:color="000000"/>
+        <w:bdr w:val="none" w:sz="0" w:space="0" w:color="auto"/>
+        <w:shd w:val="clear" w:color="auto" w:fill="auto"/>
+        <w:vertAlign w:val="baseline"/>
+      </w:rPr>
+    </w:lvl>
+    <w:lvl w:ilvl="5" w:tplc="FFFFFFFF">
+      <w:start w:val="1"/>
+      <w:numFmt w:val="lowerRoman"/>
+      <w:lvlText w:val="%6"/>
+      <w:lvlJc w:val="left"/>
+      <w:pPr>
+        <w:ind w:left="3960"/>
+      </w:pPr>
+      <w:rPr>
+        <w:rFonts w:ascii="Arial" w:eastAsia="Arial" w:hAnsi="Arial" w:cs="Arial"/>
+        <w:b w:val="0"/>
+        <w:i w:val="0"/>
+        <w:strike w:val="0"/>
+        <w:dstrike w:val="0"/>
+        <w:color w:val="000000"/>
+        <w:sz w:val="24"/>
+        <w:szCs w:val="24"/>
+        <w:u w:val="none" w:color="000000"/>
+        <w:bdr w:val="none" w:sz="0" w:space="0" w:color="auto"/>
+        <w:shd w:val="clear" w:color="auto" w:fill="auto"/>
+        <w:vertAlign w:val="baseline"/>
+      </w:rPr>
+    </w:lvl>
+    <w:lvl w:ilvl="6" w:tplc="FFFFFFFF">
+      <w:start w:val="1"/>
+      <w:numFmt w:val="decimal"/>
+      <w:lvlText w:val="%7"/>
+      <w:lvlJc w:val="left"/>
+      <w:pPr>
+        <w:ind w:left="4680"/>
+      </w:pPr>
+      <w:rPr>
+        <w:rFonts w:ascii="Arial" w:eastAsia="Arial" w:hAnsi="Arial" w:cs="Arial"/>
+        <w:b w:val="0"/>
+        <w:i w:val="0"/>
+        <w:strike w:val="0"/>
+        <w:dstrike w:val="0"/>
+        <w:color w:val="000000"/>
+        <w:sz w:val="24"/>
+        <w:szCs w:val="24"/>
+        <w:u w:val="none" w:color="000000"/>
+        <w:bdr w:val="none" w:sz="0" w:space="0" w:color="auto"/>
+        <w:shd w:val="clear" w:color="auto" w:fill="auto"/>
+        <w:vertAlign w:val="baseline"/>
+      </w:rPr>
+    </w:lvl>
+    <w:lvl w:ilvl="7" w:tplc="FFFFFFFF">
+      <w:start w:val="1"/>
+      <w:numFmt w:val="lowerLetter"/>
+      <w:lvlText w:val="%8"/>
+      <w:lvlJc w:val="left"/>
+      <w:pPr>
+        <w:ind w:left="5400"/>
+      </w:pPr>
+      <w:rPr>
+        <w:rFonts w:ascii="Arial" w:eastAsia="Arial" w:hAnsi="Arial" w:cs="Arial"/>
+        <w:b w:val="0"/>
+        <w:i w:val="0"/>
+        <w:strike w:val="0"/>
+        <w:dstrike w:val="0"/>
+        <w:color w:val="000000"/>
+        <w:sz w:val="24"/>
+        <w:szCs w:val="24"/>
+        <w:u w:val="none" w:color="000000"/>
+        <w:bdr w:val="none" w:sz="0" w:space="0" w:color="auto"/>
+        <w:shd w:val="clear" w:color="auto" w:fill="auto"/>
+        <w:vertAlign w:val="baseline"/>
+      </w:rPr>
+    </w:lvl>
+    <w:lvl w:ilvl="8" w:tplc="FFFFFFFF">
+      <w:start w:val="1"/>
+      <w:numFmt w:val="lowerRoman"/>
+      <w:lvlText w:val="%9"/>
+      <w:lvlJc w:val="left"/>
+      <w:pPr>
+        <w:ind w:left="6120"/>
+      </w:pPr>
+      <w:rPr>
+        <w:rFonts w:ascii="Arial" w:eastAsia="Arial" w:hAnsi="Arial" w:cs="Arial"/>
+        <w:b w:val="0"/>
+        <w:i w:val="0"/>
+        <w:strike w:val="0"/>
+        <w:dstrike w:val="0"/>
+        <w:color w:val="000000"/>
+        <w:sz w:val="24"/>
+        <w:szCs w:val="24"/>
+        <w:u w:val="none" w:color="000000"/>
+        <w:bdr w:val="none" w:sz="0" w:space="0" w:color="auto"/>
+        <w:shd w:val="clear" w:color="auto" w:fill="auto"/>
+        <w:vertAlign w:val="baseline"/>
+      </w:rPr>
+    </w:lvl>
+  </w:abstractNum>
+  <w:abstractNum w:abstractNumId="19" w15:restartNumberingAfterBreak="0">
+    <w:nsid w:val="669F28BF"/>
+    <w:multiLevelType w:val="hybridMultilevel"/>
+    <w:tmpl w:val="BB0C383E"/>
+    <w:lvl w:ilvl="0" w:tplc="9244E242">
+      <w:start w:val="1"/>
+      <w:numFmt w:val="decimal"/>
+      <w:lvlText w:val="%1)"/>
+      <w:lvlJc w:val="left"/>
+      <w:pPr>
+        <w:ind w:left="1000" w:hanging="360"/>
+      </w:pPr>
+      <w:rPr>
+        <w:rFonts w:hint="default"/>
+      </w:rPr>
+    </w:lvl>
+    <w:lvl w:ilvl="1" w:tplc="40090019" w:tentative="1">
+      <w:start w:val="1"/>
+      <w:numFmt w:val="lowerLetter"/>
+      <w:lvlText w:val="%2."/>
+      <w:lvlJc w:val="left"/>
+      <w:pPr>
+        <w:ind w:left="1720" w:hanging="360"/>
+      </w:pPr>
+    </w:lvl>
+    <w:lvl w:ilvl="2" w:tplc="4009001B" w:tentative="1">
+      <w:start w:val="1"/>
+      <w:numFmt w:val="lowerRoman"/>
+      <w:lvlText w:val="%3."/>
+      <w:lvlJc w:val="right"/>
+      <w:pPr>
+        <w:ind w:left="2440" w:hanging="180"/>
+      </w:pPr>
+    </w:lvl>
+    <w:lvl w:ilvl="3" w:tplc="4009000F" w:tentative="1">
+      <w:start w:val="1"/>
+      <w:numFmt w:val="decimal"/>
+      <w:lvlText w:val="%4."/>
+      <w:lvlJc w:val="left"/>
+      <w:pPr>
+        <w:ind w:left="3160" w:hanging="360"/>
+      </w:pPr>
+    </w:lvl>
+    <w:lvl w:ilvl="4" w:tplc="40090019" w:tentative="1">
+      <w:start w:val="1"/>
+      <w:numFmt w:val="lowerLetter"/>
+      <w:lvlText w:val="%5."/>
+      <w:lvlJc w:val="left"/>
+      <w:pPr>
+        <w:ind w:left="3880" w:hanging="360"/>
+      </w:pPr>
+    </w:lvl>
+    <w:lvl w:ilvl="5" w:tplc="4009001B" w:tentative="1">
+      <w:start w:val="1"/>
+      <w:numFmt w:val="lowerRoman"/>
+      <w:lvlText w:val="%6."/>
+      <w:lvlJc w:val="right"/>
+      <w:pPr>
+        <w:ind w:left="4600" w:hanging="180"/>
+      </w:pPr>
+    </w:lvl>
+    <w:lvl w:ilvl="6" w:tplc="4009000F" w:tentative="1">
+      <w:start w:val="1"/>
+      <w:numFmt w:val="decimal"/>
+      <w:lvlText w:val="%7."/>
+      <w:lvlJc w:val="left"/>
+      <w:pPr>
+        <w:ind w:left="5320" w:hanging="360"/>
+      </w:pPr>
+    </w:lvl>
+    <w:lvl w:ilvl="7" w:tplc="40090019" w:tentative="1">
+      <w:start w:val="1"/>
+      <w:numFmt w:val="lowerLetter"/>
+      <w:lvlText w:val="%8."/>
+      <w:lvlJc w:val="left"/>
+      <w:pPr>
+        <w:ind w:left="6040" w:hanging="360"/>
+      </w:pPr>
+    </w:lvl>
+    <w:lvl w:ilvl="8" w:tplc="4009001B" w:tentative="1">
+      <w:start w:val="1"/>
+      <w:numFmt w:val="lowerRoman"/>
+      <w:lvlText w:val="%9."/>
+      <w:lvlJc w:val="right"/>
+      <w:pPr>
+        <w:ind w:left="6760" w:hanging="180"/>
+      </w:pPr>
+    </w:lvl>
+  </w:abstractNum>
+  <w:abstractNum w:abstractNumId="20" w15:restartNumberingAfterBreak="0">
+    <w:nsid w:val="66D42C3D"/>
+    <w:multiLevelType w:val="hybridMultilevel"/>
+    <w:tmpl w:val="89F61A4C"/>
+    <w:lvl w:ilvl="0" w:tplc="172674CE">
+      <w:start w:val="2"/>
+      <w:numFmt w:val="upperLetter"/>
+      <w:lvlText w:val="(%1)"/>
+      <w:lvlJc w:val="left"/>
+      <w:pPr>
+        <w:ind w:left="730" w:hanging="360"/>
+      </w:pPr>
+      <w:rPr>
+        <w:rFonts w:hint="default"/>
+      </w:rPr>
+    </w:lvl>
+    <w:lvl w:ilvl="1" w:tplc="40090019" w:tentative="1">
+      <w:start w:val="1"/>
+      <w:numFmt w:val="lowerLetter"/>
+      <w:lvlText w:val="%2."/>
+      <w:lvlJc w:val="left"/>
+      <w:pPr>
+        <w:ind w:left="1450" w:hanging="360"/>
+      </w:pPr>
+    </w:lvl>
+    <w:lvl w:ilvl="2" w:tplc="4009001B" w:tentative="1">
+      <w:start w:val="1"/>
+      <w:numFmt w:val="lowerRoman"/>
+      <w:lvlText w:val="%3."/>
+      <w:lvlJc w:val="right"/>
+      <w:pPr>
+        <w:ind w:left="2170" w:hanging="180"/>
+      </w:pPr>
+    </w:lvl>
+    <w:lvl w:ilvl="3" w:tplc="4009000F" w:tentative="1">
+      <w:start w:val="1"/>
+      <w:numFmt w:val="decimal"/>
+      <w:lvlText w:val="%4."/>
+      <w:lvlJc w:val="left"/>
+      <w:pPr>
+        <w:ind w:left="2890" w:hanging="360"/>
+      </w:pPr>
+    </w:lvl>
+    <w:lvl w:ilvl="4" w:tplc="40090019" w:tentative="1">
+      <w:start w:val="1"/>
+      <w:numFmt w:val="lowerLetter"/>
+      <w:lvlText w:val="%5."/>
+      <w:lvlJc w:val="left"/>
+      <w:pPr>
+        <w:ind w:left="3610" w:hanging="360"/>
+      </w:pPr>
+    </w:lvl>
+    <w:lvl w:ilvl="5" w:tplc="4009001B" w:tentative="1">
+      <w:start w:val="1"/>
+      <w:numFmt w:val="lowerRoman"/>
+      <w:lvlText w:val="%6."/>
+      <w:lvlJc w:val="right"/>
+      <w:pPr>
+        <w:ind w:left="4330" w:hanging="180"/>
+      </w:pPr>
+    </w:lvl>
+    <w:lvl w:ilvl="6" w:tplc="4009000F" w:tentative="1">
+      <w:start w:val="1"/>
+      <w:numFmt w:val="decimal"/>
+      <w:lvlText w:val="%7."/>
+      <w:lvlJc w:val="left"/>
+      <w:pPr>
+        <w:ind w:left="5050" w:hanging="360"/>
+      </w:pPr>
+    </w:lvl>
+    <w:lvl w:ilvl="7" w:tplc="40090019" w:tentative="1">
+      <w:start w:val="1"/>
+      <w:numFmt w:val="lowerLetter"/>
+      <w:lvlText w:val="%8."/>
+      <w:lvlJc w:val="left"/>
+      <w:pPr>
+        <w:ind w:left="5770" w:hanging="360"/>
+      </w:pPr>
+    </w:lvl>
+    <w:lvl w:ilvl="8" w:tplc="4009001B" w:tentative="1">
+      <w:start w:val="1"/>
+      <w:numFmt w:val="lowerRoman"/>
+      <w:lvlText w:val="%9."/>
+      <w:lvlJc w:val="right"/>
+      <w:pPr>
+        <w:ind w:left="6490" w:hanging="180"/>
+      </w:pPr>
+    </w:lvl>
+  </w:abstractNum>
+  <w:abstractNum w:abstractNumId="21" w15:restartNumberingAfterBreak="0">
+    <w:nsid w:val="6E3A7732"/>
+    <w:multiLevelType w:val="hybridMultilevel"/>
+    <w:tmpl w:val="A8F2E088"/>
+    <w:lvl w:ilvl="0" w:tplc="3E2C8C14">
+      <w:start w:val="1"/>
+      <w:numFmt w:val="upperLetter"/>
+      <w:lvlText w:val="%1)"/>
+      <w:lvlJc w:val="left"/>
+      <w:pPr>
+        <w:ind w:left="1000" w:hanging="360"/>
+      </w:pPr>
+      <w:rPr>
+        <w:rFonts w:hint="default"/>
+      </w:rPr>
+    </w:lvl>
+    <w:lvl w:ilvl="1" w:tplc="FFFFFFFF" w:tentative="1">
+      <w:start w:val="1"/>
+      <w:numFmt w:val="lowerLetter"/>
+      <w:lvlText w:val="%2."/>
+      <w:lvlJc w:val="left"/>
+      <w:pPr>
+        <w:ind w:left="1720" w:hanging="360"/>
+      </w:pPr>
+    </w:lvl>
+    <w:lvl w:ilvl="2" w:tplc="FFFFFFFF" w:tentative="1">
+      <w:start w:val="1"/>
+      <w:numFmt w:val="lowerRoman"/>
+      <w:lvlText w:val="%3."/>
+      <w:lvlJc w:val="right"/>
+      <w:pPr>
+        <w:ind w:left="2440" w:hanging="180"/>
+      </w:pPr>
+    </w:lvl>
+    <w:lvl w:ilvl="3" w:tplc="FFFFFFFF" w:tentative="1">
+      <w:start w:val="1"/>
+      <w:numFmt w:val="decimal"/>
+      <w:lvlText w:val="%4."/>
+      <w:lvlJc w:val="left"/>
+      <w:pPr>
+        <w:ind w:left="3160" w:hanging="360"/>
+      </w:pPr>
+    </w:lvl>
+    <w:lvl w:ilvl="4" w:tplc="FFFFFFFF" w:tentative="1">
+      <w:start w:val="1"/>
+      <w:numFmt w:val="lowerLetter"/>
+      <w:lvlText w:val="%5."/>
+      <w:lvlJc w:val="left"/>
+      <w:pPr>
+        <w:ind w:left="3880" w:hanging="360"/>
+      </w:pPr>
+    </w:lvl>
+    <w:lvl w:ilvl="5" w:tplc="FFFFFFFF" w:tentative="1">
+      <w:start w:val="1"/>
+      <w:numFmt w:val="lowerRoman"/>
+      <w:lvlText w:val="%6."/>
+      <w:lvlJc w:val="right"/>
+      <w:pPr>
+        <w:ind w:left="4600" w:hanging="180"/>
+      </w:pPr>
+    </w:lvl>
+    <w:lvl w:ilvl="6" w:tplc="FFFFFFFF" w:tentative="1">
+      <w:start w:val="1"/>
+      <w:numFmt w:val="decimal"/>
+      <w:lvlText w:val="%7."/>
+      <w:lvlJc w:val="left"/>
+      <w:pPr>
+        <w:ind w:left="5320" w:hanging="360"/>
+      </w:pPr>
+    </w:lvl>
+    <w:lvl w:ilvl="7" w:tplc="FFFFFFFF" w:tentative="1">
+      <w:start w:val="1"/>
+      <w:numFmt w:val="lowerLetter"/>
+      <w:lvlText w:val="%8."/>
+      <w:lvlJc w:val="left"/>
+      <w:pPr>
+        <w:ind w:left="6040" w:hanging="360"/>
+      </w:pPr>
+    </w:lvl>
+    <w:lvl w:ilvl="8" w:tplc="FFFFFFFF" w:tentative="1">
+      <w:start w:val="1"/>
+      <w:numFmt w:val="lowerRoman"/>
+      <w:lvlText w:val="%9."/>
+      <w:lvlJc w:val="right"/>
+      <w:pPr>
+        <w:ind w:left="6760" w:hanging="180"/>
+      </w:pPr>
+    </w:lvl>
+  </w:abstractNum>
+  <w:abstractNum w:abstractNumId="22" w15:restartNumberingAfterBreak="0">
     <w:nsid w:val="75BA1EF4"/>
     <w:multiLevelType w:val="hybridMultilevel"/>
     <w:tmpl w:val="EB5CE160"/>
@@ -7267,37 +8176,37 @@
     </w:lvl>
   </w:abstractNum>
   <w:num w:numId="1" w16cid:durableId="553659016">
-    <w:abstractNumId w:val="6"/>
+    <w:abstractNumId w:val="9"/>
   </w:num>
   <w:num w:numId="2" w16cid:durableId="1620990736">
-    <w:abstractNumId w:val="8"/>
+    <w:abstractNumId w:val="11"/>
   </w:num>
   <w:num w:numId="3" w16cid:durableId="2114204824">
-    <w:abstractNumId w:val="3"/>
+    <w:abstractNumId w:val="5"/>
   </w:num>
   <w:num w:numId="4" w16cid:durableId="2080401312">
-    <w:abstractNumId w:val="9"/>
+    <w:abstractNumId w:val="12"/>
   </w:num>
   <w:num w:numId="5" w16cid:durableId="1446654949">
-    <w:abstractNumId w:val="11"/>
+    <w:abstractNumId w:val="15"/>
   </w:num>
   <w:num w:numId="6" w16cid:durableId="792217316">
     <w:abstractNumId w:val="1"/>
   </w:num>
   <w:num w:numId="7" w16cid:durableId="53477411">
-    <w:abstractNumId w:val="5"/>
+    <w:abstractNumId w:val="8"/>
   </w:num>
   <w:num w:numId="8" w16cid:durableId="851796687">
-    <w:abstractNumId w:val="4"/>
+    <w:abstractNumId w:val="7"/>
   </w:num>
   <w:num w:numId="9" w16cid:durableId="1194148858">
+    <w:abstractNumId w:val="14"/>
+  </w:num>
+  <w:num w:numId="10" w16cid:durableId="764617942">
     <w:abstractNumId w:val="10"/>
   </w:num>
-  <w:num w:numId="10" w16cid:durableId="764617942">
-    <w:abstractNumId w:val="7"/>
-  </w:num>
   <w:num w:numId="11" w16cid:durableId="664433144">
-    <w:abstractNumId w:val="13"/>
+    <w:abstractNumId w:val="22"/>
   </w:num>
   <w:num w:numId="12" w16cid:durableId="1599479457">
     <w:abstractNumId w:val="2"/>
@@ -7306,7 +8215,34 @@
     <w:abstractNumId w:val="0"/>
   </w:num>
   <w:num w:numId="14" w16cid:durableId="236521234">
-    <w:abstractNumId w:val="12"/>
+    <w:abstractNumId w:val="16"/>
+  </w:num>
+  <w:num w:numId="15" w16cid:durableId="1122648982">
+    <w:abstractNumId w:val="4"/>
+  </w:num>
+  <w:num w:numId="16" w16cid:durableId="1031418726">
+    <w:abstractNumId w:val="17"/>
+  </w:num>
+  <w:num w:numId="17" w16cid:durableId="1842768713">
+    <w:abstractNumId w:val="20"/>
+  </w:num>
+  <w:num w:numId="18" w16cid:durableId="1201942892">
+    <w:abstractNumId w:val="19"/>
+  </w:num>
+  <w:num w:numId="19" w16cid:durableId="1166045511">
+    <w:abstractNumId w:val="6"/>
+  </w:num>
+  <w:num w:numId="20" w16cid:durableId="195390663">
+    <w:abstractNumId w:val="21"/>
+  </w:num>
+  <w:num w:numId="21" w16cid:durableId="993025200">
+    <w:abstractNumId w:val="3"/>
+  </w:num>
+  <w:num w:numId="22" w16cid:durableId="1209031597">
+    <w:abstractNumId w:val="18"/>
+  </w:num>
+  <w:num w:numId="23" w16cid:durableId="181674660">
+    <w:abstractNumId w:val="13"/>
   </w:num>
 </w:numbering>
 </file>
@@ -7746,6 +8682,7 @@
   <w:style w:type="character" w:default="1" w:styleId="DefaultParagraphFont">
     <w:name w:val="Default Paragraph Font"/>
     <w:uiPriority w:val="1"/>
+    <w:semiHidden/>
     <w:unhideWhenUsed/>
   </w:style>
   <w:style w:type="table" w:default="1" w:styleId="TableNormal">
@@ -8164,4 +9101,16 @@
     </a:ext>
   </a:extLst>
 </a:theme>
+</file>
+
+<file path=customXml/item1.xml><?xml version="1.0" encoding="utf-8"?>
+<b:Sources xmlns:b="http://schemas.openxmlformats.org/officeDocument/2006/bibliography" xmlns="http://schemas.openxmlformats.org/officeDocument/2006/bibliography" SelectedStyle="\APASixthEditionOfficeOnline.xsl" StyleName="APA" Version="6"/>
+</file>
+
+<file path=customXml/itemProps1.xml><?xml version="1.0" encoding="utf-8"?>
+<ds:datastoreItem xmlns:ds="http://schemas.openxmlformats.org/officeDocument/2006/customXml" ds:itemID="{A7C08C84-0064-493D-9EFF-23D8603AC943}">
+  <ds:schemaRefs>
+    <ds:schemaRef ds:uri="http://schemas.openxmlformats.org/officeDocument/2006/bibliography"/>
+  </ds:schemaRefs>
+</ds:datastoreItem>
 </file>
</xml_diff>

<commit_message>
chore: remove stray working files, refresh exhibits, fix template placeholders
Deleted 17 leftover scratch files from earlier debugging (template drafts,
duplicate reports, screenshots, and a stray absolute-path .cjs file).

Added 5 updated exhibit documents for Google Chat and Slack-to-Teams
combinations. Content differs from the existing "(1)" variants already
tracked, so these are new revisions rather than duplicates.

MultiCombinations.docx: re-saved to merge fragmented text runs. Word's
spellchecker had split every {{placeholder}} into separate runs, which
prevents literal-string substitution from finding them. Visible text is
unchanged; footer page totals now use a NUMPAGES field instead of a
hardcoded 16.

Co-Authored-By: Claude Opus 5 (1M context) <noreply@anthropic.com>
</commit_message>
<xml_diff>
--- a/backend-templates/MultiCombinations.docx
+++ b/backend-templates/MultiCombinations.docx
@@ -1,6 +1,6 @@
 
 <file path=word/document.xml><?xml version="1.0" encoding="utf-8"?>
-<w:document xmlns:wpc="http://schemas.microsoft.com/office/word/2010/wordprocessingCanvas" xmlns:cx="http://schemas.microsoft.com/office/drawing/2014/chartex" xmlns:cx1="http://schemas.microsoft.com/office/drawing/2015/9/8/chartex" xmlns:cx2="http://schemas.microsoft.com/office/drawing/2015/10/21/chartex" xmlns:cx3="http://schemas.microsoft.com/office/drawing/2016/5/9/chartex" xmlns:cx4="http://schemas.microsoft.com/office/drawing/2016/5/10/chartex" xmlns:cx5="http://schemas.microsoft.com/office/drawing/2016/5/11/chartex" xmlns:cx6="http://schemas.microsoft.com/office/drawing/2016/5/12/chartex" xmlns:cx7="http://schemas.microsoft.com/office/drawing/2016/5/13/chartex" xmlns:cx8="http://schemas.microsoft.com/office/drawing/2016/5/14/chartex" xmlns:mc="http://schemas.openxmlformats.org/markup-compatibility/2006" xmlns:aink="http://schemas.microsoft.com/office/drawing/2016/ink" xmlns:am3d="http://schemas.microsoft.com/office/drawing/2017/model3d" xmlns:o="urn:schemas-microsoft-com:office:office" xmlns:oel="http://schemas.microsoft.com/office/2019/extlst" xmlns:r="http://schemas.openxmlformats.org/officeDocument/2006/relationships" xmlns:m="http://schemas.openxmlformats.org/officeDocument/2006/math" xmlns:v="urn:schemas-microsoft-com:vml" xmlns:wp14="http://schemas.microsoft.com/office/word/2010/wordprocessingDrawing" xmlns:wp="http://schemas.openxmlformats.org/drawingml/2006/wordprocessingDrawing" xmlns:w10="urn:schemas-microsoft-com:office:word" xmlns:w="http://schemas.openxmlformats.org/wordprocessingml/2006/main" xmlns:w14="http://schemas.microsoft.com/office/word/2010/wordml" xmlns:w15="http://schemas.microsoft.com/office/word/2012/wordml" xmlns:w16cex="http://schemas.microsoft.com/office/word/2018/wordml/cex" xmlns:w16cid="http://schemas.microsoft.com/office/word/2016/wordml/cid" xmlns:w16="http://schemas.microsoft.com/office/word/2018/wordml" xmlns:w16du="http://schemas.microsoft.com/office/word/2023/wordml/word16du" xmlns:w16sdtdh="http://schemas.microsoft.com/office/word/2020/wordml/sdtdatahash" xmlns:w16sdtfl="http://schemas.microsoft.com/office/word/2024/wordml/sdtformatlock" xmlns:w16se="http://schemas.microsoft.com/office/word/2015/wordml/symex" xmlns:wpg="http://schemas.microsoft.com/office/word/2010/wordprocessingGroup" xmlns:wpi="http://schemas.microsoft.com/office/word/2010/wordprocessingInk" xmlns:wne="http://schemas.microsoft.com/office/word/2006/wordml" xmlns:wps="http://schemas.microsoft.com/office/word/2010/wordprocessingShape" mc:Ignorable="w14 w15 w16se w16cid w16 w16cex w16sdtdh w16sdtfl w16du wp14">
+<w:document xmlns:wpc="http://schemas.microsoft.com/office/word/2010/wordprocessingCanvas" xmlns:cx="http://schemas.microsoft.com/office/drawing/2014/chartex" xmlns:cx1="http://schemas.microsoft.com/office/drawing/2015/9/8/chartex" xmlns:cx2="http://schemas.microsoft.com/office/drawing/2015/10/21/chartex" xmlns:cx3="http://schemas.microsoft.com/office/drawing/2016/5/9/chartex" xmlns:cx4="http://schemas.microsoft.com/office/drawing/2016/5/10/chartex" xmlns:cx5="http://schemas.microsoft.com/office/drawing/2016/5/11/chartex" xmlns:cx6="http://schemas.microsoft.com/office/drawing/2016/5/12/chartex" xmlns:cx7="http://schemas.microsoft.com/office/drawing/2016/5/13/chartex" xmlns:cx8="http://schemas.microsoft.com/office/drawing/2016/5/14/chartex" xmlns:mc="http://schemas.openxmlformats.org/markup-compatibility/2006" xmlns:aink="http://schemas.microsoft.com/office/drawing/2016/ink" xmlns:am3d="http://schemas.microsoft.com/office/drawing/2017/model3d" xmlns:o="urn:schemas-microsoft-com:office:office" xmlns:oel="http://schemas.microsoft.com/office/2019/extlst" xmlns:r="http://schemas.openxmlformats.org/officeDocument/2006/relationships" xmlns:m="http://schemas.openxmlformats.org/officeDocument/2006/math" xmlns:v="urn:schemas-microsoft-com:vml" xmlns:wp14="http://schemas.microsoft.com/office/word/2010/wordprocessingDrawing" xmlns:wp="http://schemas.openxmlformats.org/drawingml/2006/wordprocessingDrawing" xmlns:w10="urn:schemas-microsoft-com:office:word" xmlns:w="http://schemas.openxmlformats.org/wordprocessingml/2006/main" xmlns:w14="http://schemas.microsoft.com/office/word/2010/wordml" xmlns:w15="http://schemas.microsoft.com/office/word/2012/wordml" xmlns:w16cei="http://schemas.microsoft.com/office/word/2026/wordml/cei" xmlns:w16cex="http://schemas.microsoft.com/office/word/2018/wordml/cex" xmlns:w16cid="http://schemas.microsoft.com/office/word/2016/wordml/cid" xmlns:w16="http://schemas.microsoft.com/office/word/2018/wordml" xmlns:w16du="http://schemas.microsoft.com/office/word/2023/wordml/word16du" xmlns:w16sdtdh="http://schemas.microsoft.com/office/word/2020/wordml/sdtdatahash" xmlns:w16sdtfl="http://schemas.microsoft.com/office/word/2024/wordml/sdtformatlock" xmlns:w16se="http://schemas.microsoft.com/office/word/2015/wordml/symex" xmlns:wpg="http://schemas.microsoft.com/office/word/2010/wordprocessingGroup" xmlns:wpi="http://schemas.microsoft.com/office/word/2010/wordprocessingInk" xmlns:wne="http://schemas.microsoft.com/office/word/2006/wordml" xmlns:wps="http://schemas.microsoft.com/office/word/2010/wordprocessingShape" mc:Ignorable="w14 w15 w16se w16cid w16 w16cex w16sdtdh w16sdtfl w16du wp14">
   <w:body>
     <w:p>
       <w:pPr>
@@ -8,34 +8,18 @@
         <w:ind w:left="0" w:firstLine="0"/>
         <w:jc w:val="center"/>
       </w:pPr>
-      <w:proofErr w:type="spellStart"/>
       <w:r>
         <w:rPr>
           <w:b/>
         </w:rPr>
-        <w:t>CloudFuze</w:t>
-      </w:r>
-      <w:proofErr w:type="spellEnd"/>
-      <w:r>
-        <w:rPr>
-          <w:b/>
-        </w:rPr>
-        <w:t xml:space="preserve"> Purchase Agreement for </w:t>
+        <w:t xml:space="preserve">CloudFuze Purchase Agreement for </w:t>
       </w:r>
       <w:r>
         <w:rPr>
           <w:b/>
           <w:bCs/>
         </w:rPr>
-        <w:t>{{</w:t>
-      </w:r>
-      <w:proofErr w:type="spellStart"/>
-      <w:r>
-        <w:rPr>
-          <w:b/>
-          <w:bCs/>
-        </w:rPr>
-        <w:t>Company</w:t>
+        <w:t>{{Company</w:t>
       </w:r>
       <w:r>
         <w:rPr>
@@ -51,62 +35,53 @@
           <w:bCs/>
           <w:spacing w:val="-2"/>
         </w:rPr>
-        <w:t>Name</w:t>
-      </w:r>
-      <w:proofErr w:type="spellEnd"/>
+        <w:t>Name}}</w:t>
+      </w:r>
+    </w:p>
+    <w:p>
+      <w:pPr>
+        <w:spacing w:after="588" w:line="265" w:lineRule="auto"/>
+        <w:ind w:left="-5"/>
+        <w:rPr>
+          <w:sz w:val="21"/>
+          <w:szCs w:val="21"/>
+        </w:rPr>
+      </w:pPr>
+      <w:r>
+        <w:rPr>
+          <w:sz w:val="21"/>
+          <w:szCs w:val="21"/>
+        </w:rPr>
+        <w:t xml:space="preserve">This agreement provides </w:t>
+      </w:r>
+      <w:r>
+        <w:rPr>
+          <w:b/>
+          <w:bCs/>
+          <w:sz w:val="21"/>
+          <w:szCs w:val="21"/>
+        </w:rPr>
+        <w:t>{{Company</w:t>
+      </w:r>
+      <w:r>
+        <w:rPr>
+          <w:b/>
+          <w:bCs/>
+          <w:spacing w:val="-7"/>
+          <w:sz w:val="21"/>
+          <w:szCs w:val="21"/>
+        </w:rPr>
+        <w:t>_</w:t>
+      </w:r>
       <w:r>
         <w:rPr>
           <w:b/>
           <w:bCs/>
           <w:spacing w:val="-2"/>
-        </w:rPr>
-        <w:t>}}</w:t>
-      </w:r>
-    </w:p>
-    <w:p>
-      <w:pPr>
-        <w:spacing w:after="588" w:line="265" w:lineRule="auto"/>
-        <w:ind w:left="-5"/>
-        <w:rPr>
-          <w:sz w:val="21"/>
-          <w:szCs w:val="21"/>
-        </w:rPr>
-      </w:pPr>
-      <w:r>
-        <w:rPr>
-          <w:sz w:val="21"/>
-          <w:szCs w:val="21"/>
-        </w:rPr>
-        <w:t xml:space="preserve">This agreement provides </w:t>
-      </w:r>
-      <w:r>
-        <w:rPr>
-          <w:b/>
-          <w:bCs/>
-          <w:sz w:val="21"/>
-          <w:szCs w:val="21"/>
-        </w:rPr>
-        <w:t>{{</w:t>
-      </w:r>
-      <w:proofErr w:type="spellStart"/>
-      <w:r>
-        <w:rPr>
-          <w:b/>
-          <w:bCs/>
-          <w:sz w:val="21"/>
-          <w:szCs w:val="21"/>
-        </w:rPr>
-        <w:t>Company</w:t>
-      </w:r>
-      <w:r>
-        <w:rPr>
-          <w:b/>
-          <w:bCs/>
-          <w:spacing w:val="-7"/>
-          <w:sz w:val="21"/>
-          <w:szCs w:val="21"/>
-        </w:rPr>
-        <w:t>_</w:t>
+          <w:sz w:val="21"/>
+          <w:szCs w:val="21"/>
+        </w:rPr>
+        <w:t>Name}}</w:t>
       </w:r>
       <w:r>
         <w:rPr>
@@ -116,27 +91,6 @@
           <w:sz w:val="21"/>
           <w:szCs w:val="21"/>
         </w:rPr>
-        <w:t>Name</w:t>
-      </w:r>
-      <w:proofErr w:type="spellEnd"/>
-      <w:r>
-        <w:rPr>
-          <w:b/>
-          <w:bCs/>
-          <w:spacing w:val="-2"/>
-          <w:sz w:val="21"/>
-          <w:szCs w:val="21"/>
-        </w:rPr>
-        <w:t>}}</w:t>
-      </w:r>
-      <w:r>
-        <w:rPr>
-          <w:b/>
-          <w:bCs/>
-          <w:spacing w:val="-2"/>
-          <w:sz w:val="21"/>
-          <w:szCs w:val="21"/>
-        </w:rPr>
         <w:t xml:space="preserve"> </w:t>
       </w:r>
       <w:r>
@@ -144,23 +98,7 @@
           <w:sz w:val="21"/>
           <w:szCs w:val="21"/>
         </w:rPr>
-        <w:t xml:space="preserve">with pricing for use of the </w:t>
-      </w:r>
-      <w:proofErr w:type="spellStart"/>
-      <w:r>
-        <w:rPr>
-          <w:sz w:val="21"/>
-          <w:szCs w:val="21"/>
-        </w:rPr>
-        <w:t>CloudFuze’s</w:t>
-      </w:r>
-      <w:proofErr w:type="spellEnd"/>
-      <w:r>
-        <w:rPr>
-          <w:sz w:val="21"/>
-          <w:szCs w:val="21"/>
-        </w:rPr>
-        <w:t xml:space="preserve"> X-Change Enterprise Data Migration Solution:</w:t>
+        <w:t>with pricing for use of the CloudFuze’s X-Change Enterprise Data Migration Solution:</w:t>
       </w:r>
     </w:p>
     <w:p>
@@ -447,23 +385,7 @@
                 <w:sz w:val="21"/>
                 <w:szCs w:val="21"/>
               </w:rPr>
-              <w:t>{{</w:t>
-            </w:r>
-            <w:proofErr w:type="spellStart"/>
-            <w:r>
-              <w:rPr>
-                <w:sz w:val="21"/>
-                <w:szCs w:val="21"/>
-              </w:rPr>
-              <w:t>exhibitType</w:t>
-            </w:r>
-            <w:proofErr w:type="spellEnd"/>
-            <w:r>
-              <w:rPr>
-                <w:sz w:val="21"/>
-                <w:szCs w:val="21"/>
-              </w:rPr>
-              <w:t>}}</w:t>
+              <w:t>{{exhibitType}}</w:t>
             </w:r>
           </w:p>
         </w:tc>
@@ -495,25 +417,7 @@
                 <w:sz w:val="21"/>
                 <w:szCs w:val="21"/>
               </w:rPr>
-              <w:t>{{</w:t>
-            </w:r>
-            <w:proofErr w:type="spellStart"/>
-            <w:r>
-              <w:rPr>
-                <w:bCs/>
-                <w:sz w:val="21"/>
-                <w:szCs w:val="21"/>
-              </w:rPr>
-              <w:t>exhibitDesc</w:t>
-            </w:r>
-            <w:proofErr w:type="spellEnd"/>
-            <w:r>
-              <w:rPr>
-                <w:bCs/>
-                <w:sz w:val="21"/>
-                <w:szCs w:val="21"/>
-              </w:rPr>
-              <w:t>}}</w:t>
+              <w:t>{{exhibitDesc}}</w:t>
             </w:r>
           </w:p>
         </w:tc>
@@ -542,23 +446,7 @@
                 <w:sz w:val="21"/>
                 <w:szCs w:val="21"/>
               </w:rPr>
-              <w:t>{{</w:t>
-            </w:r>
-            <w:proofErr w:type="spellStart"/>
-            <w:r>
-              <w:rPr>
-                <w:sz w:val="21"/>
-                <w:szCs w:val="21"/>
-              </w:rPr>
-              <w:t>exhibitPrice</w:t>
-            </w:r>
-            <w:proofErr w:type="spellEnd"/>
-            <w:r>
-              <w:rPr>
-                <w:sz w:val="21"/>
-                <w:szCs w:val="21"/>
-              </w:rPr>
-              <w:t>}}</w:t>
+              <w:t>{{exhibitPrice}}</w:t>
             </w:r>
           </w:p>
         </w:tc>
@@ -815,25 +703,7 @@
                 <w:sz w:val="21"/>
                 <w:szCs w:val="21"/>
               </w:rPr>
-              <w:t>Valid for {{</w:t>
-            </w:r>
-            <w:proofErr w:type="spellStart"/>
-            <w:r>
-              <w:rPr>
-                <w:bCs/>
-                <w:sz w:val="21"/>
-                <w:szCs w:val="21"/>
-              </w:rPr>
-              <w:t>Duration_of_months</w:t>
-            </w:r>
-            <w:proofErr w:type="spellEnd"/>
-            <w:r>
-              <w:rPr>
-                <w:bCs/>
-                <w:sz w:val="21"/>
-                <w:szCs w:val="21"/>
-              </w:rPr>
-              <w:t>}} Months</w:t>
+              <w:t>Valid for {{Duration_of_months}} Months</w:t>
             </w:r>
           </w:p>
         </w:tc>
@@ -862,23 +732,7 @@
                 <w:sz w:val="21"/>
                 <w:szCs w:val="21"/>
               </w:rPr>
-              <w:t>{{</w:t>
-            </w:r>
-            <w:proofErr w:type="spellStart"/>
-            <w:r>
-              <w:rPr>
-                <w:sz w:val="21"/>
-                <w:szCs w:val="21"/>
-              </w:rPr>
-              <w:t>price_migration</w:t>
-            </w:r>
-            <w:proofErr w:type="spellEnd"/>
-            <w:r>
-              <w:rPr>
-                <w:sz w:val="21"/>
-                <w:szCs w:val="21"/>
-              </w:rPr>
-              <w:t>}}</w:t>
+              <w:t>{{price_migration}}</w:t>
             </w:r>
           </w:p>
         </w:tc>
@@ -964,23 +818,7 @@
                 <w:sz w:val="21"/>
                 <w:szCs w:val="21"/>
               </w:rPr>
-              <w:t>{{</w:t>
-            </w:r>
-            <w:proofErr w:type="spellStart"/>
-            <w:r>
-              <w:rPr>
-                <w:sz w:val="21"/>
-                <w:szCs w:val="21"/>
-              </w:rPr>
-              <w:t>serverDescription</w:t>
-            </w:r>
-            <w:proofErr w:type="spellEnd"/>
-            <w:r>
-              <w:rPr>
-                <w:sz w:val="21"/>
-                <w:szCs w:val="21"/>
-              </w:rPr>
-              <w:t>}}</w:t>
+              <w:t>{{serverDescription}}</w:t>
             </w:r>
             <w:r>
               <w:rPr>
@@ -988,23 +826,7 @@
                 <w:szCs w:val="21"/>
               </w:rPr>
               <w:br/>
-              <w:t>{{</w:t>
-            </w:r>
-            <w:proofErr w:type="spellStart"/>
-            <w:r>
-              <w:rPr>
-                <w:sz w:val="21"/>
-                <w:szCs w:val="21"/>
-              </w:rPr>
-              <w:t>combinationName</w:t>
-            </w:r>
-            <w:proofErr w:type="spellEnd"/>
-            <w:r>
-              <w:rPr>
-                <w:sz w:val="21"/>
-                <w:szCs w:val="21"/>
-              </w:rPr>
-              <w:t>}}</w:t>
+              <w:t>{{combinationName}}</w:t>
             </w:r>
             <w:r>
               <w:rPr>
@@ -1012,23 +834,7 @@
                 <w:szCs w:val="21"/>
               </w:rPr>
               <w:br/>
-              <w:t>Instance Valid for {{</w:t>
-            </w:r>
-            <w:proofErr w:type="spellStart"/>
-            <w:r>
-              <w:rPr>
-                <w:sz w:val="21"/>
-                <w:szCs w:val="21"/>
-              </w:rPr>
-              <w:t>serverMonths</w:t>
-            </w:r>
-            <w:proofErr w:type="spellEnd"/>
-            <w:r>
-              <w:rPr>
-                <w:sz w:val="21"/>
-                <w:szCs w:val="21"/>
-              </w:rPr>
-              <w:t>}} Months</w:t>
+              <w:t>Instance Valid for {{serverMonths}} Months</w:t>
             </w:r>
           </w:p>
         </w:tc>
@@ -1066,23 +872,7 @@
                 <w:sz w:val="21"/>
                 <w:szCs w:val="21"/>
               </w:rPr>
-              <w:t>{{</w:t>
-            </w:r>
-            <w:proofErr w:type="spellStart"/>
-            <w:r>
-              <w:rPr>
-                <w:sz w:val="21"/>
-                <w:szCs w:val="21"/>
-              </w:rPr>
-              <w:t>serverPrice</w:t>
-            </w:r>
-            <w:proofErr w:type="spellEnd"/>
-            <w:r>
-              <w:rPr>
-                <w:sz w:val="21"/>
-                <w:szCs w:val="21"/>
-              </w:rPr>
-              <w:t>}}</w:t>
+              <w:t>{{serverPrice}}</w:t>
             </w:r>
           </w:p>
           <w:p>
@@ -1255,25 +1045,7 @@
                 <w:sz w:val="21"/>
                 <w:szCs w:val="21"/>
               </w:rPr>
-              <w:t>{{</w:t>
-            </w:r>
-            <w:proofErr w:type="spellStart"/>
-            <w:r>
-              <w:rPr>
-                <w:b/>
-                <w:sz w:val="21"/>
-                <w:szCs w:val="21"/>
-              </w:rPr>
-              <w:t>discount_percent</w:t>
-            </w:r>
-            <w:proofErr w:type="spellEnd"/>
-            <w:r>
-              <w:rPr>
-                <w:b/>
-                <w:sz w:val="21"/>
-                <w:szCs w:val="21"/>
-              </w:rPr>
-              <w:t>}}%</w:t>
+              <w:t>{{discount_percent}}%</w:t>
             </w:r>
             <w:r>
               <w:rPr>
@@ -1311,23 +1083,7 @@
                 <w:sz w:val="21"/>
                 <w:szCs w:val="21"/>
               </w:rPr>
-              <w:t>{{</w:t>
-            </w:r>
-            <w:proofErr w:type="spellStart"/>
-            <w:r>
-              <w:rPr>
-                <w:sz w:val="21"/>
-                <w:szCs w:val="21"/>
-              </w:rPr>
-              <w:t>discount_amount</w:t>
-            </w:r>
-            <w:proofErr w:type="spellEnd"/>
-            <w:r>
-              <w:rPr>
-                <w:sz w:val="21"/>
-                <w:szCs w:val="21"/>
-              </w:rPr>
-              <w:t>}}</w:t>
+              <w:t>{{discount_amount}}</w:t>
             </w:r>
           </w:p>
         </w:tc>
@@ -1420,25 +1176,7 @@
                 <w:sz w:val="21"/>
                 <w:szCs w:val="21"/>
               </w:rPr>
-              <w:t>{{</w:t>
-            </w:r>
-            <w:proofErr w:type="spellStart"/>
-            <w:r>
-              <w:rPr>
-                <w:b/>
-                <w:sz w:val="21"/>
-                <w:szCs w:val="21"/>
-              </w:rPr>
-              <w:t>total_price_discount</w:t>
-            </w:r>
-            <w:proofErr w:type="spellEnd"/>
-            <w:r>
-              <w:rPr>
-                <w:b/>
-                <w:sz w:val="21"/>
-                <w:szCs w:val="21"/>
-              </w:rPr>
-              <w:t>}}</w:t>
+              <w:t>{{total_price_discount}}</w:t>
             </w:r>
           </w:p>
         </w:tc>
@@ -1607,97 +1345,7 @@
           <w:sz w:val="21"/>
           <w:szCs w:val="21"/>
         </w:rPr>
-        <w:t>{{#exhibits}}Overage Charges for {{</w:t>
-      </w:r>
-      <w:proofErr w:type="spellStart"/>
-      <w:r>
-        <w:rPr>
-          <w:b/>
-          <w:sz w:val="21"/>
-          <w:szCs w:val="21"/>
-        </w:rPr>
-        <w:t>exhibitCombinationName</w:t>
-      </w:r>
-      <w:proofErr w:type="spellEnd"/>
-      <w:r>
-        <w:rPr>
-          <w:b/>
-          <w:sz w:val="21"/>
-          <w:szCs w:val="21"/>
-        </w:rPr>
-        <w:t>}}: {{</w:t>
-      </w:r>
-      <w:proofErr w:type="spellStart"/>
-      <w:r>
-        <w:rPr>
-          <w:b/>
-          <w:sz w:val="21"/>
-          <w:szCs w:val="21"/>
-        </w:rPr>
-        <w:t>exhibitOveragePerUser</w:t>
-      </w:r>
-      <w:proofErr w:type="spellEnd"/>
-      <w:r>
-        <w:rPr>
-          <w:b/>
-          <w:sz w:val="21"/>
-          <w:szCs w:val="21"/>
-        </w:rPr>
-        <w:t>}} per User | {{</w:t>
-      </w:r>
-      <w:proofErr w:type="spellStart"/>
-      <w:r>
-        <w:rPr>
-          <w:b/>
-          <w:sz w:val="21"/>
-          <w:szCs w:val="21"/>
-        </w:rPr>
-        <w:t>exhibitOveragePerServer</w:t>
-      </w:r>
-      <w:proofErr w:type="spellEnd"/>
-      <w:r>
-        <w:rPr>
-          <w:b/>
-          <w:sz w:val="21"/>
-          <w:szCs w:val="21"/>
-        </w:rPr>
-        <w:t>}} per server per month{{#exhibitOveragePerGB}} | {{</w:t>
-      </w:r>
-      <w:proofErr w:type="spellStart"/>
-      <w:r>
-        <w:rPr>
-          <w:b/>
-          <w:sz w:val="21"/>
-          <w:szCs w:val="21"/>
-        </w:rPr>
-        <w:t>exhibitOveragePerGB</w:t>
-      </w:r>
-      <w:proofErr w:type="spellEnd"/>
-      <w:r>
-        <w:rPr>
-          <w:b/>
-          <w:sz w:val="21"/>
-          <w:szCs w:val="21"/>
-        </w:rPr>
-        <w:t>}} per GB{{/</w:t>
-      </w:r>
-      <w:proofErr w:type="spellStart"/>
-      <w:r>
-        <w:rPr>
-          <w:b/>
-          <w:sz w:val="21"/>
-          <w:szCs w:val="21"/>
-        </w:rPr>
-        <w:t>exhibitOveragePerGB</w:t>
-      </w:r>
-      <w:proofErr w:type="spellEnd"/>
-      <w:r>
-        <w:rPr>
-          <w:b/>
-          <w:sz w:val="21"/>
-          <w:szCs w:val="21"/>
-        </w:rPr>
-        <w:t>}}</w:t>
+        <w:t>{{#exhibits}}Overage Charges for {{exhibitCombinationName}}: {{exhibitOveragePerUser}} per User | {{exhibitOveragePerServer}} per server per month{{#exhibitOveragePerGB}} | {{exhibitOveragePerGB}} per GB{{/exhibitOveragePerGB}}</w:t>
       </w:r>
       <w:r>
         <w:rPr>
@@ -1781,39 +1429,7 @@
           <w:sz w:val="21"/>
           <w:szCs w:val="21"/>
         </w:rPr>
-        <w:t>{{</w:t>
-      </w:r>
-      <w:proofErr w:type="spellStart"/>
-      <w:r>
-        <w:rPr>
-          <w:sz w:val="21"/>
-          <w:szCs w:val="21"/>
-        </w:rPr>
-        <w:t>Start_date</w:t>
-      </w:r>
-      <w:proofErr w:type="spellEnd"/>
-      <w:r>
-        <w:rPr>
-          <w:sz w:val="21"/>
-          <w:szCs w:val="21"/>
-        </w:rPr>
-        <w:t>}} till {{</w:t>
-      </w:r>
-      <w:proofErr w:type="spellStart"/>
-      <w:r>
-        <w:rPr>
-          <w:sz w:val="21"/>
-          <w:szCs w:val="21"/>
-        </w:rPr>
-        <w:t>End_date</w:t>
-      </w:r>
-      <w:proofErr w:type="spellEnd"/>
-      <w:r>
-        <w:rPr>
-          <w:sz w:val="21"/>
-          <w:szCs w:val="21"/>
-        </w:rPr>
-        <w:t>}}</w:t>
+        <w:t>{{Start_date}} till {{End_date}}</w:t>
       </w:r>
       <w:bookmarkEnd w:id="0"/>
     </w:p>
@@ -1886,23 +1502,13 @@
           <w:sz w:val="21"/>
         </w:rPr>
       </w:pPr>
-      <w:proofErr w:type="spellStart"/>
       <w:r>
         <w:rPr>
           <w:b/>
           <w:sz w:val="21"/>
           <w:szCs w:val="21"/>
         </w:rPr>
-        <w:t>CloudFuze</w:t>
-      </w:r>
-      <w:proofErr w:type="spellEnd"/>
-      <w:r>
-        <w:rPr>
-          <w:b/>
-          <w:sz w:val="21"/>
-          <w:szCs w:val="21"/>
-        </w:rPr>
-        <w:t>, Inc. with a place of business at 600 Park Offices Dr, suite#LL-52 Durham, NC 27709 (“Company”), and the Customer listed above (“Customer”). This Agreement includes and incorporates the above Order Form, Included in Migration Exhibit ("Exhibit 1"), Not included in Migration Exhibit ("Exhibit 2"), all attachments hereto, as well as the attached Terms and Conditions and contains, among other things, warranty disclaimers, liability limitations and use limitations. There shall be no force or effect to any different terms of any related purchase order or similar form even if signed by the parties after the date hereof.</w:t>
+        <w:t>CloudFuze, Inc. with a place of business at 600 Park Offices Dr, suite#LL-52 Durham, NC 27709 (“Company”), and the Customer listed above (“Customer”). This Agreement includes and incorporates the above Order Form, Included in Migration Exhibit ("Exhibit 1"), Not included in Migration Exhibit ("Exhibit 2"), all attachments hereto, as well as the attached Terms and Conditions and contains, among other things, warranty disclaimers, liability limitations and use limitations. There shall be no force or effect to any different terms of any related purchase order or similar form even if signed by the parties after the date hereof.</w:t>
       </w:r>
       <w:r>
         <w:rPr>
@@ -2039,25 +1645,7 @@
                 <w:bCs/>
                 <w:u w:val="single"/>
               </w:rPr>
-              <w:t xml:space="preserve">For </w:t>
-            </w:r>
-            <w:proofErr w:type="spellStart"/>
-            <w:r>
-              <w:rPr>
-                <w:b/>
-                <w:bCs/>
-                <w:u w:val="single"/>
-              </w:rPr>
-              <w:t>CloudFuze</w:t>
-            </w:r>
-            <w:proofErr w:type="spellEnd"/>
-            <w:r>
-              <w:rPr>
-                <w:b/>
-                <w:bCs/>
-                <w:u w:val="single"/>
-              </w:rPr>
-              <w:t>, Inc.</w:t>
+              <w:t>For CloudFuze, Inc.</w:t>
             </w:r>
           </w:p>
           <w:p>
@@ -2140,16 +1728,7 @@
                 <w:bCs/>
                 <w:u w:val="single"/>
               </w:rPr>
-              <w:t>{{</w:t>
-            </w:r>
-            <w:proofErr w:type="spellStart"/>
-            <w:r>
-              <w:rPr>
-                <w:b/>
-                <w:bCs/>
-                <w:u w:val="single"/>
-              </w:rPr>
-              <w:t>Company</w:t>
+              <w:t>{{Company</w:t>
             </w:r>
             <w:r>
               <w:rPr>
@@ -2167,17 +1746,7 @@
                 <w:spacing w:val="-2"/>
                 <w:u w:val="single"/>
               </w:rPr>
-              <w:t>Name</w:t>
-            </w:r>
-            <w:proofErr w:type="spellEnd"/>
-            <w:r>
-              <w:rPr>
-                <w:b/>
-                <w:bCs/>
-                <w:spacing w:val="-2"/>
-                <w:u w:val="single"/>
-              </w:rPr>
-              <w:t>}}</w:t>
+              <w:t>Name}}</w:t>
             </w:r>
           </w:p>
           <w:p>
@@ -2352,71 +1921,7 @@
           <w:sz w:val="21"/>
           <w:szCs w:val="21"/>
         </w:rPr>
-        <w:t>Each party (the “Receiving Party”) understands that the other party (the “Disclosing Party”) has disclosed or may disclose business, technical or financial information relating to the Disclosing Party’s business (hereinafter referred to as “Proprietary Information” of the Disclosing Party). Proprietary Information of Company includes non-public information regarding features, functionality and performance of the Service. Proprietary Information of Customer includes non-public data provided by Customer to Company to enable the provision of the Services (“Customer Data”). The Receiving Party agrees: (</w:t>
-      </w:r>
-      <w:proofErr w:type="spellStart"/>
-      <w:r>
-        <w:rPr>
-          <w:sz w:val="21"/>
-          <w:szCs w:val="21"/>
-        </w:rPr>
-        <w:t>i</w:t>
-      </w:r>
-      <w:proofErr w:type="spellEnd"/>
-      <w:r>
-        <w:rPr>
-          <w:sz w:val="21"/>
-          <w:szCs w:val="21"/>
-        </w:rPr>
-        <w:t xml:space="preserve">) to take reasonable precautions to protect such Proprietary Information, and (ii) not to use (except in performance of the Services or as otherwise permitted herein) or divulge to any third person any such Proprietary Information. The Disclosing Party agrees that the foregoing shall not apply with respect to any information after five (5) years following the disclosure thereof or any information that the Receiving Party can document (a) is or becomes generally available to the public, or (b) was in its possession or known by </w:t>
-      </w:r>
-      <w:proofErr w:type="spellStart"/>
-      <w:r>
-        <w:rPr>
-          <w:sz w:val="21"/>
-          <w:szCs w:val="21"/>
-        </w:rPr>
-        <w:t>it</w:t>
-      </w:r>
-      <w:proofErr w:type="spellEnd"/>
-      <w:r>
-        <w:rPr>
-          <w:sz w:val="21"/>
-          <w:szCs w:val="21"/>
-        </w:rPr>
-        <w:t xml:space="preserve"> prior to receipt from the Disclosing Party, or (c) was rightfully disclosed to it without restriction by a third party, or (d) was independently developed without use of any Proprietary Information of the Disclosing Party or (e) is required to be disclosed by law. Customer shall own all right, title and interest in and to the Customer Data, as well as any data that is based on or derived from the Customer Data and provided to Customer as part of the Services. Company shall own and retain all right, title and interest in and to (a) the Services and Software, all improvements, enhancements or modifications thereto, (b) any software, applications, inventions or other technology developed in connection with Implementation Services or support, and (c) all intellectual property rights related to any of the foregoing. Notwithstanding anything to the contrary, Company shall have the right collect and </w:t>
-      </w:r>
-      <w:proofErr w:type="spellStart"/>
-      <w:r>
-        <w:rPr>
-          <w:sz w:val="21"/>
-          <w:szCs w:val="21"/>
-        </w:rPr>
-        <w:t>analyze</w:t>
-      </w:r>
-      <w:proofErr w:type="spellEnd"/>
-      <w:r>
-        <w:rPr>
-          <w:sz w:val="21"/>
-          <w:szCs w:val="21"/>
-        </w:rPr>
-        <w:t xml:space="preserve"> data and other information relating to the provision, use and performance of various aspects of the Services and related systems and technologies (including, without limitation, information concerning Customer Data and data derived there from), and Company will be free (during and after the term hereof) to (</w:t>
-      </w:r>
-      <w:proofErr w:type="spellStart"/>
-      <w:r>
-        <w:rPr>
-          <w:sz w:val="21"/>
-          <w:szCs w:val="21"/>
-        </w:rPr>
-        <w:t>i</w:t>
-      </w:r>
-      <w:proofErr w:type="spellEnd"/>
-      <w:r>
-        <w:rPr>
-          <w:sz w:val="21"/>
-          <w:szCs w:val="21"/>
-        </w:rPr>
-        <w:t>) use such information and data to improve and enhance the Services and for other development, diagnostic and corrective purposes in connection with the Services and other Company offerings, and (ii) disclose such data solely in aggregate or other de-identified form in connection with its business. No rights or licenses are granted except as expressly set forth herein.</w:t>
+        <w:t>Each party (the “Receiving Party”) understands that the other party (the “Disclosing Party”) has disclosed or may disclose business, technical or financial information relating to the Disclosing Party’s business (hereinafter referred to as “Proprietary Information” of the Disclosing Party). Proprietary Information of Company includes non-public information regarding features, functionality and performance of the Service. Proprietary Information of Customer includes non-public data provided by Customer to Company to enable the provision of the Services (“Customer Data”). The Receiving Party agrees: (i) to take reasonable precautions to protect such Proprietary Information, and (ii) not to use (except in performance of the Services or as otherwise permitted herein) or divulge to any third person any such Proprietary Information. The Disclosing Party agrees that the foregoing shall not apply with respect to any information after five (5) years following the disclosure thereof or any information that the Receiving Party can document (a) is or becomes generally available to the public, or (b) was in its possession or known by it prior to receipt from the Disclosing Party, or (c) was rightfully disclosed to it without restriction by a third party, or (d) was independently developed without use of any Proprietary Information of the Disclosing Party or (e) is required to be disclosed by law. Customer shall own all right, title and interest in and to the Customer Data, as well as any data that is based on or derived from the Customer Data and provided to Customer as part of the Services. Company shall own and retain all right, title and interest in and to (a) the Services and Software, all improvements, enhancements or modifications thereto, (b) any software, applications, inventions or other technology developed in connection with Implementation Services or support, and (c) all intellectual property rights related to any of the foregoing. Notwithstanding anything to the contrary, Company shall have the right collect and analyze data and other information relating to the provision, use and performance of various aspects of the Services and related systems and technologies (including, without limitation, information concerning Customer Data and data derived there from), and Company will be free (during and after the term hereof) to (i) use such information and data to improve and enhance the Services and for other development, diagnostic and corrective purposes in connection with the Services and other Company offerings, and (ii) disclose such data solely in aggregate or other de-identified form in connection with its business. No rights or licenses are granted except as expressly set forth herein.</w:t>
       </w:r>
     </w:p>
     <w:p>
@@ -2843,23 +2348,7 @@
           <w:sz w:val="21"/>
           <w:szCs w:val="21"/>
         </w:rPr>
-        <w:t xml:space="preserve">Company shall hold Customer harmless from liability to third parties resulting from infringement by the Service of any United States patent or any copyright or misappropriation of any trade secret, provided Company is promptly notified of any and all threats, claims and proceedings related thereto and given reasonable assistance and the opportunity to assume sole control over </w:t>
-      </w:r>
-      <w:proofErr w:type="spellStart"/>
-      <w:r>
-        <w:rPr>
-          <w:sz w:val="21"/>
-          <w:szCs w:val="21"/>
-        </w:rPr>
-        <w:t>defense</w:t>
-      </w:r>
-      <w:proofErr w:type="spellEnd"/>
-      <w:r>
-        <w:rPr>
-          <w:sz w:val="21"/>
-          <w:szCs w:val="21"/>
-        </w:rPr>
-        <w:t xml:space="preserve"> and settlement; Company will not be responsible for any settlement it does not approve in writing. The foregoing obligations do not apply with respect to portions or components of the Service</w:t>
+        <w:t>Company shall hold Customer harmless from liability to third parties resulting from infringement by the Service of any United States patent or any copyright or misappropriation of any trade secret, provided Company is promptly notified of any and all threats, claims and proceedings related thereto and given reasonable assistance and the opportunity to assume sole control over defense and settlement; Company will not be responsible for any settlement it does not approve in writing. The foregoing obligations do not apply with respect to portions or components of the Service</w:t>
       </w:r>
     </w:p>
     <w:p>
@@ -3593,6 +3082,7 @@
         </w:sectPr>
       </w:pPr>
       <w:r>
+        <w:lastRenderedPageBreak/>
         <w:br w:type="page"/>
       </w:r>
     </w:p>
@@ -3619,7 +3109,7 @@
 </file>
 
 <file path=word/endnotes.xml><?xml version="1.0" encoding="utf-8"?>
-<w:endnotes xmlns:wpc="http://schemas.microsoft.com/office/word/2010/wordprocessingCanvas" xmlns:cx="http://schemas.microsoft.com/office/drawing/2014/chartex" xmlns:cx1="http://schemas.microsoft.com/office/drawing/2015/9/8/chartex" xmlns:cx2="http://schemas.microsoft.com/office/drawing/2015/10/21/chartex" xmlns:cx3="http://schemas.microsoft.com/office/drawing/2016/5/9/chartex" xmlns:cx4="http://schemas.microsoft.com/office/drawing/2016/5/10/chartex" xmlns:cx5="http://schemas.microsoft.com/office/drawing/2016/5/11/chartex" xmlns:cx6="http://schemas.microsoft.com/office/drawing/2016/5/12/chartex" xmlns:cx7="http://schemas.microsoft.com/office/drawing/2016/5/13/chartex" xmlns:cx8="http://schemas.microsoft.com/office/drawing/2016/5/14/chartex" xmlns:mc="http://schemas.openxmlformats.org/markup-compatibility/2006" xmlns:aink="http://schemas.microsoft.com/office/drawing/2016/ink" xmlns:am3d="http://schemas.microsoft.com/office/drawing/2017/model3d" xmlns:o="urn:schemas-microsoft-com:office:office" xmlns:oel="http://schemas.microsoft.com/office/2019/extlst" xmlns:r="http://schemas.openxmlformats.org/officeDocument/2006/relationships" xmlns:m="http://schemas.openxmlformats.org/officeDocument/2006/math" xmlns:v="urn:schemas-microsoft-com:vml" xmlns:wp14="http://schemas.microsoft.com/office/word/2010/wordprocessingDrawing" xmlns:wp="http://schemas.openxmlformats.org/drawingml/2006/wordprocessingDrawing" xmlns:w10="urn:schemas-microsoft-com:office:word" xmlns:w="http://schemas.openxmlformats.org/wordprocessingml/2006/main" xmlns:w14="http://schemas.microsoft.com/office/word/2010/wordml" xmlns:w15="http://schemas.microsoft.com/office/word/2012/wordml" xmlns:w16cex="http://schemas.microsoft.com/office/word/2018/wordml/cex" xmlns:w16cid="http://schemas.microsoft.com/office/word/2016/wordml/cid" xmlns:w16="http://schemas.microsoft.com/office/word/2018/wordml" xmlns:w16du="http://schemas.microsoft.com/office/word/2023/wordml/word16du" xmlns:w16sdtdh="http://schemas.microsoft.com/office/word/2020/wordml/sdtdatahash" xmlns:w16sdtfl="http://schemas.microsoft.com/office/word/2024/wordml/sdtformatlock" xmlns:w16se="http://schemas.microsoft.com/office/word/2015/wordml/symex" xmlns:wpg="http://schemas.microsoft.com/office/word/2010/wordprocessingGroup" xmlns:wpi="http://schemas.microsoft.com/office/word/2010/wordprocessingInk" xmlns:wne="http://schemas.microsoft.com/office/word/2006/wordml" xmlns:wps="http://schemas.microsoft.com/office/word/2010/wordprocessingShape" mc:Ignorable="w14 w15 w16se w16cid w16 w16cex w16sdtdh w16sdtfl w16du wp14">
+<w:endnotes xmlns:wpc="http://schemas.microsoft.com/office/word/2010/wordprocessingCanvas" xmlns:cx="http://schemas.microsoft.com/office/drawing/2014/chartex" xmlns:cx1="http://schemas.microsoft.com/office/drawing/2015/9/8/chartex" xmlns:cx2="http://schemas.microsoft.com/office/drawing/2015/10/21/chartex" xmlns:cx3="http://schemas.microsoft.com/office/drawing/2016/5/9/chartex" xmlns:cx4="http://schemas.microsoft.com/office/drawing/2016/5/10/chartex" xmlns:cx5="http://schemas.microsoft.com/office/drawing/2016/5/11/chartex" xmlns:cx6="http://schemas.microsoft.com/office/drawing/2016/5/12/chartex" xmlns:cx7="http://schemas.microsoft.com/office/drawing/2016/5/13/chartex" xmlns:cx8="http://schemas.microsoft.com/office/drawing/2016/5/14/chartex" xmlns:mc="http://schemas.openxmlformats.org/markup-compatibility/2006" xmlns:aink="http://schemas.microsoft.com/office/drawing/2016/ink" xmlns:am3d="http://schemas.microsoft.com/office/drawing/2017/model3d" xmlns:o="urn:schemas-microsoft-com:office:office" xmlns:oel="http://schemas.microsoft.com/office/2019/extlst" xmlns:r="http://schemas.openxmlformats.org/officeDocument/2006/relationships" xmlns:m="http://schemas.openxmlformats.org/officeDocument/2006/math" xmlns:v="urn:schemas-microsoft-com:vml" xmlns:wp14="http://schemas.microsoft.com/office/word/2010/wordprocessingDrawing" xmlns:wp="http://schemas.openxmlformats.org/drawingml/2006/wordprocessingDrawing" xmlns:w10="urn:schemas-microsoft-com:office:word" xmlns:w="http://schemas.openxmlformats.org/wordprocessingml/2006/main" xmlns:w14="http://schemas.microsoft.com/office/word/2010/wordml" xmlns:w15="http://schemas.microsoft.com/office/word/2012/wordml" xmlns:w16cei="http://schemas.microsoft.com/office/word/2026/wordml/cei" xmlns:w16cex="http://schemas.microsoft.com/office/word/2018/wordml/cex" xmlns:w16cid="http://schemas.microsoft.com/office/word/2016/wordml/cid" xmlns:w16="http://schemas.microsoft.com/office/word/2018/wordml" xmlns:w16du="http://schemas.microsoft.com/office/word/2023/wordml/word16du" xmlns:w16sdtdh="http://schemas.microsoft.com/office/word/2020/wordml/sdtdatahash" xmlns:w16sdtfl="http://schemas.microsoft.com/office/word/2024/wordml/sdtformatlock" xmlns:w16se="http://schemas.microsoft.com/office/word/2015/wordml/symex" xmlns:wpg="http://schemas.microsoft.com/office/word/2010/wordprocessingGroup" xmlns:wpi="http://schemas.microsoft.com/office/word/2010/wordprocessingInk" xmlns:wne="http://schemas.microsoft.com/office/word/2006/wordml" xmlns:wps="http://schemas.microsoft.com/office/word/2010/wordprocessingShape" mc:Ignorable="w14 w15 w16se w16cid w16 w16cex w16sdtdh w16sdtfl w16du wp14">
   <w:endnote w:type="separator" w:id="-1">
     <w:p>
       <w:pPr>
@@ -3644,7 +3134,7 @@
 </file>
 
 <file path=word/footer1.xml><?xml version="1.0" encoding="utf-8"?>
-<w:ftr xmlns:wpc="http://schemas.microsoft.com/office/word/2010/wordprocessingCanvas" xmlns:cx="http://schemas.microsoft.com/office/drawing/2014/chartex" xmlns:cx1="http://schemas.microsoft.com/office/drawing/2015/9/8/chartex" xmlns:cx2="http://schemas.microsoft.com/office/drawing/2015/10/21/chartex" xmlns:cx3="http://schemas.microsoft.com/office/drawing/2016/5/9/chartex" xmlns:cx4="http://schemas.microsoft.com/office/drawing/2016/5/10/chartex" xmlns:cx5="http://schemas.microsoft.com/office/drawing/2016/5/11/chartex" xmlns:cx6="http://schemas.microsoft.com/office/drawing/2016/5/12/chartex" xmlns:cx7="http://schemas.microsoft.com/office/drawing/2016/5/13/chartex" xmlns:cx8="http://schemas.microsoft.com/office/drawing/2016/5/14/chartex" xmlns:mc="http://schemas.openxmlformats.org/markup-compatibility/2006" xmlns:aink="http://schemas.microsoft.com/office/drawing/2016/ink" xmlns:am3d="http://schemas.microsoft.com/office/drawing/2017/model3d" xmlns:o="urn:schemas-microsoft-com:office:office" xmlns:oel="http://schemas.microsoft.com/office/2019/extlst" xmlns:r="http://schemas.openxmlformats.org/officeDocument/2006/relationships" xmlns:m="http://schemas.openxmlformats.org/officeDocument/2006/math" xmlns:v="urn:schemas-microsoft-com:vml" xmlns:wp14="http://schemas.microsoft.com/office/word/2010/wordprocessingDrawing" xmlns:wp="http://schemas.openxmlformats.org/drawingml/2006/wordprocessingDrawing" xmlns:w10="urn:schemas-microsoft-com:office:word" xmlns:w="http://schemas.openxmlformats.org/wordprocessingml/2006/main" xmlns:w14="http://schemas.microsoft.com/office/word/2010/wordml" xmlns:w15="http://schemas.microsoft.com/office/word/2012/wordml" xmlns:w16cex="http://schemas.microsoft.com/office/word/2018/wordml/cex" xmlns:w16cid="http://schemas.microsoft.com/office/word/2016/wordml/cid" xmlns:w16="http://schemas.microsoft.com/office/word/2018/wordml" xmlns:w16du="http://schemas.microsoft.com/office/word/2023/wordml/word16du" xmlns:w16sdtdh="http://schemas.microsoft.com/office/word/2020/wordml/sdtdatahash" xmlns:w16sdtfl="http://schemas.microsoft.com/office/word/2024/wordml/sdtformatlock" xmlns:w16se="http://schemas.microsoft.com/office/word/2015/wordml/symex" xmlns:wpg="http://schemas.microsoft.com/office/word/2010/wordprocessingGroup" xmlns:wpi="http://schemas.microsoft.com/office/word/2010/wordprocessingInk" xmlns:wne="http://schemas.microsoft.com/office/word/2006/wordml" xmlns:wps="http://schemas.microsoft.com/office/word/2010/wordprocessingShape" mc:Ignorable="w14 w15 w16se w16cid w16 w16cex w16sdtdh w16sdtfl w16du wp14">
+<w:ftr xmlns:wpc="http://schemas.microsoft.com/office/word/2010/wordprocessingCanvas" xmlns:cx="http://schemas.microsoft.com/office/drawing/2014/chartex" xmlns:cx1="http://schemas.microsoft.com/office/drawing/2015/9/8/chartex" xmlns:cx2="http://schemas.microsoft.com/office/drawing/2015/10/21/chartex" xmlns:cx3="http://schemas.microsoft.com/office/drawing/2016/5/9/chartex" xmlns:cx4="http://schemas.microsoft.com/office/drawing/2016/5/10/chartex" xmlns:cx5="http://schemas.microsoft.com/office/drawing/2016/5/11/chartex" xmlns:cx6="http://schemas.microsoft.com/office/drawing/2016/5/12/chartex" xmlns:cx7="http://schemas.microsoft.com/office/drawing/2016/5/13/chartex" xmlns:cx8="http://schemas.microsoft.com/office/drawing/2016/5/14/chartex" xmlns:mc="http://schemas.openxmlformats.org/markup-compatibility/2006" xmlns:aink="http://schemas.microsoft.com/office/drawing/2016/ink" xmlns:am3d="http://schemas.microsoft.com/office/drawing/2017/model3d" xmlns:o="urn:schemas-microsoft-com:office:office" xmlns:oel="http://schemas.microsoft.com/office/2019/extlst" xmlns:r="http://schemas.openxmlformats.org/officeDocument/2006/relationships" xmlns:m="http://schemas.openxmlformats.org/officeDocument/2006/math" xmlns:v="urn:schemas-microsoft-com:vml" xmlns:wp14="http://schemas.microsoft.com/office/word/2010/wordprocessingDrawing" xmlns:wp="http://schemas.openxmlformats.org/drawingml/2006/wordprocessingDrawing" xmlns:w10="urn:schemas-microsoft-com:office:word" xmlns:w="http://schemas.openxmlformats.org/wordprocessingml/2006/main" xmlns:w14="http://schemas.microsoft.com/office/word/2010/wordml" xmlns:w15="http://schemas.microsoft.com/office/word/2012/wordml" xmlns:w16cei="http://schemas.microsoft.com/office/word/2026/wordml/cei" xmlns:w16cex="http://schemas.microsoft.com/office/word/2018/wordml/cex" xmlns:w16cid="http://schemas.microsoft.com/office/word/2016/wordml/cid" xmlns:w16="http://schemas.microsoft.com/office/word/2018/wordml" xmlns:w16du="http://schemas.microsoft.com/office/word/2023/wordml/word16du" xmlns:w16sdtdh="http://schemas.microsoft.com/office/word/2020/wordml/sdtdatahash" xmlns:w16sdtfl="http://schemas.microsoft.com/office/word/2024/wordml/sdtformatlock" xmlns:w16se="http://schemas.microsoft.com/office/word/2015/wordml/symex" xmlns:wpg="http://schemas.microsoft.com/office/word/2010/wordprocessingGroup" xmlns:wpi="http://schemas.microsoft.com/office/word/2010/wordprocessingInk" xmlns:wne="http://schemas.microsoft.com/office/word/2006/wordml" xmlns:wps="http://schemas.microsoft.com/office/word/2010/wordprocessingShape" mc:Ignorable="w14 w15 w16se w16cid w16 w16cex w16sdtdh w16sdtfl w16du wp14">
   <w:tbl>
     <w:tblPr>
       <w:tblStyle w:val="TableGrid"/>
@@ -3759,7 +3249,28 @@
             <w:rPr>
               <w:sz w:val="14"/>
             </w:rPr>
-            <w:t xml:space="preserve"> of 16</w:t>
+            <w:t xml:space="preserve"> of </w:t>
+          </w:r>
+          <w:r>
+            <w:fldChar w:fldCharType="begin"/>
+          </w:r>
+          <w:r>
+            <w:instrText xml:space="preserve"> NUMPAGES   \* MERGEFORMAT </w:instrText>
+          </w:r>
+          <w:r>
+            <w:fldChar w:fldCharType="separate"/>
+          </w:r>
+          <w:r>
+            <w:rPr>
+              <w:sz w:val="14"/>
+            </w:rPr>
+            <w:t>16</w:t>
+          </w:r>
+          <w:r>
+            <w:rPr>
+              <w:sz w:val="14"/>
+            </w:rPr>
+            <w:fldChar w:fldCharType="end"/>
           </w:r>
         </w:p>
       </w:tc>
@@ -3771,19 +3282,11 @@
       <w:ind w:left="0" w:firstLine="0"/>
       <w:jc w:val="center"/>
     </w:pPr>
-    <w:proofErr w:type="spellStart"/>
     <w:r>
       <w:rPr>
         <w:sz w:val="16"/>
       </w:rPr>
-      <w:t>CloudFuze</w:t>
-    </w:r>
-    <w:proofErr w:type="spellEnd"/>
-    <w:r>
-      <w:rPr>
-        <w:sz w:val="16"/>
-      </w:rPr>
-      <w:t xml:space="preserve">, Inc. </w:t>
+      <w:t xml:space="preserve">CloudFuze, Inc. </w:t>
     </w:r>
     <w:r>
       <w:rPr>
@@ -3915,7 +3418,7 @@
 </file>
 
 <file path=word/footer2.xml><?xml version="1.0" encoding="utf-8"?>
-<w:ftr xmlns:wpc="http://schemas.microsoft.com/office/word/2010/wordprocessingCanvas" xmlns:cx="http://schemas.microsoft.com/office/drawing/2014/chartex" xmlns:cx1="http://schemas.microsoft.com/office/drawing/2015/9/8/chartex" xmlns:cx2="http://schemas.microsoft.com/office/drawing/2015/10/21/chartex" xmlns:cx3="http://schemas.microsoft.com/office/drawing/2016/5/9/chartex" xmlns:cx4="http://schemas.microsoft.com/office/drawing/2016/5/10/chartex" xmlns:cx5="http://schemas.microsoft.com/office/drawing/2016/5/11/chartex" xmlns:cx6="http://schemas.microsoft.com/office/drawing/2016/5/12/chartex" xmlns:cx7="http://schemas.microsoft.com/office/drawing/2016/5/13/chartex" xmlns:cx8="http://schemas.microsoft.com/office/drawing/2016/5/14/chartex" xmlns:mc="http://schemas.openxmlformats.org/markup-compatibility/2006" xmlns:aink="http://schemas.microsoft.com/office/drawing/2016/ink" xmlns:am3d="http://schemas.microsoft.com/office/drawing/2017/model3d" xmlns:o="urn:schemas-microsoft-com:office:office" xmlns:oel="http://schemas.microsoft.com/office/2019/extlst" xmlns:r="http://schemas.openxmlformats.org/officeDocument/2006/relationships" xmlns:m="http://schemas.openxmlformats.org/officeDocument/2006/math" xmlns:v="urn:schemas-microsoft-com:vml" xmlns:wp14="http://schemas.microsoft.com/office/word/2010/wordprocessingDrawing" xmlns:wp="http://schemas.openxmlformats.org/drawingml/2006/wordprocessingDrawing" xmlns:w10="urn:schemas-microsoft-com:office:word" xmlns:w="http://schemas.openxmlformats.org/wordprocessingml/2006/main" xmlns:w14="http://schemas.microsoft.com/office/word/2010/wordml" xmlns:w15="http://schemas.microsoft.com/office/word/2012/wordml" xmlns:w16cex="http://schemas.microsoft.com/office/word/2018/wordml/cex" xmlns:w16cid="http://schemas.microsoft.com/office/word/2016/wordml/cid" xmlns:w16="http://schemas.microsoft.com/office/word/2018/wordml" xmlns:w16du="http://schemas.microsoft.com/office/word/2023/wordml/word16du" xmlns:w16sdtdh="http://schemas.microsoft.com/office/word/2020/wordml/sdtdatahash" xmlns:w16sdtfl="http://schemas.microsoft.com/office/word/2024/wordml/sdtformatlock" xmlns:w16se="http://schemas.microsoft.com/office/word/2015/wordml/symex" xmlns:wpg="http://schemas.microsoft.com/office/word/2010/wordprocessingGroup" xmlns:wpi="http://schemas.microsoft.com/office/word/2010/wordprocessingInk" xmlns:wne="http://schemas.microsoft.com/office/word/2006/wordml" xmlns:wps="http://schemas.microsoft.com/office/word/2010/wordprocessingShape" mc:Ignorable="w14 w15 w16se w16cid w16 w16cex w16sdtdh w16sdtfl w16du wp14">
+<w:ftr xmlns:wpc="http://schemas.microsoft.com/office/word/2010/wordprocessingCanvas" xmlns:cx="http://schemas.microsoft.com/office/drawing/2014/chartex" xmlns:cx1="http://schemas.microsoft.com/office/drawing/2015/9/8/chartex" xmlns:cx2="http://schemas.microsoft.com/office/drawing/2015/10/21/chartex" xmlns:cx3="http://schemas.microsoft.com/office/drawing/2016/5/9/chartex" xmlns:cx4="http://schemas.microsoft.com/office/drawing/2016/5/10/chartex" xmlns:cx5="http://schemas.microsoft.com/office/drawing/2016/5/11/chartex" xmlns:cx6="http://schemas.microsoft.com/office/drawing/2016/5/12/chartex" xmlns:cx7="http://schemas.microsoft.com/office/drawing/2016/5/13/chartex" xmlns:cx8="http://schemas.microsoft.com/office/drawing/2016/5/14/chartex" xmlns:mc="http://schemas.openxmlformats.org/markup-compatibility/2006" xmlns:aink="http://schemas.microsoft.com/office/drawing/2016/ink" xmlns:am3d="http://schemas.microsoft.com/office/drawing/2017/model3d" xmlns:o="urn:schemas-microsoft-com:office:office" xmlns:oel="http://schemas.microsoft.com/office/2019/extlst" xmlns:r="http://schemas.openxmlformats.org/officeDocument/2006/relationships" xmlns:m="http://schemas.openxmlformats.org/officeDocument/2006/math" xmlns:v="urn:schemas-microsoft-com:vml" xmlns:wp14="http://schemas.microsoft.com/office/word/2010/wordprocessingDrawing" xmlns:wp="http://schemas.openxmlformats.org/drawingml/2006/wordprocessingDrawing" xmlns:w10="urn:schemas-microsoft-com:office:word" xmlns:w="http://schemas.openxmlformats.org/wordprocessingml/2006/main" xmlns:w14="http://schemas.microsoft.com/office/word/2010/wordml" xmlns:w15="http://schemas.microsoft.com/office/word/2012/wordml" xmlns:w16cei="http://schemas.microsoft.com/office/word/2026/wordml/cei" xmlns:w16cex="http://schemas.microsoft.com/office/word/2018/wordml/cex" xmlns:w16cid="http://schemas.microsoft.com/office/word/2016/wordml/cid" xmlns:w16="http://schemas.microsoft.com/office/word/2018/wordml" xmlns:w16du="http://schemas.microsoft.com/office/word/2023/wordml/word16du" xmlns:w16sdtdh="http://schemas.microsoft.com/office/word/2020/wordml/sdtdatahash" xmlns:w16sdtfl="http://schemas.microsoft.com/office/word/2024/wordml/sdtformatlock" xmlns:w16se="http://schemas.microsoft.com/office/word/2015/wordml/symex" xmlns:wpg="http://schemas.microsoft.com/office/word/2010/wordprocessingGroup" xmlns:wpi="http://schemas.microsoft.com/office/word/2010/wordprocessingInk" xmlns:wne="http://schemas.microsoft.com/office/word/2006/wordml" xmlns:wps="http://schemas.microsoft.com/office/word/2010/wordprocessingShape" mc:Ignorable="w14 w15 w16se w16cid w16 w16cex w16sdtdh w16sdtfl w16du wp14">
   <w:tbl>
     <w:tblPr>
       <w:tblStyle w:val="TableGrid"/>
@@ -4030,7 +3533,28 @@
             <w:rPr>
               <w:sz w:val="14"/>
             </w:rPr>
-            <w:t xml:space="preserve"> of 16</w:t>
+            <w:t xml:space="preserve"> of </w:t>
+          </w:r>
+          <w:r>
+            <w:fldChar w:fldCharType="begin"/>
+          </w:r>
+          <w:r>
+            <w:instrText xml:space="preserve"> NUMPAGES   \* MERGEFORMAT </w:instrText>
+          </w:r>
+          <w:r>
+            <w:fldChar w:fldCharType="separate"/>
+          </w:r>
+          <w:r>
+            <w:rPr>
+              <w:sz w:val="14"/>
+            </w:rPr>
+            <w:t>14</w:t>
+          </w:r>
+          <w:r>
+            <w:rPr>
+              <w:sz w:val="14"/>
+            </w:rPr>
+            <w:fldChar w:fldCharType="end"/>
           </w:r>
         </w:p>
       </w:tc>
@@ -4042,19 +3566,11 @@
       <w:ind w:left="0" w:firstLine="0"/>
       <w:jc w:val="center"/>
     </w:pPr>
-    <w:proofErr w:type="spellStart"/>
     <w:r>
       <w:rPr>
         <w:sz w:val="16"/>
       </w:rPr>
-      <w:t>CloudFuze</w:t>
-    </w:r>
-    <w:proofErr w:type="spellEnd"/>
-    <w:r>
-      <w:rPr>
-        <w:sz w:val="16"/>
-      </w:rPr>
-      <w:t xml:space="preserve">, Inc. </w:t>
+      <w:t xml:space="preserve">CloudFuze, Inc. </w:t>
     </w:r>
     <w:r>
       <w:rPr>
@@ -4186,7 +3702,7 @@
 </file>
 
 <file path=word/footer3.xml><?xml version="1.0" encoding="utf-8"?>
-<w:ftr xmlns:wpc="http://schemas.microsoft.com/office/word/2010/wordprocessingCanvas" xmlns:cx="http://schemas.microsoft.com/office/drawing/2014/chartex" xmlns:cx1="http://schemas.microsoft.com/office/drawing/2015/9/8/chartex" xmlns:cx2="http://schemas.microsoft.com/office/drawing/2015/10/21/chartex" xmlns:cx3="http://schemas.microsoft.com/office/drawing/2016/5/9/chartex" xmlns:cx4="http://schemas.microsoft.com/office/drawing/2016/5/10/chartex" xmlns:cx5="http://schemas.microsoft.com/office/drawing/2016/5/11/chartex" xmlns:cx6="http://schemas.microsoft.com/office/drawing/2016/5/12/chartex" xmlns:cx7="http://schemas.microsoft.com/office/drawing/2016/5/13/chartex" xmlns:cx8="http://schemas.microsoft.com/office/drawing/2016/5/14/chartex" xmlns:mc="http://schemas.openxmlformats.org/markup-compatibility/2006" xmlns:aink="http://schemas.microsoft.com/office/drawing/2016/ink" xmlns:am3d="http://schemas.microsoft.com/office/drawing/2017/model3d" xmlns:o="urn:schemas-microsoft-com:office:office" xmlns:oel="http://schemas.microsoft.com/office/2019/extlst" xmlns:r="http://schemas.openxmlformats.org/officeDocument/2006/relationships" xmlns:m="http://schemas.openxmlformats.org/officeDocument/2006/math" xmlns:v="urn:schemas-microsoft-com:vml" xmlns:wp14="http://schemas.microsoft.com/office/word/2010/wordprocessingDrawing" xmlns:wp="http://schemas.openxmlformats.org/drawingml/2006/wordprocessingDrawing" xmlns:w10="urn:schemas-microsoft-com:office:word" xmlns:w="http://schemas.openxmlformats.org/wordprocessingml/2006/main" xmlns:w14="http://schemas.microsoft.com/office/word/2010/wordml" xmlns:w15="http://schemas.microsoft.com/office/word/2012/wordml" xmlns:w16cex="http://schemas.microsoft.com/office/word/2018/wordml/cex" xmlns:w16cid="http://schemas.microsoft.com/office/word/2016/wordml/cid" xmlns:w16="http://schemas.microsoft.com/office/word/2018/wordml" xmlns:w16du="http://schemas.microsoft.com/office/word/2023/wordml/word16du" xmlns:w16sdtdh="http://schemas.microsoft.com/office/word/2020/wordml/sdtdatahash" xmlns:w16sdtfl="http://schemas.microsoft.com/office/word/2024/wordml/sdtformatlock" xmlns:w16se="http://schemas.microsoft.com/office/word/2015/wordml/symex" xmlns:wpg="http://schemas.microsoft.com/office/word/2010/wordprocessingGroup" xmlns:wpi="http://schemas.microsoft.com/office/word/2010/wordprocessingInk" xmlns:wne="http://schemas.microsoft.com/office/word/2006/wordml" xmlns:wps="http://schemas.microsoft.com/office/word/2010/wordprocessingShape" mc:Ignorable="w14 w15 w16se w16cid w16 w16cex w16sdtdh w16sdtfl w16du wp14">
+<w:ftr xmlns:wpc="http://schemas.microsoft.com/office/word/2010/wordprocessingCanvas" xmlns:cx="http://schemas.microsoft.com/office/drawing/2014/chartex" xmlns:cx1="http://schemas.microsoft.com/office/drawing/2015/9/8/chartex" xmlns:cx2="http://schemas.microsoft.com/office/drawing/2015/10/21/chartex" xmlns:cx3="http://schemas.microsoft.com/office/drawing/2016/5/9/chartex" xmlns:cx4="http://schemas.microsoft.com/office/drawing/2016/5/10/chartex" xmlns:cx5="http://schemas.microsoft.com/office/drawing/2016/5/11/chartex" xmlns:cx6="http://schemas.microsoft.com/office/drawing/2016/5/12/chartex" xmlns:cx7="http://schemas.microsoft.com/office/drawing/2016/5/13/chartex" xmlns:cx8="http://schemas.microsoft.com/office/drawing/2016/5/14/chartex" xmlns:mc="http://schemas.openxmlformats.org/markup-compatibility/2006" xmlns:aink="http://schemas.microsoft.com/office/drawing/2016/ink" xmlns:am3d="http://schemas.microsoft.com/office/drawing/2017/model3d" xmlns:o="urn:schemas-microsoft-com:office:office" xmlns:oel="http://schemas.microsoft.com/office/2019/extlst" xmlns:r="http://schemas.openxmlformats.org/officeDocument/2006/relationships" xmlns:m="http://schemas.openxmlformats.org/officeDocument/2006/math" xmlns:v="urn:schemas-microsoft-com:vml" xmlns:wp14="http://schemas.microsoft.com/office/word/2010/wordprocessingDrawing" xmlns:wp="http://schemas.openxmlformats.org/drawingml/2006/wordprocessingDrawing" xmlns:w10="urn:schemas-microsoft-com:office:word" xmlns:w="http://schemas.openxmlformats.org/wordprocessingml/2006/main" xmlns:w14="http://schemas.microsoft.com/office/word/2010/wordml" xmlns:w15="http://schemas.microsoft.com/office/word/2012/wordml" xmlns:w16cei="http://schemas.microsoft.com/office/word/2026/wordml/cei" xmlns:w16cex="http://schemas.microsoft.com/office/word/2018/wordml/cex" xmlns:w16cid="http://schemas.microsoft.com/office/word/2016/wordml/cid" xmlns:w16="http://schemas.microsoft.com/office/word/2018/wordml" xmlns:w16du="http://schemas.microsoft.com/office/word/2023/wordml/word16du" xmlns:w16sdtdh="http://schemas.microsoft.com/office/word/2020/wordml/sdtdatahash" xmlns:w16sdtfl="http://schemas.microsoft.com/office/word/2024/wordml/sdtformatlock" xmlns:w16se="http://schemas.microsoft.com/office/word/2015/wordml/symex" xmlns:wpg="http://schemas.microsoft.com/office/word/2010/wordprocessingGroup" xmlns:wpi="http://schemas.microsoft.com/office/word/2010/wordprocessingInk" xmlns:wne="http://schemas.microsoft.com/office/word/2006/wordml" xmlns:wps="http://schemas.microsoft.com/office/word/2010/wordprocessingShape" mc:Ignorable="w14 w15 w16se w16cid w16 w16cex w16sdtdh w16sdtfl w16du wp14">
   <w:tbl>
     <w:tblPr>
       <w:tblStyle w:val="TableGrid"/>
@@ -4301,7 +3817,28 @@
             <w:rPr>
               <w:sz w:val="14"/>
             </w:rPr>
-            <w:t xml:space="preserve"> of 16</w:t>
+            <w:t xml:space="preserve"> of </w:t>
+          </w:r>
+          <w:r>
+            <w:fldChar w:fldCharType="begin"/>
+          </w:r>
+          <w:r>
+            <w:instrText xml:space="preserve"> NUMPAGES   \* MERGEFORMAT </w:instrText>
+          </w:r>
+          <w:r>
+            <w:fldChar w:fldCharType="separate"/>
+          </w:r>
+          <w:r>
+            <w:rPr>
+              <w:sz w:val="14"/>
+            </w:rPr>
+            <w:t>16</w:t>
+          </w:r>
+          <w:r>
+            <w:rPr>
+              <w:sz w:val="14"/>
+            </w:rPr>
+            <w:fldChar w:fldCharType="end"/>
           </w:r>
         </w:p>
       </w:tc>
@@ -4313,19 +3850,11 @@
       <w:ind w:left="0" w:firstLine="0"/>
       <w:jc w:val="center"/>
     </w:pPr>
-    <w:proofErr w:type="spellStart"/>
     <w:r>
       <w:rPr>
         <w:sz w:val="16"/>
       </w:rPr>
-      <w:t>CloudFuze</w:t>
-    </w:r>
-    <w:proofErr w:type="spellEnd"/>
-    <w:r>
-      <w:rPr>
-        <w:sz w:val="16"/>
-      </w:rPr>
-      <w:t xml:space="preserve">, Inc. </w:t>
+      <w:t xml:space="preserve">CloudFuze, Inc. </w:t>
     </w:r>
     <w:r>
       <w:rPr>
@@ -4457,7 +3986,7 @@
 </file>
 
 <file path=word/footer4.xml><?xml version="1.0" encoding="utf-8"?>
-<w:ftr xmlns:wpc="http://schemas.microsoft.com/office/word/2010/wordprocessingCanvas" xmlns:cx="http://schemas.microsoft.com/office/drawing/2014/chartex" xmlns:cx1="http://schemas.microsoft.com/office/drawing/2015/9/8/chartex" xmlns:cx2="http://schemas.microsoft.com/office/drawing/2015/10/21/chartex" xmlns:cx3="http://schemas.microsoft.com/office/drawing/2016/5/9/chartex" xmlns:cx4="http://schemas.microsoft.com/office/drawing/2016/5/10/chartex" xmlns:cx5="http://schemas.microsoft.com/office/drawing/2016/5/11/chartex" xmlns:cx6="http://schemas.microsoft.com/office/drawing/2016/5/12/chartex" xmlns:cx7="http://schemas.microsoft.com/office/drawing/2016/5/13/chartex" xmlns:cx8="http://schemas.microsoft.com/office/drawing/2016/5/14/chartex" xmlns:mc="http://schemas.openxmlformats.org/markup-compatibility/2006" xmlns:aink="http://schemas.microsoft.com/office/drawing/2016/ink" xmlns:am3d="http://schemas.microsoft.com/office/drawing/2017/model3d" xmlns:o="urn:schemas-microsoft-com:office:office" xmlns:oel="http://schemas.microsoft.com/office/2019/extlst" xmlns:r="http://schemas.openxmlformats.org/officeDocument/2006/relationships" xmlns:m="http://schemas.openxmlformats.org/officeDocument/2006/math" xmlns:v="urn:schemas-microsoft-com:vml" xmlns:wp14="http://schemas.microsoft.com/office/word/2010/wordprocessingDrawing" xmlns:wp="http://schemas.openxmlformats.org/drawingml/2006/wordprocessingDrawing" xmlns:w10="urn:schemas-microsoft-com:office:word" xmlns:w="http://schemas.openxmlformats.org/wordprocessingml/2006/main" xmlns:w14="http://schemas.microsoft.com/office/word/2010/wordml" xmlns:w15="http://schemas.microsoft.com/office/word/2012/wordml" xmlns:w16cex="http://schemas.microsoft.com/office/word/2018/wordml/cex" xmlns:w16cid="http://schemas.microsoft.com/office/word/2016/wordml/cid" xmlns:w16="http://schemas.microsoft.com/office/word/2018/wordml" xmlns:w16du="http://schemas.microsoft.com/office/word/2023/wordml/word16du" xmlns:w16sdtdh="http://schemas.microsoft.com/office/word/2020/wordml/sdtdatahash" xmlns:w16sdtfl="http://schemas.microsoft.com/office/word/2024/wordml/sdtformatlock" xmlns:w16se="http://schemas.microsoft.com/office/word/2015/wordml/symex" xmlns:wpg="http://schemas.microsoft.com/office/word/2010/wordprocessingGroup" xmlns:wpi="http://schemas.microsoft.com/office/word/2010/wordprocessingInk" xmlns:wne="http://schemas.microsoft.com/office/word/2006/wordml" xmlns:wps="http://schemas.microsoft.com/office/word/2010/wordprocessingShape" mc:Ignorable="w14 w15 w16se w16cid w16 w16cex w16sdtdh w16sdtfl w16du wp14">
+<w:ftr xmlns:wpc="http://schemas.microsoft.com/office/word/2010/wordprocessingCanvas" xmlns:cx="http://schemas.microsoft.com/office/drawing/2014/chartex" xmlns:cx1="http://schemas.microsoft.com/office/drawing/2015/9/8/chartex" xmlns:cx2="http://schemas.microsoft.com/office/drawing/2015/10/21/chartex" xmlns:cx3="http://schemas.microsoft.com/office/drawing/2016/5/9/chartex" xmlns:cx4="http://schemas.microsoft.com/office/drawing/2016/5/10/chartex" xmlns:cx5="http://schemas.microsoft.com/office/drawing/2016/5/11/chartex" xmlns:cx6="http://schemas.microsoft.com/office/drawing/2016/5/12/chartex" xmlns:cx7="http://schemas.microsoft.com/office/drawing/2016/5/13/chartex" xmlns:cx8="http://schemas.microsoft.com/office/drawing/2016/5/14/chartex" xmlns:mc="http://schemas.openxmlformats.org/markup-compatibility/2006" xmlns:aink="http://schemas.microsoft.com/office/drawing/2016/ink" xmlns:am3d="http://schemas.microsoft.com/office/drawing/2017/model3d" xmlns:o="urn:schemas-microsoft-com:office:office" xmlns:oel="http://schemas.microsoft.com/office/2019/extlst" xmlns:r="http://schemas.openxmlformats.org/officeDocument/2006/relationships" xmlns:m="http://schemas.openxmlformats.org/officeDocument/2006/math" xmlns:v="urn:schemas-microsoft-com:vml" xmlns:wp14="http://schemas.microsoft.com/office/word/2010/wordprocessingDrawing" xmlns:wp="http://schemas.openxmlformats.org/drawingml/2006/wordprocessingDrawing" xmlns:w10="urn:schemas-microsoft-com:office:word" xmlns:w="http://schemas.openxmlformats.org/wordprocessingml/2006/main" xmlns:w14="http://schemas.microsoft.com/office/word/2010/wordml" xmlns:w15="http://schemas.microsoft.com/office/word/2012/wordml" xmlns:w16cei="http://schemas.microsoft.com/office/word/2026/wordml/cei" xmlns:w16cex="http://schemas.microsoft.com/office/word/2018/wordml/cex" xmlns:w16cid="http://schemas.microsoft.com/office/word/2016/wordml/cid" xmlns:w16="http://schemas.microsoft.com/office/word/2018/wordml" xmlns:w16du="http://schemas.microsoft.com/office/word/2023/wordml/word16du" xmlns:w16sdtdh="http://schemas.microsoft.com/office/word/2020/wordml/sdtdatahash" xmlns:w16sdtfl="http://schemas.microsoft.com/office/word/2024/wordml/sdtformatlock" xmlns:w16se="http://schemas.microsoft.com/office/word/2015/wordml/symex" xmlns:wpg="http://schemas.microsoft.com/office/word/2010/wordprocessingGroup" xmlns:wpi="http://schemas.microsoft.com/office/word/2010/wordprocessingInk" xmlns:wne="http://schemas.microsoft.com/office/word/2006/wordml" xmlns:wps="http://schemas.microsoft.com/office/word/2010/wordprocessingShape" mc:Ignorable="w14 w15 w16se w16cid w16 w16cex w16sdtdh w16sdtfl w16du wp14">
   <w:p>
     <w:pPr>
       <w:spacing w:after="160" w:line="259" w:lineRule="auto"/>
@@ -4469,7 +3998,7 @@
 </file>
 
 <file path=word/footer5.xml><?xml version="1.0" encoding="utf-8"?>
-<w:ftr xmlns:wpc="http://schemas.microsoft.com/office/word/2010/wordprocessingCanvas" xmlns:cx="http://schemas.microsoft.com/office/drawing/2014/chartex" xmlns:cx1="http://schemas.microsoft.com/office/drawing/2015/9/8/chartex" xmlns:cx2="http://schemas.microsoft.com/office/drawing/2015/10/21/chartex" xmlns:cx3="http://schemas.microsoft.com/office/drawing/2016/5/9/chartex" xmlns:cx4="http://schemas.microsoft.com/office/drawing/2016/5/10/chartex" xmlns:cx5="http://schemas.microsoft.com/office/drawing/2016/5/11/chartex" xmlns:cx6="http://schemas.microsoft.com/office/drawing/2016/5/12/chartex" xmlns:cx7="http://schemas.microsoft.com/office/drawing/2016/5/13/chartex" xmlns:cx8="http://schemas.microsoft.com/office/drawing/2016/5/14/chartex" xmlns:mc="http://schemas.openxmlformats.org/markup-compatibility/2006" xmlns:aink="http://schemas.microsoft.com/office/drawing/2016/ink" xmlns:am3d="http://schemas.microsoft.com/office/drawing/2017/model3d" xmlns:o="urn:schemas-microsoft-com:office:office" xmlns:oel="http://schemas.microsoft.com/office/2019/extlst" xmlns:r="http://schemas.openxmlformats.org/officeDocument/2006/relationships" xmlns:m="http://schemas.openxmlformats.org/officeDocument/2006/math" xmlns:v="urn:schemas-microsoft-com:vml" xmlns:wp14="http://schemas.microsoft.com/office/word/2010/wordprocessingDrawing" xmlns:wp="http://schemas.openxmlformats.org/drawingml/2006/wordprocessingDrawing" xmlns:w10="urn:schemas-microsoft-com:office:word" xmlns:w="http://schemas.openxmlformats.org/wordprocessingml/2006/main" xmlns:w14="http://schemas.microsoft.com/office/word/2010/wordml" xmlns:w15="http://schemas.microsoft.com/office/word/2012/wordml" xmlns:w16cex="http://schemas.microsoft.com/office/word/2018/wordml/cex" xmlns:w16cid="http://schemas.microsoft.com/office/word/2016/wordml/cid" xmlns:w16="http://schemas.microsoft.com/office/word/2018/wordml" xmlns:w16du="http://schemas.microsoft.com/office/word/2023/wordml/word16du" xmlns:w16sdtdh="http://schemas.microsoft.com/office/word/2020/wordml/sdtdatahash" xmlns:w16sdtfl="http://schemas.microsoft.com/office/word/2024/wordml/sdtformatlock" xmlns:w16se="http://schemas.microsoft.com/office/word/2015/wordml/symex" xmlns:wpg="http://schemas.microsoft.com/office/word/2010/wordprocessingGroup" xmlns:wpi="http://schemas.microsoft.com/office/word/2010/wordprocessingInk" xmlns:wne="http://schemas.microsoft.com/office/word/2006/wordml" xmlns:wps="http://schemas.microsoft.com/office/word/2010/wordprocessingShape" mc:Ignorable="w14 w15 w16se w16cid w16 w16cex w16sdtdh w16sdtfl w16du wp14">
+<w:ftr xmlns:wpc="http://schemas.microsoft.com/office/word/2010/wordprocessingCanvas" xmlns:cx="http://schemas.microsoft.com/office/drawing/2014/chartex" xmlns:cx1="http://schemas.microsoft.com/office/drawing/2015/9/8/chartex" xmlns:cx2="http://schemas.microsoft.com/office/drawing/2015/10/21/chartex" xmlns:cx3="http://schemas.microsoft.com/office/drawing/2016/5/9/chartex" xmlns:cx4="http://schemas.microsoft.com/office/drawing/2016/5/10/chartex" xmlns:cx5="http://schemas.microsoft.com/office/drawing/2016/5/11/chartex" xmlns:cx6="http://schemas.microsoft.com/office/drawing/2016/5/12/chartex" xmlns:cx7="http://schemas.microsoft.com/office/drawing/2016/5/13/chartex" xmlns:cx8="http://schemas.microsoft.com/office/drawing/2016/5/14/chartex" xmlns:mc="http://schemas.openxmlformats.org/markup-compatibility/2006" xmlns:aink="http://schemas.microsoft.com/office/drawing/2016/ink" xmlns:am3d="http://schemas.microsoft.com/office/drawing/2017/model3d" xmlns:o="urn:schemas-microsoft-com:office:office" xmlns:oel="http://schemas.microsoft.com/office/2019/extlst" xmlns:r="http://schemas.openxmlformats.org/officeDocument/2006/relationships" xmlns:m="http://schemas.openxmlformats.org/officeDocument/2006/math" xmlns:v="urn:schemas-microsoft-com:vml" xmlns:wp14="http://schemas.microsoft.com/office/word/2010/wordprocessingDrawing" xmlns:wp="http://schemas.openxmlformats.org/drawingml/2006/wordprocessingDrawing" xmlns:w10="urn:schemas-microsoft-com:office:word" xmlns:w="http://schemas.openxmlformats.org/wordprocessingml/2006/main" xmlns:w14="http://schemas.microsoft.com/office/word/2010/wordml" xmlns:w15="http://schemas.microsoft.com/office/word/2012/wordml" xmlns:w16cei="http://schemas.microsoft.com/office/word/2026/wordml/cei" xmlns:w16cex="http://schemas.microsoft.com/office/word/2018/wordml/cex" xmlns:w16cid="http://schemas.microsoft.com/office/word/2016/wordml/cid" xmlns:w16="http://schemas.microsoft.com/office/word/2018/wordml" xmlns:w16du="http://schemas.microsoft.com/office/word/2023/wordml/word16du" xmlns:w16sdtdh="http://schemas.microsoft.com/office/word/2020/wordml/sdtdatahash" xmlns:w16sdtfl="http://schemas.microsoft.com/office/word/2024/wordml/sdtformatlock" xmlns:w16se="http://schemas.microsoft.com/office/word/2015/wordml/symex" xmlns:wpg="http://schemas.microsoft.com/office/word/2010/wordprocessingGroup" xmlns:wpi="http://schemas.microsoft.com/office/word/2010/wordprocessingInk" xmlns:wne="http://schemas.microsoft.com/office/word/2006/wordml" xmlns:wps="http://schemas.microsoft.com/office/word/2010/wordprocessingShape" mc:Ignorable="w14 w15 w16se w16cid w16 w16cex w16sdtdh w16sdtfl w16du wp14">
   <w:p>
     <w:pPr>
       <w:spacing w:after="160" w:line="259" w:lineRule="auto"/>
@@ -4481,7 +4010,7 @@
 </file>
 
 <file path=word/footer6.xml><?xml version="1.0" encoding="utf-8"?>
-<w:ftr xmlns:wpc="http://schemas.microsoft.com/office/word/2010/wordprocessingCanvas" xmlns:cx="http://schemas.microsoft.com/office/drawing/2014/chartex" xmlns:cx1="http://schemas.microsoft.com/office/drawing/2015/9/8/chartex" xmlns:cx2="http://schemas.microsoft.com/office/drawing/2015/10/21/chartex" xmlns:cx3="http://schemas.microsoft.com/office/drawing/2016/5/9/chartex" xmlns:cx4="http://schemas.microsoft.com/office/drawing/2016/5/10/chartex" xmlns:cx5="http://schemas.microsoft.com/office/drawing/2016/5/11/chartex" xmlns:cx6="http://schemas.microsoft.com/office/drawing/2016/5/12/chartex" xmlns:cx7="http://schemas.microsoft.com/office/drawing/2016/5/13/chartex" xmlns:cx8="http://schemas.microsoft.com/office/drawing/2016/5/14/chartex" xmlns:mc="http://schemas.openxmlformats.org/markup-compatibility/2006" xmlns:aink="http://schemas.microsoft.com/office/drawing/2016/ink" xmlns:am3d="http://schemas.microsoft.com/office/drawing/2017/model3d" xmlns:o="urn:schemas-microsoft-com:office:office" xmlns:oel="http://schemas.microsoft.com/office/2019/extlst" xmlns:r="http://schemas.openxmlformats.org/officeDocument/2006/relationships" xmlns:m="http://schemas.openxmlformats.org/officeDocument/2006/math" xmlns:v="urn:schemas-microsoft-com:vml" xmlns:wp14="http://schemas.microsoft.com/office/word/2010/wordprocessingDrawing" xmlns:wp="http://schemas.openxmlformats.org/drawingml/2006/wordprocessingDrawing" xmlns:w10="urn:schemas-microsoft-com:office:word" xmlns:w="http://schemas.openxmlformats.org/wordprocessingml/2006/main" xmlns:w14="http://schemas.microsoft.com/office/word/2010/wordml" xmlns:w15="http://schemas.microsoft.com/office/word/2012/wordml" xmlns:w16cex="http://schemas.microsoft.com/office/word/2018/wordml/cex" xmlns:w16cid="http://schemas.microsoft.com/office/word/2016/wordml/cid" xmlns:w16="http://schemas.microsoft.com/office/word/2018/wordml" xmlns:w16du="http://schemas.microsoft.com/office/word/2023/wordml/word16du" xmlns:w16sdtdh="http://schemas.microsoft.com/office/word/2020/wordml/sdtdatahash" xmlns:w16sdtfl="http://schemas.microsoft.com/office/word/2024/wordml/sdtformatlock" xmlns:w16se="http://schemas.microsoft.com/office/word/2015/wordml/symex" xmlns:wpg="http://schemas.microsoft.com/office/word/2010/wordprocessingGroup" xmlns:wpi="http://schemas.microsoft.com/office/word/2010/wordprocessingInk" xmlns:wne="http://schemas.microsoft.com/office/word/2006/wordml" xmlns:wps="http://schemas.microsoft.com/office/word/2010/wordprocessingShape" mc:Ignorable="w14 w15 w16se w16cid w16 w16cex w16sdtdh w16sdtfl w16du wp14">
+<w:ftr xmlns:wpc="http://schemas.microsoft.com/office/word/2010/wordprocessingCanvas" xmlns:cx="http://schemas.microsoft.com/office/drawing/2014/chartex" xmlns:cx1="http://schemas.microsoft.com/office/drawing/2015/9/8/chartex" xmlns:cx2="http://schemas.microsoft.com/office/drawing/2015/10/21/chartex" xmlns:cx3="http://schemas.microsoft.com/office/drawing/2016/5/9/chartex" xmlns:cx4="http://schemas.microsoft.com/office/drawing/2016/5/10/chartex" xmlns:cx5="http://schemas.microsoft.com/office/drawing/2016/5/11/chartex" xmlns:cx6="http://schemas.microsoft.com/office/drawing/2016/5/12/chartex" xmlns:cx7="http://schemas.microsoft.com/office/drawing/2016/5/13/chartex" xmlns:cx8="http://schemas.microsoft.com/office/drawing/2016/5/14/chartex" xmlns:mc="http://schemas.openxmlformats.org/markup-compatibility/2006" xmlns:aink="http://schemas.microsoft.com/office/drawing/2016/ink" xmlns:am3d="http://schemas.microsoft.com/office/drawing/2017/model3d" xmlns:o="urn:schemas-microsoft-com:office:office" xmlns:oel="http://schemas.microsoft.com/office/2019/extlst" xmlns:r="http://schemas.openxmlformats.org/officeDocument/2006/relationships" xmlns:m="http://schemas.openxmlformats.org/officeDocument/2006/math" xmlns:v="urn:schemas-microsoft-com:vml" xmlns:wp14="http://schemas.microsoft.com/office/word/2010/wordprocessingDrawing" xmlns:wp="http://schemas.openxmlformats.org/drawingml/2006/wordprocessingDrawing" xmlns:w10="urn:schemas-microsoft-com:office:word" xmlns:w="http://schemas.openxmlformats.org/wordprocessingml/2006/main" xmlns:w14="http://schemas.microsoft.com/office/word/2010/wordml" xmlns:w15="http://schemas.microsoft.com/office/word/2012/wordml" xmlns:w16cei="http://schemas.microsoft.com/office/word/2026/wordml/cei" xmlns:w16cex="http://schemas.microsoft.com/office/word/2018/wordml/cex" xmlns:w16cid="http://schemas.microsoft.com/office/word/2016/wordml/cid" xmlns:w16="http://schemas.microsoft.com/office/word/2018/wordml" xmlns:w16du="http://schemas.microsoft.com/office/word/2023/wordml/word16du" xmlns:w16sdtdh="http://schemas.microsoft.com/office/word/2020/wordml/sdtdatahash" xmlns:w16sdtfl="http://schemas.microsoft.com/office/word/2024/wordml/sdtformatlock" xmlns:w16se="http://schemas.microsoft.com/office/word/2015/wordml/symex" xmlns:wpg="http://schemas.microsoft.com/office/word/2010/wordprocessingGroup" xmlns:wpi="http://schemas.microsoft.com/office/word/2010/wordprocessingInk" xmlns:wne="http://schemas.microsoft.com/office/word/2006/wordml" xmlns:wps="http://schemas.microsoft.com/office/word/2010/wordprocessingShape" mc:Ignorable="w14 w15 w16se w16cid w16 w16cex w16sdtdh w16sdtfl w16du wp14">
   <w:p>
     <w:pPr>
       <w:spacing w:after="160" w:line="259" w:lineRule="auto"/>
@@ -4493,7 +4022,7 @@
 </file>
 
 <file path=word/footnotes.xml><?xml version="1.0" encoding="utf-8"?>
-<w:footnotes xmlns:wpc="http://schemas.microsoft.com/office/word/2010/wordprocessingCanvas" xmlns:cx="http://schemas.microsoft.com/office/drawing/2014/chartex" xmlns:cx1="http://schemas.microsoft.com/office/drawing/2015/9/8/chartex" xmlns:cx2="http://schemas.microsoft.com/office/drawing/2015/10/21/chartex" xmlns:cx3="http://schemas.microsoft.com/office/drawing/2016/5/9/chartex" xmlns:cx4="http://schemas.microsoft.com/office/drawing/2016/5/10/chartex" xmlns:cx5="http://schemas.microsoft.com/office/drawing/2016/5/11/chartex" xmlns:cx6="http://schemas.microsoft.com/office/drawing/2016/5/12/chartex" xmlns:cx7="http://schemas.microsoft.com/office/drawing/2016/5/13/chartex" xmlns:cx8="http://schemas.microsoft.com/office/drawing/2016/5/14/chartex" xmlns:mc="http://schemas.openxmlformats.org/markup-compatibility/2006" xmlns:aink="http://schemas.microsoft.com/office/drawing/2016/ink" xmlns:am3d="http://schemas.microsoft.com/office/drawing/2017/model3d" xmlns:o="urn:schemas-microsoft-com:office:office" xmlns:oel="http://schemas.microsoft.com/office/2019/extlst" xmlns:r="http://schemas.openxmlformats.org/officeDocument/2006/relationships" xmlns:m="http://schemas.openxmlformats.org/officeDocument/2006/math" xmlns:v="urn:schemas-microsoft-com:vml" xmlns:wp14="http://schemas.microsoft.com/office/word/2010/wordprocessingDrawing" xmlns:wp="http://schemas.openxmlformats.org/drawingml/2006/wordprocessingDrawing" xmlns:w10="urn:schemas-microsoft-com:office:word" xmlns:w="http://schemas.openxmlformats.org/wordprocessingml/2006/main" xmlns:w14="http://schemas.microsoft.com/office/word/2010/wordml" xmlns:w15="http://schemas.microsoft.com/office/word/2012/wordml" xmlns:w16cex="http://schemas.microsoft.com/office/word/2018/wordml/cex" xmlns:w16cid="http://schemas.microsoft.com/office/word/2016/wordml/cid" xmlns:w16="http://schemas.microsoft.com/office/word/2018/wordml" xmlns:w16du="http://schemas.microsoft.com/office/word/2023/wordml/word16du" xmlns:w16sdtdh="http://schemas.microsoft.com/office/word/2020/wordml/sdtdatahash" xmlns:w16sdtfl="http://schemas.microsoft.com/office/word/2024/wordml/sdtformatlock" xmlns:w16se="http://schemas.microsoft.com/office/word/2015/wordml/symex" xmlns:wpg="http://schemas.microsoft.com/office/word/2010/wordprocessingGroup" xmlns:wpi="http://schemas.microsoft.com/office/word/2010/wordprocessingInk" xmlns:wne="http://schemas.microsoft.com/office/word/2006/wordml" xmlns:wps="http://schemas.microsoft.com/office/word/2010/wordprocessingShape" mc:Ignorable="w14 w15 w16se w16cid w16 w16cex w16sdtdh w16sdtfl w16du wp14">
+<w:footnotes xmlns:wpc="http://schemas.microsoft.com/office/word/2010/wordprocessingCanvas" xmlns:cx="http://schemas.microsoft.com/office/drawing/2014/chartex" xmlns:cx1="http://schemas.microsoft.com/office/drawing/2015/9/8/chartex" xmlns:cx2="http://schemas.microsoft.com/office/drawing/2015/10/21/chartex" xmlns:cx3="http://schemas.microsoft.com/office/drawing/2016/5/9/chartex" xmlns:cx4="http://schemas.microsoft.com/office/drawing/2016/5/10/chartex" xmlns:cx5="http://schemas.microsoft.com/office/drawing/2016/5/11/chartex" xmlns:cx6="http://schemas.microsoft.com/office/drawing/2016/5/12/chartex" xmlns:cx7="http://schemas.microsoft.com/office/drawing/2016/5/13/chartex" xmlns:cx8="http://schemas.microsoft.com/office/drawing/2016/5/14/chartex" xmlns:mc="http://schemas.openxmlformats.org/markup-compatibility/2006" xmlns:aink="http://schemas.microsoft.com/office/drawing/2016/ink" xmlns:am3d="http://schemas.microsoft.com/office/drawing/2017/model3d" xmlns:o="urn:schemas-microsoft-com:office:office" xmlns:oel="http://schemas.microsoft.com/office/2019/extlst" xmlns:r="http://schemas.openxmlformats.org/officeDocument/2006/relationships" xmlns:m="http://schemas.openxmlformats.org/officeDocument/2006/math" xmlns:v="urn:schemas-microsoft-com:vml" xmlns:wp14="http://schemas.microsoft.com/office/word/2010/wordprocessingDrawing" xmlns:wp="http://schemas.openxmlformats.org/drawingml/2006/wordprocessingDrawing" xmlns:w10="urn:schemas-microsoft-com:office:word" xmlns:w="http://schemas.openxmlformats.org/wordprocessingml/2006/main" xmlns:w14="http://schemas.microsoft.com/office/word/2010/wordml" xmlns:w15="http://schemas.microsoft.com/office/word/2012/wordml" xmlns:w16cei="http://schemas.microsoft.com/office/word/2026/wordml/cei" xmlns:w16cex="http://schemas.microsoft.com/office/word/2018/wordml/cex" xmlns:w16cid="http://schemas.microsoft.com/office/word/2016/wordml/cid" xmlns:w16="http://schemas.microsoft.com/office/word/2018/wordml" xmlns:w16du="http://schemas.microsoft.com/office/word/2023/wordml/word16du" xmlns:w16sdtdh="http://schemas.microsoft.com/office/word/2020/wordml/sdtdatahash" xmlns:w16sdtfl="http://schemas.microsoft.com/office/word/2024/wordml/sdtformatlock" xmlns:w16se="http://schemas.microsoft.com/office/word/2015/wordml/symex" xmlns:wpg="http://schemas.microsoft.com/office/word/2010/wordprocessingGroup" xmlns:wpi="http://schemas.microsoft.com/office/word/2010/wordprocessingInk" xmlns:wne="http://schemas.microsoft.com/office/word/2006/wordml" xmlns:wps="http://schemas.microsoft.com/office/word/2010/wordprocessingShape" mc:Ignorable="w14 w15 w16se w16cid w16 w16cex w16sdtdh w16sdtfl w16du wp14">
   <w:footnote w:type="separator" w:id="-1">
     <w:p>
       <w:pPr>
@@ -4518,7 +4047,7 @@
 </file>
 
 <file path=word/header1.xml><?xml version="1.0" encoding="utf-8"?>
-<w:hdr xmlns:wpc="http://schemas.microsoft.com/office/word/2010/wordprocessingCanvas" xmlns:cx="http://schemas.microsoft.com/office/drawing/2014/chartex" xmlns:cx1="http://schemas.microsoft.com/office/drawing/2015/9/8/chartex" xmlns:cx2="http://schemas.microsoft.com/office/drawing/2015/10/21/chartex" xmlns:cx3="http://schemas.microsoft.com/office/drawing/2016/5/9/chartex" xmlns:cx4="http://schemas.microsoft.com/office/drawing/2016/5/10/chartex" xmlns:cx5="http://schemas.microsoft.com/office/drawing/2016/5/11/chartex" xmlns:cx6="http://schemas.microsoft.com/office/drawing/2016/5/12/chartex" xmlns:cx7="http://schemas.microsoft.com/office/drawing/2016/5/13/chartex" xmlns:cx8="http://schemas.microsoft.com/office/drawing/2016/5/14/chartex" xmlns:mc="http://schemas.openxmlformats.org/markup-compatibility/2006" xmlns:aink="http://schemas.microsoft.com/office/drawing/2016/ink" xmlns:am3d="http://schemas.microsoft.com/office/drawing/2017/model3d" xmlns:o="urn:schemas-microsoft-com:office:office" xmlns:oel="http://schemas.microsoft.com/office/2019/extlst" xmlns:r="http://schemas.openxmlformats.org/officeDocument/2006/relationships" xmlns:m="http://schemas.openxmlformats.org/officeDocument/2006/math" xmlns:v="urn:schemas-microsoft-com:vml" xmlns:wp14="http://schemas.microsoft.com/office/word/2010/wordprocessingDrawing" xmlns:wp="http://schemas.openxmlformats.org/drawingml/2006/wordprocessingDrawing" xmlns:w10="urn:schemas-microsoft-com:office:word" xmlns:w="http://schemas.openxmlformats.org/wordprocessingml/2006/main" xmlns:w14="http://schemas.microsoft.com/office/word/2010/wordml" xmlns:w15="http://schemas.microsoft.com/office/word/2012/wordml" xmlns:w16cex="http://schemas.microsoft.com/office/word/2018/wordml/cex" xmlns:w16cid="http://schemas.microsoft.com/office/word/2016/wordml/cid" xmlns:w16="http://schemas.microsoft.com/office/word/2018/wordml" xmlns:w16du="http://schemas.microsoft.com/office/word/2023/wordml/word16du" xmlns:w16sdtdh="http://schemas.microsoft.com/office/word/2020/wordml/sdtdatahash" xmlns:w16sdtfl="http://schemas.microsoft.com/office/word/2024/wordml/sdtformatlock" xmlns:w16se="http://schemas.microsoft.com/office/word/2015/wordml/symex" xmlns:wpg="http://schemas.microsoft.com/office/word/2010/wordprocessingGroup" xmlns:wpi="http://schemas.microsoft.com/office/word/2010/wordprocessingInk" xmlns:wne="http://schemas.microsoft.com/office/word/2006/wordml" xmlns:wps="http://schemas.microsoft.com/office/word/2010/wordprocessingShape" mc:Ignorable="w14 w15 w16se w16cid w16 w16cex w16sdtdh w16sdtfl w16du wp14">
+<w:hdr xmlns:wpc="http://schemas.microsoft.com/office/word/2010/wordprocessingCanvas" xmlns:cx="http://schemas.microsoft.com/office/drawing/2014/chartex" xmlns:cx1="http://schemas.microsoft.com/office/drawing/2015/9/8/chartex" xmlns:cx2="http://schemas.microsoft.com/office/drawing/2015/10/21/chartex" xmlns:cx3="http://schemas.microsoft.com/office/drawing/2016/5/9/chartex" xmlns:cx4="http://schemas.microsoft.com/office/drawing/2016/5/10/chartex" xmlns:cx5="http://schemas.microsoft.com/office/drawing/2016/5/11/chartex" xmlns:cx6="http://schemas.microsoft.com/office/drawing/2016/5/12/chartex" xmlns:cx7="http://schemas.microsoft.com/office/drawing/2016/5/13/chartex" xmlns:cx8="http://schemas.microsoft.com/office/drawing/2016/5/14/chartex" xmlns:mc="http://schemas.openxmlformats.org/markup-compatibility/2006" xmlns:aink="http://schemas.microsoft.com/office/drawing/2016/ink" xmlns:am3d="http://schemas.microsoft.com/office/drawing/2017/model3d" xmlns:o="urn:schemas-microsoft-com:office:office" xmlns:oel="http://schemas.microsoft.com/office/2019/extlst" xmlns:r="http://schemas.openxmlformats.org/officeDocument/2006/relationships" xmlns:m="http://schemas.openxmlformats.org/officeDocument/2006/math" xmlns:v="urn:schemas-microsoft-com:vml" xmlns:wp14="http://schemas.microsoft.com/office/word/2010/wordprocessingDrawing" xmlns:wp="http://schemas.openxmlformats.org/drawingml/2006/wordprocessingDrawing" xmlns:w10="urn:schemas-microsoft-com:office:word" xmlns:w="http://schemas.openxmlformats.org/wordprocessingml/2006/main" xmlns:w14="http://schemas.microsoft.com/office/word/2010/wordml" xmlns:w15="http://schemas.microsoft.com/office/word/2012/wordml" xmlns:w16cei="http://schemas.microsoft.com/office/word/2026/wordml/cei" xmlns:w16cex="http://schemas.microsoft.com/office/word/2018/wordml/cex" xmlns:w16cid="http://schemas.microsoft.com/office/word/2016/wordml/cid" xmlns:w16="http://schemas.microsoft.com/office/word/2018/wordml" xmlns:w16du="http://schemas.microsoft.com/office/word/2023/wordml/word16du" xmlns:w16sdtdh="http://schemas.microsoft.com/office/word/2020/wordml/sdtdatahash" xmlns:w16sdtfl="http://schemas.microsoft.com/office/word/2024/wordml/sdtformatlock" xmlns:w16se="http://schemas.microsoft.com/office/word/2015/wordml/symex" xmlns:wpg="http://schemas.microsoft.com/office/word/2010/wordprocessingGroup" xmlns:wpi="http://schemas.microsoft.com/office/word/2010/wordprocessingInk" xmlns:wne="http://schemas.microsoft.com/office/word/2006/wordml" xmlns:wps="http://schemas.microsoft.com/office/word/2010/wordprocessingShape" mc:Ignorable="w14 w15 w16se w16cid w16 w16cex w16sdtdh w16sdtfl w16du wp14">
   <w:p>
     <w:pPr>
       <w:spacing w:after="0" w:line="259" w:lineRule="auto"/>
@@ -4629,7 +4158,7 @@
 </file>
 
 <file path=word/header2.xml><?xml version="1.0" encoding="utf-8"?>
-<w:hdr xmlns:wpc="http://schemas.microsoft.com/office/word/2010/wordprocessingCanvas" xmlns:cx="http://schemas.microsoft.com/office/drawing/2014/chartex" xmlns:cx1="http://schemas.microsoft.com/office/drawing/2015/9/8/chartex" xmlns:cx2="http://schemas.microsoft.com/office/drawing/2015/10/21/chartex" xmlns:cx3="http://schemas.microsoft.com/office/drawing/2016/5/9/chartex" xmlns:cx4="http://schemas.microsoft.com/office/drawing/2016/5/10/chartex" xmlns:cx5="http://schemas.microsoft.com/office/drawing/2016/5/11/chartex" xmlns:cx6="http://schemas.microsoft.com/office/drawing/2016/5/12/chartex" xmlns:cx7="http://schemas.microsoft.com/office/drawing/2016/5/13/chartex" xmlns:cx8="http://schemas.microsoft.com/office/drawing/2016/5/14/chartex" xmlns:mc="http://schemas.openxmlformats.org/markup-compatibility/2006" xmlns:aink="http://schemas.microsoft.com/office/drawing/2016/ink" xmlns:am3d="http://schemas.microsoft.com/office/drawing/2017/model3d" xmlns:o="urn:schemas-microsoft-com:office:office" xmlns:oel="http://schemas.microsoft.com/office/2019/extlst" xmlns:r="http://schemas.openxmlformats.org/officeDocument/2006/relationships" xmlns:m="http://schemas.openxmlformats.org/officeDocument/2006/math" xmlns:v="urn:schemas-microsoft-com:vml" xmlns:wp14="http://schemas.microsoft.com/office/word/2010/wordprocessingDrawing" xmlns:wp="http://schemas.openxmlformats.org/drawingml/2006/wordprocessingDrawing" xmlns:w10="urn:schemas-microsoft-com:office:word" xmlns:w="http://schemas.openxmlformats.org/wordprocessingml/2006/main" xmlns:w14="http://schemas.microsoft.com/office/word/2010/wordml" xmlns:w15="http://schemas.microsoft.com/office/word/2012/wordml" xmlns:w16cex="http://schemas.microsoft.com/office/word/2018/wordml/cex" xmlns:w16cid="http://schemas.microsoft.com/office/word/2016/wordml/cid" xmlns:w16="http://schemas.microsoft.com/office/word/2018/wordml" xmlns:w16du="http://schemas.microsoft.com/office/word/2023/wordml/word16du" xmlns:w16sdtdh="http://schemas.microsoft.com/office/word/2020/wordml/sdtdatahash" xmlns:w16sdtfl="http://schemas.microsoft.com/office/word/2024/wordml/sdtformatlock" xmlns:w16se="http://schemas.microsoft.com/office/word/2015/wordml/symex" xmlns:wpg="http://schemas.microsoft.com/office/word/2010/wordprocessingGroup" xmlns:wpi="http://schemas.microsoft.com/office/word/2010/wordprocessingInk" xmlns:wne="http://schemas.microsoft.com/office/word/2006/wordml" xmlns:wps="http://schemas.microsoft.com/office/word/2010/wordprocessingShape" mc:Ignorable="w14 w15 w16se w16cid w16 w16cex w16sdtdh w16sdtfl w16du wp14">
+<w:hdr xmlns:wpc="http://schemas.microsoft.com/office/word/2010/wordprocessingCanvas" xmlns:cx="http://schemas.microsoft.com/office/drawing/2014/chartex" xmlns:cx1="http://schemas.microsoft.com/office/drawing/2015/9/8/chartex" xmlns:cx2="http://schemas.microsoft.com/office/drawing/2015/10/21/chartex" xmlns:cx3="http://schemas.microsoft.com/office/drawing/2016/5/9/chartex" xmlns:cx4="http://schemas.microsoft.com/office/drawing/2016/5/10/chartex" xmlns:cx5="http://schemas.microsoft.com/office/drawing/2016/5/11/chartex" xmlns:cx6="http://schemas.microsoft.com/office/drawing/2016/5/12/chartex" xmlns:cx7="http://schemas.microsoft.com/office/drawing/2016/5/13/chartex" xmlns:cx8="http://schemas.microsoft.com/office/drawing/2016/5/14/chartex" xmlns:mc="http://schemas.openxmlformats.org/markup-compatibility/2006" xmlns:aink="http://schemas.microsoft.com/office/drawing/2016/ink" xmlns:am3d="http://schemas.microsoft.com/office/drawing/2017/model3d" xmlns:o="urn:schemas-microsoft-com:office:office" xmlns:oel="http://schemas.microsoft.com/office/2019/extlst" xmlns:r="http://schemas.openxmlformats.org/officeDocument/2006/relationships" xmlns:m="http://schemas.openxmlformats.org/officeDocument/2006/math" xmlns:v="urn:schemas-microsoft-com:vml" xmlns:wp14="http://schemas.microsoft.com/office/word/2010/wordprocessingDrawing" xmlns:wp="http://schemas.openxmlformats.org/drawingml/2006/wordprocessingDrawing" xmlns:w10="urn:schemas-microsoft-com:office:word" xmlns:w="http://schemas.openxmlformats.org/wordprocessingml/2006/main" xmlns:w14="http://schemas.microsoft.com/office/word/2010/wordml" xmlns:w15="http://schemas.microsoft.com/office/word/2012/wordml" xmlns:w16cei="http://schemas.microsoft.com/office/word/2026/wordml/cei" xmlns:w16cex="http://schemas.microsoft.com/office/word/2018/wordml/cex" xmlns:w16cid="http://schemas.microsoft.com/office/word/2016/wordml/cid" xmlns:w16="http://schemas.microsoft.com/office/word/2018/wordml" xmlns:w16du="http://schemas.microsoft.com/office/word/2023/wordml/word16du" xmlns:w16sdtdh="http://schemas.microsoft.com/office/word/2020/wordml/sdtdatahash" xmlns:w16sdtfl="http://schemas.microsoft.com/office/word/2024/wordml/sdtformatlock" xmlns:w16se="http://schemas.microsoft.com/office/word/2015/wordml/symex" xmlns:wpg="http://schemas.microsoft.com/office/word/2010/wordprocessingGroup" xmlns:wpi="http://schemas.microsoft.com/office/word/2010/wordprocessingInk" xmlns:wne="http://schemas.microsoft.com/office/word/2006/wordml" xmlns:wps="http://schemas.microsoft.com/office/word/2010/wordprocessingShape" mc:Ignorable="w14 w15 w16se w16cid w16 w16cex w16sdtdh w16sdtfl w16du wp14">
   <w:p>
     <w:pPr>
       <w:spacing w:after="0" w:line="259" w:lineRule="auto"/>
@@ -4740,7 +4269,7 @@
 </file>
 
 <file path=word/header3.xml><?xml version="1.0" encoding="utf-8"?>
-<w:hdr xmlns:wpc="http://schemas.microsoft.com/office/word/2010/wordprocessingCanvas" xmlns:cx="http://schemas.microsoft.com/office/drawing/2014/chartex" xmlns:cx1="http://schemas.microsoft.com/office/drawing/2015/9/8/chartex" xmlns:cx2="http://schemas.microsoft.com/office/drawing/2015/10/21/chartex" xmlns:cx3="http://schemas.microsoft.com/office/drawing/2016/5/9/chartex" xmlns:cx4="http://schemas.microsoft.com/office/drawing/2016/5/10/chartex" xmlns:cx5="http://schemas.microsoft.com/office/drawing/2016/5/11/chartex" xmlns:cx6="http://schemas.microsoft.com/office/drawing/2016/5/12/chartex" xmlns:cx7="http://schemas.microsoft.com/office/drawing/2016/5/13/chartex" xmlns:cx8="http://schemas.microsoft.com/office/drawing/2016/5/14/chartex" xmlns:mc="http://schemas.openxmlformats.org/markup-compatibility/2006" xmlns:aink="http://schemas.microsoft.com/office/drawing/2016/ink" xmlns:am3d="http://schemas.microsoft.com/office/drawing/2017/model3d" xmlns:o="urn:schemas-microsoft-com:office:office" xmlns:oel="http://schemas.microsoft.com/office/2019/extlst" xmlns:r="http://schemas.openxmlformats.org/officeDocument/2006/relationships" xmlns:m="http://schemas.openxmlformats.org/officeDocument/2006/math" xmlns:v="urn:schemas-microsoft-com:vml" xmlns:wp14="http://schemas.microsoft.com/office/word/2010/wordprocessingDrawing" xmlns:wp="http://schemas.openxmlformats.org/drawingml/2006/wordprocessingDrawing" xmlns:w10="urn:schemas-microsoft-com:office:word" xmlns:w="http://schemas.openxmlformats.org/wordprocessingml/2006/main" xmlns:w14="http://schemas.microsoft.com/office/word/2010/wordml" xmlns:w15="http://schemas.microsoft.com/office/word/2012/wordml" xmlns:w16cex="http://schemas.microsoft.com/office/word/2018/wordml/cex" xmlns:w16cid="http://schemas.microsoft.com/office/word/2016/wordml/cid" xmlns:w16="http://schemas.microsoft.com/office/word/2018/wordml" xmlns:w16du="http://schemas.microsoft.com/office/word/2023/wordml/word16du" xmlns:w16sdtdh="http://schemas.microsoft.com/office/word/2020/wordml/sdtdatahash" xmlns:w16sdtfl="http://schemas.microsoft.com/office/word/2024/wordml/sdtformatlock" xmlns:w16se="http://schemas.microsoft.com/office/word/2015/wordml/symex" xmlns:wpg="http://schemas.microsoft.com/office/word/2010/wordprocessingGroup" xmlns:wpi="http://schemas.microsoft.com/office/word/2010/wordprocessingInk" xmlns:wne="http://schemas.microsoft.com/office/word/2006/wordml" xmlns:wps="http://schemas.microsoft.com/office/word/2010/wordprocessingShape" mc:Ignorable="w14 w15 w16se w16cid w16 w16cex w16sdtdh w16sdtfl w16du wp14">
+<w:hdr xmlns:wpc="http://schemas.microsoft.com/office/word/2010/wordprocessingCanvas" xmlns:cx="http://schemas.microsoft.com/office/drawing/2014/chartex" xmlns:cx1="http://schemas.microsoft.com/office/drawing/2015/9/8/chartex" xmlns:cx2="http://schemas.microsoft.com/office/drawing/2015/10/21/chartex" xmlns:cx3="http://schemas.microsoft.com/office/drawing/2016/5/9/chartex" xmlns:cx4="http://schemas.microsoft.com/office/drawing/2016/5/10/chartex" xmlns:cx5="http://schemas.microsoft.com/office/drawing/2016/5/11/chartex" xmlns:cx6="http://schemas.microsoft.com/office/drawing/2016/5/12/chartex" xmlns:cx7="http://schemas.microsoft.com/office/drawing/2016/5/13/chartex" xmlns:cx8="http://schemas.microsoft.com/office/drawing/2016/5/14/chartex" xmlns:mc="http://schemas.openxmlformats.org/markup-compatibility/2006" xmlns:aink="http://schemas.microsoft.com/office/drawing/2016/ink" xmlns:am3d="http://schemas.microsoft.com/office/drawing/2017/model3d" xmlns:o="urn:schemas-microsoft-com:office:office" xmlns:oel="http://schemas.microsoft.com/office/2019/extlst" xmlns:r="http://schemas.openxmlformats.org/officeDocument/2006/relationships" xmlns:m="http://schemas.openxmlformats.org/officeDocument/2006/math" xmlns:v="urn:schemas-microsoft-com:vml" xmlns:wp14="http://schemas.microsoft.com/office/word/2010/wordprocessingDrawing" xmlns:wp="http://schemas.openxmlformats.org/drawingml/2006/wordprocessingDrawing" xmlns:w10="urn:schemas-microsoft-com:office:word" xmlns:w="http://schemas.openxmlformats.org/wordprocessingml/2006/main" xmlns:w14="http://schemas.microsoft.com/office/word/2010/wordml" xmlns:w15="http://schemas.microsoft.com/office/word/2012/wordml" xmlns:w16cei="http://schemas.microsoft.com/office/word/2026/wordml/cei" xmlns:w16cex="http://schemas.microsoft.com/office/word/2018/wordml/cex" xmlns:w16cid="http://schemas.microsoft.com/office/word/2016/wordml/cid" xmlns:w16="http://schemas.microsoft.com/office/word/2018/wordml" xmlns:w16du="http://schemas.microsoft.com/office/word/2023/wordml/word16du" xmlns:w16sdtdh="http://schemas.microsoft.com/office/word/2020/wordml/sdtdatahash" xmlns:w16sdtfl="http://schemas.microsoft.com/office/word/2024/wordml/sdtformatlock" xmlns:w16se="http://schemas.microsoft.com/office/word/2015/wordml/symex" xmlns:wpg="http://schemas.microsoft.com/office/word/2010/wordprocessingGroup" xmlns:wpi="http://schemas.microsoft.com/office/word/2010/wordprocessingInk" xmlns:wne="http://schemas.microsoft.com/office/word/2006/wordml" xmlns:wps="http://schemas.microsoft.com/office/word/2010/wordprocessingShape" mc:Ignorable="w14 w15 w16se w16cid w16 w16cex w16sdtdh w16sdtfl w16du wp14">
   <w:p>
     <w:pPr>
       <w:spacing w:after="0" w:line="259" w:lineRule="auto"/>
@@ -4851,7 +4380,7 @@
 </file>
 
 <file path=word/header4.xml><?xml version="1.0" encoding="utf-8"?>
-<w:hdr xmlns:wpc="http://schemas.microsoft.com/office/word/2010/wordprocessingCanvas" xmlns:cx="http://schemas.microsoft.com/office/drawing/2014/chartex" xmlns:cx1="http://schemas.microsoft.com/office/drawing/2015/9/8/chartex" xmlns:cx2="http://schemas.microsoft.com/office/drawing/2015/10/21/chartex" xmlns:cx3="http://schemas.microsoft.com/office/drawing/2016/5/9/chartex" xmlns:cx4="http://schemas.microsoft.com/office/drawing/2016/5/10/chartex" xmlns:cx5="http://schemas.microsoft.com/office/drawing/2016/5/11/chartex" xmlns:cx6="http://schemas.microsoft.com/office/drawing/2016/5/12/chartex" xmlns:cx7="http://schemas.microsoft.com/office/drawing/2016/5/13/chartex" xmlns:cx8="http://schemas.microsoft.com/office/drawing/2016/5/14/chartex" xmlns:mc="http://schemas.openxmlformats.org/markup-compatibility/2006" xmlns:aink="http://schemas.microsoft.com/office/drawing/2016/ink" xmlns:am3d="http://schemas.microsoft.com/office/drawing/2017/model3d" xmlns:o="urn:schemas-microsoft-com:office:office" xmlns:oel="http://schemas.microsoft.com/office/2019/extlst" xmlns:r="http://schemas.openxmlformats.org/officeDocument/2006/relationships" xmlns:m="http://schemas.openxmlformats.org/officeDocument/2006/math" xmlns:v="urn:schemas-microsoft-com:vml" xmlns:wp14="http://schemas.microsoft.com/office/word/2010/wordprocessingDrawing" xmlns:wp="http://schemas.openxmlformats.org/drawingml/2006/wordprocessingDrawing" xmlns:w10="urn:schemas-microsoft-com:office:word" xmlns:w="http://schemas.openxmlformats.org/wordprocessingml/2006/main" xmlns:w14="http://schemas.microsoft.com/office/word/2010/wordml" xmlns:w15="http://schemas.microsoft.com/office/word/2012/wordml" xmlns:w16cex="http://schemas.microsoft.com/office/word/2018/wordml/cex" xmlns:w16cid="http://schemas.microsoft.com/office/word/2016/wordml/cid" xmlns:w16="http://schemas.microsoft.com/office/word/2018/wordml" xmlns:w16du="http://schemas.microsoft.com/office/word/2023/wordml/word16du" xmlns:w16sdtdh="http://schemas.microsoft.com/office/word/2020/wordml/sdtdatahash" xmlns:w16sdtfl="http://schemas.microsoft.com/office/word/2024/wordml/sdtformatlock" xmlns:w16se="http://schemas.microsoft.com/office/word/2015/wordml/symex" xmlns:wpg="http://schemas.microsoft.com/office/word/2010/wordprocessingGroup" xmlns:wpi="http://schemas.microsoft.com/office/word/2010/wordprocessingInk" xmlns:wne="http://schemas.microsoft.com/office/word/2006/wordml" xmlns:wps="http://schemas.microsoft.com/office/word/2010/wordprocessingShape" mc:Ignorable="w14 w15 w16se w16cid w16 w16cex w16sdtdh w16sdtfl w16du wp14">
+<w:hdr xmlns:wpc="http://schemas.microsoft.com/office/word/2010/wordprocessingCanvas" xmlns:cx="http://schemas.microsoft.com/office/drawing/2014/chartex" xmlns:cx1="http://schemas.microsoft.com/office/drawing/2015/9/8/chartex" xmlns:cx2="http://schemas.microsoft.com/office/drawing/2015/10/21/chartex" xmlns:cx3="http://schemas.microsoft.com/office/drawing/2016/5/9/chartex" xmlns:cx4="http://schemas.microsoft.com/office/drawing/2016/5/10/chartex" xmlns:cx5="http://schemas.microsoft.com/office/drawing/2016/5/11/chartex" xmlns:cx6="http://schemas.microsoft.com/office/drawing/2016/5/12/chartex" xmlns:cx7="http://schemas.microsoft.com/office/drawing/2016/5/13/chartex" xmlns:cx8="http://schemas.microsoft.com/office/drawing/2016/5/14/chartex" xmlns:mc="http://schemas.openxmlformats.org/markup-compatibility/2006" xmlns:aink="http://schemas.microsoft.com/office/drawing/2016/ink" xmlns:am3d="http://schemas.microsoft.com/office/drawing/2017/model3d" xmlns:o="urn:schemas-microsoft-com:office:office" xmlns:oel="http://schemas.microsoft.com/office/2019/extlst" xmlns:r="http://schemas.openxmlformats.org/officeDocument/2006/relationships" xmlns:m="http://schemas.openxmlformats.org/officeDocument/2006/math" xmlns:v="urn:schemas-microsoft-com:vml" xmlns:wp14="http://schemas.microsoft.com/office/word/2010/wordprocessingDrawing" xmlns:wp="http://schemas.openxmlformats.org/drawingml/2006/wordprocessingDrawing" xmlns:w10="urn:schemas-microsoft-com:office:word" xmlns:w="http://schemas.openxmlformats.org/wordprocessingml/2006/main" xmlns:w14="http://schemas.microsoft.com/office/word/2010/wordml" xmlns:w15="http://schemas.microsoft.com/office/word/2012/wordml" xmlns:w16cei="http://schemas.microsoft.com/office/word/2026/wordml/cei" xmlns:w16cex="http://schemas.microsoft.com/office/word/2018/wordml/cex" xmlns:w16cid="http://schemas.microsoft.com/office/word/2016/wordml/cid" xmlns:w16="http://schemas.microsoft.com/office/word/2018/wordml" xmlns:w16du="http://schemas.microsoft.com/office/word/2023/wordml/word16du" xmlns:w16sdtdh="http://schemas.microsoft.com/office/word/2020/wordml/sdtdatahash" xmlns:w16sdtfl="http://schemas.microsoft.com/office/word/2024/wordml/sdtformatlock" xmlns:w16se="http://schemas.microsoft.com/office/word/2015/wordml/symex" xmlns:wpg="http://schemas.microsoft.com/office/word/2010/wordprocessingGroup" xmlns:wpi="http://schemas.microsoft.com/office/word/2010/wordprocessingInk" xmlns:wne="http://schemas.microsoft.com/office/word/2006/wordml" xmlns:wps="http://schemas.microsoft.com/office/word/2010/wordprocessingShape" mc:Ignorable="w14 w15 w16se w16cid w16 w16cex w16sdtdh w16sdtfl w16du wp14">
   <w:p>
     <w:pPr>
       <w:spacing w:after="160" w:line="259" w:lineRule="auto"/>
@@ -4863,7 +4392,7 @@
 </file>
 
 <file path=word/header5.xml><?xml version="1.0" encoding="utf-8"?>
-<w:hdr xmlns:wpc="http://schemas.microsoft.com/office/word/2010/wordprocessingCanvas" xmlns:cx="http://schemas.microsoft.com/office/drawing/2014/chartex" xmlns:cx1="http://schemas.microsoft.com/office/drawing/2015/9/8/chartex" xmlns:cx2="http://schemas.microsoft.com/office/drawing/2015/10/21/chartex" xmlns:cx3="http://schemas.microsoft.com/office/drawing/2016/5/9/chartex" xmlns:cx4="http://schemas.microsoft.com/office/drawing/2016/5/10/chartex" xmlns:cx5="http://schemas.microsoft.com/office/drawing/2016/5/11/chartex" xmlns:cx6="http://schemas.microsoft.com/office/drawing/2016/5/12/chartex" xmlns:cx7="http://schemas.microsoft.com/office/drawing/2016/5/13/chartex" xmlns:cx8="http://schemas.microsoft.com/office/drawing/2016/5/14/chartex" xmlns:mc="http://schemas.openxmlformats.org/markup-compatibility/2006" xmlns:aink="http://schemas.microsoft.com/office/drawing/2016/ink" xmlns:am3d="http://schemas.microsoft.com/office/drawing/2017/model3d" xmlns:o="urn:schemas-microsoft-com:office:office" xmlns:oel="http://schemas.microsoft.com/office/2019/extlst" xmlns:r="http://schemas.openxmlformats.org/officeDocument/2006/relationships" xmlns:m="http://schemas.openxmlformats.org/officeDocument/2006/math" xmlns:v="urn:schemas-microsoft-com:vml" xmlns:wp14="http://schemas.microsoft.com/office/word/2010/wordprocessingDrawing" xmlns:wp="http://schemas.openxmlformats.org/drawingml/2006/wordprocessingDrawing" xmlns:w10="urn:schemas-microsoft-com:office:word" xmlns:w="http://schemas.openxmlformats.org/wordprocessingml/2006/main" xmlns:w14="http://schemas.microsoft.com/office/word/2010/wordml" xmlns:w15="http://schemas.microsoft.com/office/word/2012/wordml" xmlns:w16cex="http://schemas.microsoft.com/office/word/2018/wordml/cex" xmlns:w16cid="http://schemas.microsoft.com/office/word/2016/wordml/cid" xmlns:w16="http://schemas.microsoft.com/office/word/2018/wordml" xmlns:w16du="http://schemas.microsoft.com/office/word/2023/wordml/word16du" xmlns:w16sdtdh="http://schemas.microsoft.com/office/word/2020/wordml/sdtdatahash" xmlns:w16sdtfl="http://schemas.microsoft.com/office/word/2024/wordml/sdtformatlock" xmlns:w16se="http://schemas.microsoft.com/office/word/2015/wordml/symex" xmlns:wpg="http://schemas.microsoft.com/office/word/2010/wordprocessingGroup" xmlns:wpi="http://schemas.microsoft.com/office/word/2010/wordprocessingInk" xmlns:wne="http://schemas.microsoft.com/office/word/2006/wordml" xmlns:wps="http://schemas.microsoft.com/office/word/2010/wordprocessingShape" mc:Ignorable="w14 w15 w16se w16cid w16 w16cex w16sdtdh w16sdtfl w16du wp14">
+<w:hdr xmlns:wpc="http://schemas.microsoft.com/office/word/2010/wordprocessingCanvas" xmlns:cx="http://schemas.microsoft.com/office/drawing/2014/chartex" xmlns:cx1="http://schemas.microsoft.com/office/drawing/2015/9/8/chartex" xmlns:cx2="http://schemas.microsoft.com/office/drawing/2015/10/21/chartex" xmlns:cx3="http://schemas.microsoft.com/office/drawing/2016/5/9/chartex" xmlns:cx4="http://schemas.microsoft.com/office/drawing/2016/5/10/chartex" xmlns:cx5="http://schemas.microsoft.com/office/drawing/2016/5/11/chartex" xmlns:cx6="http://schemas.microsoft.com/office/drawing/2016/5/12/chartex" xmlns:cx7="http://schemas.microsoft.com/office/drawing/2016/5/13/chartex" xmlns:cx8="http://schemas.microsoft.com/office/drawing/2016/5/14/chartex" xmlns:mc="http://schemas.openxmlformats.org/markup-compatibility/2006" xmlns:aink="http://schemas.microsoft.com/office/drawing/2016/ink" xmlns:am3d="http://schemas.microsoft.com/office/drawing/2017/model3d" xmlns:o="urn:schemas-microsoft-com:office:office" xmlns:oel="http://schemas.microsoft.com/office/2019/extlst" xmlns:r="http://schemas.openxmlformats.org/officeDocument/2006/relationships" xmlns:m="http://schemas.openxmlformats.org/officeDocument/2006/math" xmlns:v="urn:schemas-microsoft-com:vml" xmlns:wp14="http://schemas.microsoft.com/office/word/2010/wordprocessingDrawing" xmlns:wp="http://schemas.openxmlformats.org/drawingml/2006/wordprocessingDrawing" xmlns:w10="urn:schemas-microsoft-com:office:word" xmlns:w="http://schemas.openxmlformats.org/wordprocessingml/2006/main" xmlns:w14="http://schemas.microsoft.com/office/word/2010/wordml" xmlns:w15="http://schemas.microsoft.com/office/word/2012/wordml" xmlns:w16cei="http://schemas.microsoft.com/office/word/2026/wordml/cei" xmlns:w16cex="http://schemas.microsoft.com/office/word/2018/wordml/cex" xmlns:w16cid="http://schemas.microsoft.com/office/word/2016/wordml/cid" xmlns:w16="http://schemas.microsoft.com/office/word/2018/wordml" xmlns:w16du="http://schemas.microsoft.com/office/word/2023/wordml/word16du" xmlns:w16sdtdh="http://schemas.microsoft.com/office/word/2020/wordml/sdtdatahash" xmlns:w16sdtfl="http://schemas.microsoft.com/office/word/2024/wordml/sdtformatlock" xmlns:w16se="http://schemas.microsoft.com/office/word/2015/wordml/symex" xmlns:wpg="http://schemas.microsoft.com/office/word/2010/wordprocessingGroup" xmlns:wpi="http://schemas.microsoft.com/office/word/2010/wordprocessingInk" xmlns:wne="http://schemas.microsoft.com/office/word/2006/wordml" xmlns:wps="http://schemas.microsoft.com/office/word/2010/wordprocessingShape" mc:Ignorable="w14 w15 w16se w16cid w16 w16cex w16sdtdh w16sdtfl w16du wp14">
   <w:p>
     <w:pPr>
       <w:spacing w:after="160" w:line="259" w:lineRule="auto"/>
@@ -4875,7 +4404,7 @@
 </file>
 
 <file path=word/header6.xml><?xml version="1.0" encoding="utf-8"?>
-<w:hdr xmlns:wpc="http://schemas.microsoft.com/office/word/2010/wordprocessingCanvas" xmlns:cx="http://schemas.microsoft.com/office/drawing/2014/chartex" xmlns:cx1="http://schemas.microsoft.com/office/drawing/2015/9/8/chartex" xmlns:cx2="http://schemas.microsoft.com/office/drawing/2015/10/21/chartex" xmlns:cx3="http://schemas.microsoft.com/office/drawing/2016/5/9/chartex" xmlns:cx4="http://schemas.microsoft.com/office/drawing/2016/5/10/chartex" xmlns:cx5="http://schemas.microsoft.com/office/drawing/2016/5/11/chartex" xmlns:cx6="http://schemas.microsoft.com/office/drawing/2016/5/12/chartex" xmlns:cx7="http://schemas.microsoft.com/office/drawing/2016/5/13/chartex" xmlns:cx8="http://schemas.microsoft.com/office/drawing/2016/5/14/chartex" xmlns:mc="http://schemas.openxmlformats.org/markup-compatibility/2006" xmlns:aink="http://schemas.microsoft.com/office/drawing/2016/ink" xmlns:am3d="http://schemas.microsoft.com/office/drawing/2017/model3d" xmlns:o="urn:schemas-microsoft-com:office:office" xmlns:oel="http://schemas.microsoft.com/office/2019/extlst" xmlns:r="http://schemas.openxmlformats.org/officeDocument/2006/relationships" xmlns:m="http://schemas.openxmlformats.org/officeDocument/2006/math" xmlns:v="urn:schemas-microsoft-com:vml" xmlns:wp14="http://schemas.microsoft.com/office/word/2010/wordprocessingDrawing" xmlns:wp="http://schemas.openxmlformats.org/drawingml/2006/wordprocessingDrawing" xmlns:w10="urn:schemas-microsoft-com:office:word" xmlns:w="http://schemas.openxmlformats.org/wordprocessingml/2006/main" xmlns:w14="http://schemas.microsoft.com/office/word/2010/wordml" xmlns:w15="http://schemas.microsoft.com/office/word/2012/wordml" xmlns:w16cex="http://schemas.microsoft.com/office/word/2018/wordml/cex" xmlns:w16cid="http://schemas.microsoft.com/office/word/2016/wordml/cid" xmlns:w16="http://schemas.microsoft.com/office/word/2018/wordml" xmlns:w16du="http://schemas.microsoft.com/office/word/2023/wordml/word16du" xmlns:w16sdtdh="http://schemas.microsoft.com/office/word/2020/wordml/sdtdatahash" xmlns:w16sdtfl="http://schemas.microsoft.com/office/word/2024/wordml/sdtformatlock" xmlns:w16se="http://schemas.microsoft.com/office/word/2015/wordml/symex" xmlns:wpg="http://schemas.microsoft.com/office/word/2010/wordprocessingGroup" xmlns:wpi="http://schemas.microsoft.com/office/word/2010/wordprocessingInk" xmlns:wne="http://schemas.microsoft.com/office/word/2006/wordml" xmlns:wps="http://schemas.microsoft.com/office/word/2010/wordprocessingShape" mc:Ignorable="w14 w15 w16se w16cid w16 w16cex w16sdtdh w16sdtfl w16du wp14">
+<w:hdr xmlns:wpc="http://schemas.microsoft.com/office/word/2010/wordprocessingCanvas" xmlns:cx="http://schemas.microsoft.com/office/drawing/2014/chartex" xmlns:cx1="http://schemas.microsoft.com/office/drawing/2015/9/8/chartex" xmlns:cx2="http://schemas.microsoft.com/office/drawing/2015/10/21/chartex" xmlns:cx3="http://schemas.microsoft.com/office/drawing/2016/5/9/chartex" xmlns:cx4="http://schemas.microsoft.com/office/drawing/2016/5/10/chartex" xmlns:cx5="http://schemas.microsoft.com/office/drawing/2016/5/11/chartex" xmlns:cx6="http://schemas.microsoft.com/office/drawing/2016/5/12/chartex" xmlns:cx7="http://schemas.microsoft.com/office/drawing/2016/5/13/chartex" xmlns:cx8="http://schemas.microsoft.com/office/drawing/2016/5/14/chartex" xmlns:mc="http://schemas.openxmlformats.org/markup-compatibility/2006" xmlns:aink="http://schemas.microsoft.com/office/drawing/2016/ink" xmlns:am3d="http://schemas.microsoft.com/office/drawing/2017/model3d" xmlns:o="urn:schemas-microsoft-com:office:office" xmlns:oel="http://schemas.microsoft.com/office/2019/extlst" xmlns:r="http://schemas.openxmlformats.org/officeDocument/2006/relationships" xmlns:m="http://schemas.openxmlformats.org/officeDocument/2006/math" xmlns:v="urn:schemas-microsoft-com:vml" xmlns:wp14="http://schemas.microsoft.com/office/word/2010/wordprocessingDrawing" xmlns:wp="http://schemas.openxmlformats.org/drawingml/2006/wordprocessingDrawing" xmlns:w10="urn:schemas-microsoft-com:office:word" xmlns:w="http://schemas.openxmlformats.org/wordprocessingml/2006/main" xmlns:w14="http://schemas.microsoft.com/office/word/2010/wordml" xmlns:w15="http://schemas.microsoft.com/office/word/2012/wordml" xmlns:w16cei="http://schemas.microsoft.com/office/word/2026/wordml/cei" xmlns:w16cex="http://schemas.microsoft.com/office/word/2018/wordml/cex" xmlns:w16cid="http://schemas.microsoft.com/office/word/2016/wordml/cid" xmlns:w16="http://schemas.microsoft.com/office/word/2018/wordml" xmlns:w16du="http://schemas.microsoft.com/office/word/2023/wordml/word16du" xmlns:w16sdtdh="http://schemas.microsoft.com/office/word/2020/wordml/sdtdatahash" xmlns:w16sdtfl="http://schemas.microsoft.com/office/word/2024/wordml/sdtformatlock" xmlns:w16se="http://schemas.microsoft.com/office/word/2015/wordml/symex" xmlns:wpg="http://schemas.microsoft.com/office/word/2010/wordprocessingGroup" xmlns:wpi="http://schemas.microsoft.com/office/word/2010/wordprocessingInk" xmlns:wne="http://schemas.microsoft.com/office/word/2006/wordml" xmlns:wps="http://schemas.microsoft.com/office/word/2010/wordprocessingShape" mc:Ignorable="w14 w15 w16se w16cid w16 w16cex w16sdtdh w16sdtfl w16du wp14">
   <w:p>
     <w:pPr>
       <w:spacing w:after="160" w:line="259" w:lineRule="auto"/>
@@ -4887,7 +4416,7 @@
 </file>
 
 <file path=word/numbering.xml><?xml version="1.0" encoding="utf-8"?>
-<w:numbering xmlns:wpc="http://schemas.microsoft.com/office/word/2010/wordprocessingCanvas" xmlns:cx="http://schemas.microsoft.com/office/drawing/2014/chartex" xmlns:cx1="http://schemas.microsoft.com/office/drawing/2015/9/8/chartex" xmlns:cx2="http://schemas.microsoft.com/office/drawing/2015/10/21/chartex" xmlns:cx3="http://schemas.microsoft.com/office/drawing/2016/5/9/chartex" xmlns:cx4="http://schemas.microsoft.com/office/drawing/2016/5/10/chartex" xmlns:cx5="http://schemas.microsoft.com/office/drawing/2016/5/11/chartex" xmlns:cx6="http://schemas.microsoft.com/office/drawing/2016/5/12/chartex" xmlns:cx7="http://schemas.microsoft.com/office/drawing/2016/5/13/chartex" xmlns:cx8="http://schemas.microsoft.com/office/drawing/2016/5/14/chartex" xmlns:mc="http://schemas.openxmlformats.org/markup-compatibility/2006" xmlns:aink="http://schemas.microsoft.com/office/drawing/2016/ink" xmlns:am3d="http://schemas.microsoft.com/office/drawing/2017/model3d" xmlns:o="urn:schemas-microsoft-com:office:office" xmlns:oel="http://schemas.microsoft.com/office/2019/extlst" xmlns:r="http://schemas.openxmlformats.org/officeDocument/2006/relationships" xmlns:m="http://schemas.openxmlformats.org/officeDocument/2006/math" xmlns:v="urn:schemas-microsoft-com:vml" xmlns:wp14="http://schemas.microsoft.com/office/word/2010/wordprocessingDrawing" xmlns:wp="http://schemas.openxmlformats.org/drawingml/2006/wordprocessingDrawing" xmlns:w10="urn:schemas-microsoft-com:office:word" xmlns:w="http://schemas.openxmlformats.org/wordprocessingml/2006/main" xmlns:w14="http://schemas.microsoft.com/office/word/2010/wordml" xmlns:w15="http://schemas.microsoft.com/office/word/2012/wordml" xmlns:w16cex="http://schemas.microsoft.com/office/word/2018/wordml/cex" xmlns:w16cid="http://schemas.microsoft.com/office/word/2016/wordml/cid" xmlns:w16="http://schemas.microsoft.com/office/word/2018/wordml" xmlns:w16du="http://schemas.microsoft.com/office/word/2023/wordml/word16du" xmlns:w16sdtdh="http://schemas.microsoft.com/office/word/2020/wordml/sdtdatahash" xmlns:w16sdtfl="http://schemas.microsoft.com/office/word/2024/wordml/sdtformatlock" xmlns:w16se="http://schemas.microsoft.com/office/word/2015/wordml/symex" xmlns:wpg="http://schemas.microsoft.com/office/word/2010/wordprocessingGroup" xmlns:wpi="http://schemas.microsoft.com/office/word/2010/wordprocessingInk" xmlns:wne="http://schemas.microsoft.com/office/word/2006/wordml" xmlns:wps="http://schemas.microsoft.com/office/word/2010/wordprocessingShape" mc:Ignorable="w14 w15 w16se w16cid w16 w16cex w16sdtdh w16sdtfl w16du wp14">
+<w:numbering xmlns:wpc="http://schemas.microsoft.com/office/word/2010/wordprocessingCanvas" xmlns:cx="http://schemas.microsoft.com/office/drawing/2014/chartex" xmlns:cx1="http://schemas.microsoft.com/office/drawing/2015/9/8/chartex" xmlns:cx2="http://schemas.microsoft.com/office/drawing/2015/10/21/chartex" xmlns:cx3="http://schemas.microsoft.com/office/drawing/2016/5/9/chartex" xmlns:cx4="http://schemas.microsoft.com/office/drawing/2016/5/10/chartex" xmlns:cx5="http://schemas.microsoft.com/office/drawing/2016/5/11/chartex" xmlns:cx6="http://schemas.microsoft.com/office/drawing/2016/5/12/chartex" xmlns:cx7="http://schemas.microsoft.com/office/drawing/2016/5/13/chartex" xmlns:cx8="http://schemas.microsoft.com/office/drawing/2016/5/14/chartex" xmlns:mc="http://schemas.openxmlformats.org/markup-compatibility/2006" xmlns:aink="http://schemas.microsoft.com/office/drawing/2016/ink" xmlns:am3d="http://schemas.microsoft.com/office/drawing/2017/model3d" xmlns:o="urn:schemas-microsoft-com:office:office" xmlns:oel="http://schemas.microsoft.com/office/2019/extlst" xmlns:r="http://schemas.openxmlformats.org/officeDocument/2006/relationships" xmlns:m="http://schemas.openxmlformats.org/officeDocument/2006/math" xmlns:v="urn:schemas-microsoft-com:vml" xmlns:wp14="http://schemas.microsoft.com/office/word/2010/wordprocessingDrawing" xmlns:wp="http://schemas.openxmlformats.org/drawingml/2006/wordprocessingDrawing" xmlns:w10="urn:schemas-microsoft-com:office:word" xmlns:w="http://schemas.openxmlformats.org/wordprocessingml/2006/main" xmlns:w14="http://schemas.microsoft.com/office/word/2010/wordml" xmlns:w15="http://schemas.microsoft.com/office/word/2012/wordml" xmlns:w16cei="http://schemas.microsoft.com/office/word/2026/wordml/cei" xmlns:w16cex="http://schemas.microsoft.com/office/word/2018/wordml/cex" xmlns:w16cid="http://schemas.microsoft.com/office/word/2016/wordml/cid" xmlns:w16="http://schemas.microsoft.com/office/word/2018/wordml" xmlns:w16du="http://schemas.microsoft.com/office/word/2023/wordml/word16du" xmlns:w16sdtdh="http://schemas.microsoft.com/office/word/2020/wordml/sdtdatahash" xmlns:w16sdtfl="http://schemas.microsoft.com/office/word/2024/wordml/sdtformatlock" xmlns:w16se="http://schemas.microsoft.com/office/word/2015/wordml/symex" xmlns:wpg="http://schemas.microsoft.com/office/word/2010/wordprocessingGroup" xmlns:wpi="http://schemas.microsoft.com/office/word/2010/wordprocessingInk" xmlns:wne="http://schemas.microsoft.com/office/word/2006/wordml" xmlns:wps="http://schemas.microsoft.com/office/word/2010/wordprocessingShape" mc:Ignorable="w14 w15 w16se w16cid w16 w16cex w16sdtdh w16sdtfl w16du wp14">
   <w:abstractNum w:abstractNumId="0" w15:restartNumberingAfterBreak="0">
     <w:nsid w:val="0B671B08"/>
     <w:multiLevelType w:val="hybridMultilevel"/>

</xml_diff>